<commit_message>
feat: add postgres database support and implement document service and repository layers
</commit_message>
<xml_diff>
--- a/backend/generated/Approval_Note.docx
+++ b/backend/generated/Approval_Note.docx
@@ -56,7 +56,7 @@
           <w:rFonts w:ascii="Arial" w:hAnsi="Arial"/>
           <w:sz w:val="21"/>
         </w:rPr>
-        <w:t>Inspection Report Analysis and Approval Recommendation</w:t>
+        <w:t>Inspection Report Analysis and Approval Recommendation — 6de192f1-9978-47bf-90d1-863579beb839</w:t>
       </w:r>
     </w:p>
     <w:p>
@@ -83,7 +83,7 @@
           <w:rFonts w:ascii="Arial" w:hAnsi="Arial"/>
           <w:sz w:val="20"/>
         </w:rPr>
-        <w:t>An industrial inspection identified 2 finding(s) . Operational parameters were recorded during standard inspection routines and evaluated against documented standard operating procedures (SOPs) to produce this assessment.</w:t>
+        <w:t>An industrial inspection identified 0 finding(s) . Operational parameters were recorded during standard inspection routines and evaluated against documented standard operating procedures (SOPs) to produce this assessment.</w:t>
       </w:r>
     </w:p>
     <w:p>
@@ -103,691 +103,15 @@
     </w:p>
     <w:p>
       <w:pPr>
-        <w:keepNext/>
-        <w:spacing w:before="120" w:after="80"/>
+        <w:spacing w:after="160"/>
       </w:pPr>
       <w:r>
         <w:rPr>
           <w:rFonts w:ascii="Arial" w:hAnsi="Arial"/>
-          <w:b/>
-          <w:color w:val="2D3748"/>
-          <w:sz w:val="22"/>
+          <w:i/>
         </w:rPr>
-        <w:t>Finding 1</w:t>
+        <w:t>No inspection findings recorded.</w:t>
       </w:r>
-    </w:p>
-    <w:tbl>
-      <w:tblPr>
-        <w:tblW w:type="auto" w:w="0"/>
-        <w:jc w:val="center"/>
-        <w:tblLayout w:type="fixed"/>
-        <w:tblLook w:firstColumn="1" w:firstRow="1" w:lastColumn="0" w:lastRow="0" w:noHBand="0" w:noVBand="1" w:val="04A0"/>
-      </w:tblPr>
-      <w:tblGrid>
-        <w:gridCol w:w="4680"/>
-        <w:gridCol w:w="4680"/>
-      </w:tblGrid>
-      <w:tr>
-        <w:tc>
-          <w:tcPr>
-            <w:tcW w:type="dxa" w:w="2592"/>
-            <w:shd w:fill="EDF2F7"/>
-            <w:tcMar>
-              <w:top w:w="70" w:type="dxa"/>
-              <w:bottom w:w="70" w:type="dxa"/>
-              <w:left w:w="100" w:type="dxa"/>
-              <w:right w:w="100" w:type="dxa"/>
-            </w:tcMar>
-          </w:tcPr>
-          <w:p>
-            <w:pPr>
-              <w:spacing w:before="40" w:after="40"/>
-            </w:pPr>
-            <w:r>
-              <w:rPr>
-                <w:rFonts w:ascii="Arial" w:hAnsi="Arial"/>
-                <w:b/>
-                <w:color w:val="2D3748"/>
-                <w:sz w:val="19"/>
-              </w:rPr>
-              <w:t>Finding</w:t>
-            </w:r>
-          </w:p>
-        </w:tc>
-        <w:tc>
-          <w:tcPr>
-            <w:tcW w:type="dxa" w:w="6768"/>
-            <w:shd w:fill="FFFFFF"/>
-            <w:tcMar>
-              <w:top w:w="70" w:type="dxa"/>
-              <w:bottom w:w="70" w:type="dxa"/>
-              <w:left w:w="100" w:type="dxa"/>
-              <w:right w:w="100" w:type="dxa"/>
-            </w:tcMar>
-          </w:tcPr>
-          <w:p>
-            <w:pPr>
-              <w:spacing w:before="40" w:after="40"/>
-            </w:pPr>
-            <w:r>
-              <w:rPr>
-                <w:rFonts w:ascii="Arial" w:hAnsi="Arial"/>
-                <w:sz w:val="19"/>
-              </w:rPr>
-              <w:t>Revenue</w:t>
-            </w:r>
-          </w:p>
-        </w:tc>
-      </w:tr>
-      <w:tr>
-        <w:tc>
-          <w:tcPr>
-            <w:tcW w:type="dxa" w:w="2592"/>
-            <w:shd w:fill="EDF2F7"/>
-            <w:tcMar>
-              <w:top w:w="70" w:type="dxa"/>
-              <w:bottom w:w="70" w:type="dxa"/>
-              <w:left w:w="100" w:type="dxa"/>
-              <w:right w:w="100" w:type="dxa"/>
-            </w:tcMar>
-          </w:tcPr>
-          <w:p>
-            <w:pPr>
-              <w:spacing w:before="40" w:after="40"/>
-            </w:pPr>
-            <w:r>
-              <w:rPr>
-                <w:rFonts w:ascii="Arial" w:hAnsi="Arial"/>
-                <w:b/>
-                <w:color w:val="2D3748"/>
-                <w:sz w:val="19"/>
-              </w:rPr>
-              <w:t>Equipment</w:t>
-            </w:r>
-          </w:p>
-        </w:tc>
-        <w:tc>
-          <w:tcPr>
-            <w:tcW w:type="dxa" w:w="6768"/>
-            <w:shd w:fill="FFFFFF"/>
-            <w:tcMar>
-              <w:top w:w="70" w:type="dxa"/>
-              <w:bottom w:w="70" w:type="dxa"/>
-              <w:left w:w="100" w:type="dxa"/>
-              <w:right w:w="100" w:type="dxa"/>
-            </w:tcMar>
-          </w:tcPr>
-          <w:p>
-            <w:pPr>
-              <w:spacing w:before="40" w:after="40"/>
-            </w:pPr>
-            <w:r>
-              <w:rPr>
-                <w:rFonts w:ascii="Arial" w:hAnsi="Arial"/>
-                <w:sz w:val="19"/>
-              </w:rPr>
-              <w:t>N/A</w:t>
-            </w:r>
-          </w:p>
-        </w:tc>
-      </w:tr>
-      <w:tr>
-        <w:tc>
-          <w:tcPr>
-            <w:tcW w:type="dxa" w:w="2592"/>
-            <w:shd w:fill="EDF2F7"/>
-            <w:tcMar>
-              <w:top w:w="70" w:type="dxa"/>
-              <w:bottom w:w="70" w:type="dxa"/>
-              <w:left w:w="100" w:type="dxa"/>
-              <w:right w:w="100" w:type="dxa"/>
-            </w:tcMar>
-          </w:tcPr>
-          <w:p>
-            <w:pPr>
-              <w:spacing w:before="40" w:after="40"/>
-            </w:pPr>
-            <w:r>
-              <w:rPr>
-                <w:rFonts w:ascii="Arial" w:hAnsi="Arial"/>
-                <w:b/>
-                <w:color w:val="2D3748"/>
-                <w:sz w:val="19"/>
-              </w:rPr>
-              <w:t>Observed Value</w:t>
-            </w:r>
-          </w:p>
-        </w:tc>
-        <w:tc>
-          <w:tcPr>
-            <w:tcW w:type="dxa" w:w="6768"/>
-            <w:shd w:fill="FFFFFF"/>
-            <w:tcMar>
-              <w:top w:w="70" w:type="dxa"/>
-              <w:bottom w:w="70" w:type="dxa"/>
-              <w:left w:w="100" w:type="dxa"/>
-              <w:right w:w="100" w:type="dxa"/>
-            </w:tcMar>
-          </w:tcPr>
-          <w:p>
-            <w:pPr>
-              <w:spacing w:before="40" w:after="40"/>
-            </w:pPr>
-            <w:r>
-              <w:rPr>
-                <w:rFonts w:ascii="Arial" w:hAnsi="Arial"/>
-                <w:sz w:val="19"/>
-              </w:rPr>
-              <w:t>5,64,749</w:t>
-            </w:r>
-          </w:p>
-        </w:tc>
-      </w:tr>
-      <w:tr>
-        <w:tc>
-          <w:tcPr>
-            <w:tcW w:type="dxa" w:w="2592"/>
-            <w:shd w:fill="EDF2F7"/>
-            <w:tcMar>
-              <w:top w:w="70" w:type="dxa"/>
-              <w:bottom w:w="70" w:type="dxa"/>
-              <w:left w:w="100" w:type="dxa"/>
-              <w:right w:w="100" w:type="dxa"/>
-            </w:tcMar>
-          </w:tcPr>
-          <w:p>
-            <w:pPr>
-              <w:spacing w:before="40" w:after="40"/>
-            </w:pPr>
-            <w:r>
-              <w:rPr>
-                <w:rFonts w:ascii="Arial" w:hAnsi="Arial"/>
-                <w:b/>
-                <w:color w:val="2D3748"/>
-                <w:sz w:val="19"/>
-              </w:rPr>
-              <w:t>Limit</w:t>
-            </w:r>
-          </w:p>
-        </w:tc>
-        <w:tc>
-          <w:tcPr>
-            <w:tcW w:type="dxa" w:w="6768"/>
-            <w:shd w:fill="FFFFFF"/>
-            <w:tcMar>
-              <w:top w:w="70" w:type="dxa"/>
-              <w:bottom w:w="70" w:type="dxa"/>
-              <w:left w:w="100" w:type="dxa"/>
-              <w:right w:w="100" w:type="dxa"/>
-            </w:tcMar>
-          </w:tcPr>
-          <w:p>
-            <w:pPr>
-              <w:spacing w:before="40" w:after="40"/>
-            </w:pPr>
-            <w:r>
-              <w:rPr>
-                <w:rFonts w:ascii="Arial" w:hAnsi="Arial"/>
-                <w:sz w:val="19"/>
-              </w:rPr>
-              <w:t>N/A</w:t>
-            </w:r>
-          </w:p>
-        </w:tc>
-      </w:tr>
-      <w:tr>
-        <w:tc>
-          <w:tcPr>
-            <w:tcW w:type="dxa" w:w="2592"/>
-            <w:shd w:fill="EDF2F7"/>
-            <w:tcMar>
-              <w:top w:w="70" w:type="dxa"/>
-              <w:bottom w:w="70" w:type="dxa"/>
-              <w:left w:w="100" w:type="dxa"/>
-              <w:right w:w="100" w:type="dxa"/>
-            </w:tcMar>
-          </w:tcPr>
-          <w:p>
-            <w:pPr>
-              <w:spacing w:before="40" w:after="40"/>
-            </w:pPr>
-            <w:r>
-              <w:rPr>
-                <w:rFonts w:ascii="Arial" w:hAnsi="Arial"/>
-                <w:b/>
-                <w:color w:val="2D3748"/>
-                <w:sz w:val="19"/>
-              </w:rPr>
-              <w:t>Severity</w:t>
-            </w:r>
-          </w:p>
-        </w:tc>
-        <w:tc>
-          <w:tcPr>
-            <w:tcW w:type="dxa" w:w="6768"/>
-            <w:shd w:fill="FFFFFF"/>
-            <w:tcMar>
-              <w:top w:w="70" w:type="dxa"/>
-              <w:bottom w:w="70" w:type="dxa"/>
-              <w:left w:w="100" w:type="dxa"/>
-              <w:right w:w="100" w:type="dxa"/>
-            </w:tcMar>
-          </w:tcPr>
-          <w:p>
-            <w:pPr>
-              <w:spacing w:before="40" w:after="40"/>
-            </w:pPr>
-            <w:r>
-              <w:rPr>
-                <w:rFonts w:ascii="Arial" w:hAnsi="Arial"/>
-                <w:sz w:val="19"/>
-              </w:rPr>
-              <w:t>N/A</w:t>
-            </w:r>
-          </w:p>
-        </w:tc>
-      </w:tr>
-      <w:tr>
-        <w:tc>
-          <w:tcPr>
-            <w:tcW w:type="dxa" w:w="2592"/>
-            <w:shd w:fill="EDF2F7"/>
-            <w:tcMar>
-              <w:top w:w="70" w:type="dxa"/>
-              <w:bottom w:w="70" w:type="dxa"/>
-              <w:left w:w="100" w:type="dxa"/>
-              <w:right w:w="100" w:type="dxa"/>
-            </w:tcMar>
-          </w:tcPr>
-          <w:p>
-            <w:pPr>
-              <w:spacing w:before="40" w:after="40"/>
-            </w:pPr>
-            <w:r>
-              <w:rPr>
-                <w:rFonts w:ascii="Arial" w:hAnsi="Arial"/>
-                <w:b/>
-                <w:color w:val="2D3748"/>
-                <w:sz w:val="19"/>
-              </w:rPr>
-              <w:t>Evidence</w:t>
-            </w:r>
-          </w:p>
-        </w:tc>
-        <w:tc>
-          <w:tcPr>
-            <w:tcW w:type="dxa" w:w="6768"/>
-            <w:shd w:fill="FFFFFF"/>
-            <w:tcMar>
-              <w:top w:w="70" w:type="dxa"/>
-              <w:bottom w:w="70" w:type="dxa"/>
-              <w:left w:w="100" w:type="dxa"/>
-              <w:right w:w="100" w:type="dxa"/>
-            </w:tcMar>
-          </w:tcPr>
-          <w:p>
-            <w:pPr>
-              <w:spacing w:before="40" w:after="40"/>
-            </w:pPr>
-            <w:r>
-              <w:rPr>
-                <w:rFonts w:ascii="Arial" w:hAnsi="Arial"/>
-                <w:sz w:val="19"/>
-              </w:rPr>
-              <w:t>Value of Sales and Services (Revenue) * 5,64,749</w:t>
-            </w:r>
-          </w:p>
-        </w:tc>
-      </w:tr>
-    </w:tbl>
-    <w:p>
-      <w:pPr>
-        <w:spacing w:before="0" w:after="120"/>
-      </w:pPr>
-    </w:p>
-    <w:p>
-      <w:pPr>
-        <w:keepNext/>
-        <w:spacing w:before="120" w:after="80"/>
-      </w:pPr>
-      <w:r>
-        <w:rPr>
-          <w:rFonts w:ascii="Arial" w:hAnsi="Arial"/>
-          <w:b/>
-          <w:color w:val="2D3748"/>
-          <w:sz w:val="22"/>
-        </w:rPr>
-        <w:t>Finding 2</w:t>
-      </w:r>
-    </w:p>
-    <w:tbl>
-      <w:tblPr>
-        <w:tblW w:type="auto" w:w="0"/>
-        <w:jc w:val="center"/>
-        <w:tblLayout w:type="fixed"/>
-        <w:tblLook w:firstColumn="1" w:firstRow="1" w:lastColumn="0" w:lastRow="0" w:noHBand="0" w:noVBand="1" w:val="04A0"/>
-      </w:tblPr>
-      <w:tblGrid>
-        <w:gridCol w:w="4680"/>
-        <w:gridCol w:w="4680"/>
-      </w:tblGrid>
-      <w:tr>
-        <w:tc>
-          <w:tcPr>
-            <w:tcW w:type="dxa" w:w="2592"/>
-            <w:shd w:fill="EDF2F7"/>
-            <w:tcMar>
-              <w:top w:w="70" w:type="dxa"/>
-              <w:bottom w:w="70" w:type="dxa"/>
-              <w:left w:w="100" w:type="dxa"/>
-              <w:right w:w="100" w:type="dxa"/>
-            </w:tcMar>
-          </w:tcPr>
-          <w:p>
-            <w:pPr>
-              <w:spacing w:before="40" w:after="40"/>
-            </w:pPr>
-            <w:r>
-              <w:rPr>
-                <w:rFonts w:ascii="Arial" w:hAnsi="Arial"/>
-                <w:b/>
-                <w:color w:val="2D3748"/>
-                <w:sz w:val="19"/>
-              </w:rPr>
-              <w:t>Finding</w:t>
-            </w:r>
-          </w:p>
-        </w:tc>
-        <w:tc>
-          <w:tcPr>
-            <w:tcW w:type="dxa" w:w="6768"/>
-            <w:shd w:fill="FFFFFF"/>
-            <w:tcMar>
-              <w:top w:w="70" w:type="dxa"/>
-              <w:bottom w:w="70" w:type="dxa"/>
-              <w:left w:w="100" w:type="dxa"/>
-              <w:right w:w="100" w:type="dxa"/>
-            </w:tcMar>
-          </w:tcPr>
-          <w:p>
-            <w:pPr>
-              <w:spacing w:before="40" w:after="40"/>
-            </w:pPr>
-            <w:r>
-              <w:rPr>
-                <w:rFonts w:ascii="Arial" w:hAnsi="Arial"/>
-                <w:sz w:val="19"/>
-              </w:rPr>
-              <w:t>Revenue Growth</w:t>
-            </w:r>
-          </w:p>
-        </w:tc>
-      </w:tr>
-      <w:tr>
-        <w:tc>
-          <w:tcPr>
-            <w:tcW w:type="dxa" w:w="2592"/>
-            <w:shd w:fill="EDF2F7"/>
-            <w:tcMar>
-              <w:top w:w="70" w:type="dxa"/>
-              <w:bottom w:w="70" w:type="dxa"/>
-              <w:left w:w="100" w:type="dxa"/>
-              <w:right w:w="100" w:type="dxa"/>
-            </w:tcMar>
-          </w:tcPr>
-          <w:p>
-            <w:pPr>
-              <w:spacing w:before="40" w:after="40"/>
-            </w:pPr>
-            <w:r>
-              <w:rPr>
-                <w:rFonts w:ascii="Arial" w:hAnsi="Arial"/>
-                <w:b/>
-                <w:color w:val="2D3748"/>
-                <w:sz w:val="19"/>
-              </w:rPr>
-              <w:t>Equipment</w:t>
-            </w:r>
-          </w:p>
-        </w:tc>
-        <w:tc>
-          <w:tcPr>
-            <w:tcW w:type="dxa" w:w="6768"/>
-            <w:shd w:fill="FFFFFF"/>
-            <w:tcMar>
-              <w:top w:w="70" w:type="dxa"/>
-              <w:bottom w:w="70" w:type="dxa"/>
-              <w:left w:w="100" w:type="dxa"/>
-              <w:right w:w="100" w:type="dxa"/>
-            </w:tcMar>
-          </w:tcPr>
-          <w:p>
-            <w:pPr>
-              <w:spacing w:before="40" w:after="40"/>
-            </w:pPr>
-            <w:r>
-              <w:rPr>
-                <w:rFonts w:ascii="Arial" w:hAnsi="Arial"/>
-                <w:sz w:val="19"/>
-              </w:rPr>
-              <w:t>N/A</w:t>
-            </w:r>
-          </w:p>
-        </w:tc>
-      </w:tr>
-      <w:tr>
-        <w:tc>
-          <w:tcPr>
-            <w:tcW w:type="dxa" w:w="2592"/>
-            <w:shd w:fill="EDF2F7"/>
-            <w:tcMar>
-              <w:top w:w="70" w:type="dxa"/>
-              <w:bottom w:w="70" w:type="dxa"/>
-              <w:left w:w="100" w:type="dxa"/>
-              <w:right w:w="100" w:type="dxa"/>
-            </w:tcMar>
-          </w:tcPr>
-          <w:p>
-            <w:pPr>
-              <w:spacing w:before="40" w:after="40"/>
-            </w:pPr>
-            <w:r>
-              <w:rPr>
-                <w:rFonts w:ascii="Arial" w:hAnsi="Arial"/>
-                <w:b/>
-                <w:color w:val="2D3748"/>
-                <w:sz w:val="19"/>
-              </w:rPr>
-              <w:t>Observed Value</w:t>
-            </w:r>
-          </w:p>
-        </w:tc>
-        <w:tc>
-          <w:tcPr>
-            <w:tcW w:type="dxa" w:w="6768"/>
-            <w:shd w:fill="FFFFFF"/>
-            <w:tcMar>
-              <w:top w:w="70" w:type="dxa"/>
-              <w:bottom w:w="70" w:type="dxa"/>
-              <w:left w:w="100" w:type="dxa"/>
-              <w:right w:w="100" w:type="dxa"/>
-            </w:tcMar>
-          </w:tcPr>
-          <w:p>
-            <w:pPr>
-              <w:spacing w:before="40" w:after="40"/>
-            </w:pPr>
-            <w:r>
-              <w:rPr>
-                <w:rFonts w:ascii="Arial" w:hAnsi="Arial"/>
-                <w:sz w:val="19"/>
-              </w:rPr>
-              <w:t>15.9%</w:t>
-            </w:r>
-          </w:p>
-        </w:tc>
-      </w:tr>
-      <w:tr>
-        <w:tc>
-          <w:tcPr>
-            <w:tcW w:type="dxa" w:w="2592"/>
-            <w:shd w:fill="EDF2F7"/>
-            <w:tcMar>
-              <w:top w:w="70" w:type="dxa"/>
-              <w:bottom w:w="70" w:type="dxa"/>
-              <w:left w:w="100" w:type="dxa"/>
-              <w:right w:w="100" w:type="dxa"/>
-            </w:tcMar>
-          </w:tcPr>
-          <w:p>
-            <w:pPr>
-              <w:spacing w:before="40" w:after="40"/>
-            </w:pPr>
-            <w:r>
-              <w:rPr>
-                <w:rFonts w:ascii="Arial" w:hAnsi="Arial"/>
-                <w:b/>
-                <w:color w:val="2D3748"/>
-                <w:sz w:val="19"/>
-              </w:rPr>
-              <w:t>Limit</w:t>
-            </w:r>
-          </w:p>
-        </w:tc>
-        <w:tc>
-          <w:tcPr>
-            <w:tcW w:type="dxa" w:w="6768"/>
-            <w:shd w:fill="FFFFFF"/>
-            <w:tcMar>
-              <w:top w:w="70" w:type="dxa"/>
-              <w:bottom w:w="70" w:type="dxa"/>
-              <w:left w:w="100" w:type="dxa"/>
-              <w:right w:w="100" w:type="dxa"/>
-            </w:tcMar>
-          </w:tcPr>
-          <w:p>
-            <w:pPr>
-              <w:spacing w:before="40" w:after="40"/>
-            </w:pPr>
-            <w:r>
-              <w:rPr>
-                <w:rFonts w:ascii="Arial" w:hAnsi="Arial"/>
-                <w:sz w:val="19"/>
-              </w:rPr>
-              <w:t>N/A</w:t>
-            </w:r>
-          </w:p>
-        </w:tc>
-      </w:tr>
-      <w:tr>
-        <w:tc>
-          <w:tcPr>
-            <w:tcW w:type="dxa" w:w="2592"/>
-            <w:shd w:fill="EDF2F7"/>
-            <w:tcMar>
-              <w:top w:w="70" w:type="dxa"/>
-              <w:bottom w:w="70" w:type="dxa"/>
-              <w:left w:w="100" w:type="dxa"/>
-              <w:right w:w="100" w:type="dxa"/>
-            </w:tcMar>
-          </w:tcPr>
-          <w:p>
-            <w:pPr>
-              <w:spacing w:before="40" w:after="40"/>
-            </w:pPr>
-            <w:r>
-              <w:rPr>
-                <w:rFonts w:ascii="Arial" w:hAnsi="Arial"/>
-                <w:b/>
-                <w:color w:val="2D3748"/>
-                <w:sz w:val="19"/>
-              </w:rPr>
-              <w:t>Severity</w:t>
-            </w:r>
-          </w:p>
-        </w:tc>
-        <w:tc>
-          <w:tcPr>
-            <w:tcW w:type="dxa" w:w="6768"/>
-            <w:shd w:fill="FFFFFF"/>
-            <w:tcMar>
-              <w:top w:w="70" w:type="dxa"/>
-              <w:bottom w:w="70" w:type="dxa"/>
-              <w:left w:w="100" w:type="dxa"/>
-              <w:right w:w="100" w:type="dxa"/>
-            </w:tcMar>
-          </w:tcPr>
-          <w:p>
-            <w:pPr>
-              <w:spacing w:before="40" w:after="40"/>
-            </w:pPr>
-            <w:r>
-              <w:rPr>
-                <w:rFonts w:ascii="Arial" w:hAnsi="Arial"/>
-                <w:sz w:val="19"/>
-              </w:rPr>
-              <w:t>N/A</w:t>
-            </w:r>
-          </w:p>
-        </w:tc>
-      </w:tr>
-      <w:tr>
-        <w:tc>
-          <w:tcPr>
-            <w:tcW w:type="dxa" w:w="2592"/>
-            <w:shd w:fill="EDF2F7"/>
-            <w:tcMar>
-              <w:top w:w="70" w:type="dxa"/>
-              <w:bottom w:w="70" w:type="dxa"/>
-              <w:left w:w="100" w:type="dxa"/>
-              <w:right w:w="100" w:type="dxa"/>
-            </w:tcMar>
-          </w:tcPr>
-          <w:p>
-            <w:pPr>
-              <w:spacing w:before="40" w:after="40"/>
-            </w:pPr>
-            <w:r>
-              <w:rPr>
-                <w:rFonts w:ascii="Arial" w:hAnsi="Arial"/>
-                <w:b/>
-                <w:color w:val="2D3748"/>
-                <w:sz w:val="19"/>
-              </w:rPr>
-              <w:t>Evidence</w:t>
-            </w:r>
-          </w:p>
-        </w:tc>
-        <w:tc>
-          <w:tcPr>
-            <w:tcW w:type="dxa" w:w="6768"/>
-            <w:shd w:fill="FFFFFF"/>
-            <w:tcMar>
-              <w:top w:w="70" w:type="dxa"/>
-              <w:bottom w:w="70" w:type="dxa"/>
-              <w:left w:w="100" w:type="dxa"/>
-              <w:right w:w="100" w:type="dxa"/>
-            </w:tcMar>
-          </w:tcPr>
-          <w:p>
-            <w:pPr>
-              <w:spacing w:before="40" w:after="40"/>
-            </w:pPr>
-            <w:r>
-              <w:rPr>
-                <w:rFonts w:ascii="Arial" w:hAnsi="Arial"/>
-                <w:sz w:val="19"/>
-              </w:rPr>
-              <w:t>REVENUE ↑ 15.9% L 1,54,119 Crore US$ 18.0 Billion</w:t>
-            </w:r>
-          </w:p>
-        </w:tc>
-      </w:tr>
-    </w:tbl>
-    <w:p>
-      <w:pPr>
-        <w:spacing w:before="0" w:after="120"/>
-      </w:pPr>
     </w:p>
     <w:p>
       <w:pPr>
@@ -928,7 +252,7 @@
                 <w:rFonts w:ascii="Arial" w:hAnsi="Arial"/>
                 <w:sz w:val="19"/>
               </w:rPr>
-              <w:t>Insufficient evidence to determine risk level.</w:t>
+              <w:t>No significant inspection findings were detected in the report.</w:t>
             </w:r>
           </w:p>
         </w:tc>
@@ -986,7 +310,7 @@
                 <w:color w:val="2B6CB0"/>
                 <w:sz w:val="20"/>
               </w:rPr>
-              <w:t>Insufficient SOP evidence is available to provide a validated recommendation.</w:t>
+              <w:t>Continue standard operating and inspection schedule.</w:t>
             </w:r>
           </w:p>
         </w:tc>

</xml_diff>

<commit_message>
feat: enable inspection workflow on existing documents and update LLM prompt for verbatim evidence extraction
</commit_message>
<xml_diff>
--- a/backend/generated/Approval_Note.docx
+++ b/backend/generated/Approval_Note.docx
@@ -56,7 +56,7 @@
           <w:rFonts w:ascii="Arial" w:hAnsi="Arial"/>
           <w:sz w:val="21"/>
         </w:rPr>
-        <w:t>Inspection Report Analysis and Approval Recommendation — 6de192f1-9978-47bf-90d1-863579beb839</w:t>
+        <w:t>Inspection Report Analysis and Approval Recommendation — Synthetic_Inspection_Report_Demo.pdf</w:t>
       </w:r>
     </w:p>
     <w:p>
@@ -83,7 +83,7 @@
           <w:rFonts w:ascii="Arial" w:hAnsi="Arial"/>
           <w:sz w:val="20"/>
         </w:rPr>
-        <w:t>An industrial inspection identified 0 finding(s) . Operational parameters were recorded during standard inspection routines and evaluated against documented standard operating procedures (SOPs) to produce this assessment.</w:t>
+        <w:t>An industrial inspection identified 4 finding(s) on P-101 Process Pump. Operational parameters were recorded during standard inspection routines and evaluated against documented standard operating procedures (SOPs) to produce this assessment.</w:t>
       </w:r>
     </w:p>
     <w:p>
@@ -103,15 +103,1379 @@
     </w:p>
     <w:p>
       <w:pPr>
-        <w:spacing w:after="160"/>
+        <w:keepNext/>
+        <w:spacing w:before="120" w:after="80"/>
       </w:pPr>
       <w:r>
         <w:rPr>
           <w:rFonts w:ascii="Arial" w:hAnsi="Arial"/>
-          <w:i/>
+          <w:b/>
+          <w:color w:val="2D3748"/>
+          <w:sz w:val="22"/>
         </w:rPr>
-        <w:t>No inspection findings recorded.</w:t>
+        <w:t>Finding 1</w:t>
       </w:r>
+    </w:p>
+    <w:tbl>
+      <w:tblPr>
+        <w:tblW w:type="auto" w:w="0"/>
+        <w:jc w:val="center"/>
+        <w:tblLayout w:type="fixed"/>
+        <w:tblLook w:firstColumn="1" w:firstRow="1" w:lastColumn="0" w:lastRow="0" w:noHBand="0" w:noVBand="1" w:val="04A0"/>
+      </w:tblPr>
+      <w:tblGrid>
+        <w:gridCol w:w="4680"/>
+        <w:gridCol w:w="4680"/>
+      </w:tblGrid>
+      <w:tr>
+        <w:tc>
+          <w:tcPr>
+            <w:tcW w:type="dxa" w:w="2592"/>
+            <w:shd w:fill="EDF2F7"/>
+            <w:tcMar>
+              <w:top w:w="70" w:type="dxa"/>
+              <w:bottom w:w="70" w:type="dxa"/>
+              <w:left w:w="100" w:type="dxa"/>
+              <w:right w:w="100" w:type="dxa"/>
+            </w:tcMar>
+          </w:tcPr>
+          <w:p>
+            <w:pPr>
+              <w:spacing w:before="40" w:after="40"/>
+            </w:pPr>
+            <w:r>
+              <w:rPr>
+                <w:rFonts w:ascii="Arial" w:hAnsi="Arial"/>
+                <w:b/>
+                <w:color w:val="2D3748"/>
+                <w:sz w:val="19"/>
+              </w:rPr>
+              <w:t>Finding</w:t>
+            </w:r>
+          </w:p>
+        </w:tc>
+        <w:tc>
+          <w:tcPr>
+            <w:tcW w:type="dxa" w:w="6768"/>
+            <w:shd w:fill="FFFFFF"/>
+            <w:tcMar>
+              <w:top w:w="70" w:type="dxa"/>
+              <w:bottom w:w="70" w:type="dxa"/>
+              <w:left w:w="100" w:type="dxa"/>
+              <w:right w:w="100" w:type="dxa"/>
+            </w:tcMar>
+          </w:tcPr>
+          <w:p>
+            <w:pPr>
+              <w:spacing w:before="40" w:after="40"/>
+            </w:pPr>
+            <w:r>
+              <w:rPr>
+                <w:rFonts w:ascii="Arial" w:hAnsi="Arial"/>
+                <w:sz w:val="19"/>
+              </w:rPr>
+              <w:t>Bearing temperature exceeded the normal operating limit.</w:t>
+            </w:r>
+          </w:p>
+        </w:tc>
+      </w:tr>
+      <w:tr>
+        <w:tc>
+          <w:tcPr>
+            <w:tcW w:type="dxa" w:w="2592"/>
+            <w:shd w:fill="EDF2F7"/>
+            <w:tcMar>
+              <w:top w:w="70" w:type="dxa"/>
+              <w:bottom w:w="70" w:type="dxa"/>
+              <w:left w:w="100" w:type="dxa"/>
+              <w:right w:w="100" w:type="dxa"/>
+            </w:tcMar>
+          </w:tcPr>
+          <w:p>
+            <w:pPr>
+              <w:spacing w:before="40" w:after="40"/>
+            </w:pPr>
+            <w:r>
+              <w:rPr>
+                <w:rFonts w:ascii="Arial" w:hAnsi="Arial"/>
+                <w:b/>
+                <w:color w:val="2D3748"/>
+                <w:sz w:val="19"/>
+              </w:rPr>
+              <w:t>Equipment</w:t>
+            </w:r>
+          </w:p>
+        </w:tc>
+        <w:tc>
+          <w:tcPr>
+            <w:tcW w:type="dxa" w:w="6768"/>
+            <w:shd w:fill="FFFFFF"/>
+            <w:tcMar>
+              <w:top w:w="70" w:type="dxa"/>
+              <w:bottom w:w="70" w:type="dxa"/>
+              <w:left w:w="100" w:type="dxa"/>
+              <w:right w:w="100" w:type="dxa"/>
+            </w:tcMar>
+          </w:tcPr>
+          <w:p>
+            <w:pPr>
+              <w:spacing w:before="40" w:after="40"/>
+            </w:pPr>
+            <w:r>
+              <w:rPr>
+                <w:rFonts w:ascii="Arial" w:hAnsi="Arial"/>
+                <w:sz w:val="19"/>
+              </w:rPr>
+              <w:t>P-101 Process Pump</w:t>
+            </w:r>
+          </w:p>
+        </w:tc>
+      </w:tr>
+      <w:tr>
+        <w:tc>
+          <w:tcPr>
+            <w:tcW w:type="dxa" w:w="2592"/>
+            <w:shd w:fill="EDF2F7"/>
+            <w:tcMar>
+              <w:top w:w="70" w:type="dxa"/>
+              <w:bottom w:w="70" w:type="dxa"/>
+              <w:left w:w="100" w:type="dxa"/>
+              <w:right w:w="100" w:type="dxa"/>
+            </w:tcMar>
+          </w:tcPr>
+          <w:p>
+            <w:pPr>
+              <w:spacing w:before="40" w:after="40"/>
+            </w:pPr>
+            <w:r>
+              <w:rPr>
+                <w:rFonts w:ascii="Arial" w:hAnsi="Arial"/>
+                <w:b/>
+                <w:color w:val="2D3748"/>
+                <w:sz w:val="19"/>
+              </w:rPr>
+              <w:t>Observed Value</w:t>
+            </w:r>
+          </w:p>
+        </w:tc>
+        <w:tc>
+          <w:tcPr>
+            <w:tcW w:type="dxa" w:w="6768"/>
+            <w:shd w:fill="FFFFFF"/>
+            <w:tcMar>
+              <w:top w:w="70" w:type="dxa"/>
+              <w:bottom w:w="70" w:type="dxa"/>
+              <w:left w:w="100" w:type="dxa"/>
+              <w:right w:w="100" w:type="dxa"/>
+            </w:tcMar>
+          </w:tcPr>
+          <w:p>
+            <w:pPr>
+              <w:spacing w:before="40" w:after="40"/>
+            </w:pPr>
+            <w:r>
+              <w:rPr>
+                <w:rFonts w:ascii="Arial" w:hAnsi="Arial"/>
+                <w:sz w:val="19"/>
+              </w:rPr>
+              <w:t>92 °C</w:t>
+            </w:r>
+          </w:p>
+        </w:tc>
+      </w:tr>
+      <w:tr>
+        <w:tc>
+          <w:tcPr>
+            <w:tcW w:type="dxa" w:w="2592"/>
+            <w:shd w:fill="EDF2F7"/>
+            <w:tcMar>
+              <w:top w:w="70" w:type="dxa"/>
+              <w:bottom w:w="70" w:type="dxa"/>
+              <w:left w:w="100" w:type="dxa"/>
+              <w:right w:w="100" w:type="dxa"/>
+            </w:tcMar>
+          </w:tcPr>
+          <w:p>
+            <w:pPr>
+              <w:spacing w:before="40" w:after="40"/>
+            </w:pPr>
+            <w:r>
+              <w:rPr>
+                <w:rFonts w:ascii="Arial" w:hAnsi="Arial"/>
+                <w:b/>
+                <w:color w:val="2D3748"/>
+                <w:sz w:val="19"/>
+              </w:rPr>
+              <w:t>Limit</w:t>
+            </w:r>
+          </w:p>
+        </w:tc>
+        <w:tc>
+          <w:tcPr>
+            <w:tcW w:type="dxa" w:w="6768"/>
+            <w:shd w:fill="FFFFFF"/>
+            <w:tcMar>
+              <w:top w:w="70" w:type="dxa"/>
+              <w:bottom w:w="70" w:type="dxa"/>
+              <w:left w:w="100" w:type="dxa"/>
+              <w:right w:w="100" w:type="dxa"/>
+            </w:tcMar>
+          </w:tcPr>
+          <w:p>
+            <w:pPr>
+              <w:spacing w:before="40" w:after="40"/>
+            </w:pPr>
+            <w:r>
+              <w:rPr>
+                <w:rFonts w:ascii="Arial" w:hAnsi="Arial"/>
+                <w:sz w:val="19"/>
+              </w:rPr>
+              <w:t>up to 80 °C</w:t>
+            </w:r>
+          </w:p>
+        </w:tc>
+      </w:tr>
+      <w:tr>
+        <w:tc>
+          <w:tcPr>
+            <w:tcW w:type="dxa" w:w="2592"/>
+            <w:shd w:fill="EDF2F7"/>
+            <w:tcMar>
+              <w:top w:w="70" w:type="dxa"/>
+              <w:bottom w:w="70" w:type="dxa"/>
+              <w:left w:w="100" w:type="dxa"/>
+              <w:right w:w="100" w:type="dxa"/>
+            </w:tcMar>
+          </w:tcPr>
+          <w:p>
+            <w:pPr>
+              <w:spacing w:before="40" w:after="40"/>
+            </w:pPr>
+            <w:r>
+              <w:rPr>
+                <w:rFonts w:ascii="Arial" w:hAnsi="Arial"/>
+                <w:b/>
+                <w:color w:val="2D3748"/>
+                <w:sz w:val="19"/>
+              </w:rPr>
+              <w:t>Severity</w:t>
+            </w:r>
+          </w:p>
+        </w:tc>
+        <w:tc>
+          <w:tcPr>
+            <w:tcW w:type="dxa" w:w="6768"/>
+            <w:shd w:fill="FFFFFF"/>
+            <w:tcMar>
+              <w:top w:w="70" w:type="dxa"/>
+              <w:bottom w:w="70" w:type="dxa"/>
+              <w:left w:w="100" w:type="dxa"/>
+              <w:right w:w="100" w:type="dxa"/>
+            </w:tcMar>
+          </w:tcPr>
+          <w:p>
+            <w:pPr>
+              <w:spacing w:before="40" w:after="40"/>
+            </w:pPr>
+            <w:r>
+              <w:rPr>
+                <w:rFonts w:ascii="Arial" w:hAnsi="Arial"/>
+                <w:sz w:val="19"/>
+              </w:rPr>
+              <w:t>Abnormal</w:t>
+            </w:r>
+          </w:p>
+        </w:tc>
+      </w:tr>
+      <w:tr>
+        <w:tc>
+          <w:tcPr>
+            <w:tcW w:type="dxa" w:w="2592"/>
+            <w:shd w:fill="EDF2F7"/>
+            <w:tcMar>
+              <w:top w:w="70" w:type="dxa"/>
+              <w:bottom w:w="70" w:type="dxa"/>
+              <w:left w:w="100" w:type="dxa"/>
+              <w:right w:w="100" w:type="dxa"/>
+            </w:tcMar>
+          </w:tcPr>
+          <w:p>
+            <w:pPr>
+              <w:spacing w:before="40" w:after="40"/>
+            </w:pPr>
+            <w:r>
+              <w:rPr>
+                <w:rFonts w:ascii="Arial" w:hAnsi="Arial"/>
+                <w:b/>
+                <w:color w:val="2D3748"/>
+                <w:sz w:val="19"/>
+              </w:rPr>
+              <w:t>Evidence</w:t>
+            </w:r>
+          </w:p>
+        </w:tc>
+        <w:tc>
+          <w:tcPr>
+            <w:tcW w:type="dxa" w:w="6768"/>
+            <w:shd w:fill="FFFFFF"/>
+            <w:tcMar>
+              <w:top w:w="70" w:type="dxa"/>
+              <w:bottom w:w="70" w:type="dxa"/>
+              <w:left w:w="100" w:type="dxa"/>
+              <w:right w:w="100" w:type="dxa"/>
+            </w:tcMar>
+          </w:tcPr>
+          <w:p>
+            <w:pPr>
+              <w:spacing w:before="40" w:after="40"/>
+            </w:pPr>
+            <w:r>
+              <w:rPr>
+                <w:rFonts w:ascii="Arial" w:hAnsi="Arial"/>
+                <w:sz w:val="19"/>
+              </w:rPr>
+              <w:t>The observed temperature was recorded above the normal operating limit.</w:t>
+            </w:r>
+          </w:p>
+        </w:tc>
+      </w:tr>
+    </w:tbl>
+    <w:p>
+      <w:pPr>
+        <w:spacing w:before="0" w:after="120"/>
+      </w:pPr>
+    </w:p>
+    <w:p>
+      <w:pPr>
+        <w:keepNext/>
+        <w:spacing w:before="120" w:after="80"/>
+      </w:pPr>
+      <w:r>
+        <w:rPr>
+          <w:rFonts w:ascii="Arial" w:hAnsi="Arial"/>
+          <w:b/>
+          <w:color w:val="2D3748"/>
+          <w:sz w:val="22"/>
+        </w:rPr>
+        <w:t>Finding 2</w:t>
+      </w:r>
+    </w:p>
+    <w:tbl>
+      <w:tblPr>
+        <w:tblW w:type="auto" w:w="0"/>
+        <w:jc w:val="center"/>
+        <w:tblLayout w:type="fixed"/>
+        <w:tblLook w:firstColumn="1" w:firstRow="1" w:lastColumn="0" w:lastRow="0" w:noHBand="0" w:noVBand="1" w:val="04A0"/>
+      </w:tblPr>
+      <w:tblGrid>
+        <w:gridCol w:w="4680"/>
+        <w:gridCol w:w="4680"/>
+      </w:tblGrid>
+      <w:tr>
+        <w:tc>
+          <w:tcPr>
+            <w:tcW w:type="dxa" w:w="2592"/>
+            <w:shd w:fill="EDF2F7"/>
+            <w:tcMar>
+              <w:top w:w="70" w:type="dxa"/>
+              <w:bottom w:w="70" w:type="dxa"/>
+              <w:left w:w="100" w:type="dxa"/>
+              <w:right w:w="100" w:type="dxa"/>
+            </w:tcMar>
+          </w:tcPr>
+          <w:p>
+            <w:pPr>
+              <w:spacing w:before="40" w:after="40"/>
+            </w:pPr>
+            <w:r>
+              <w:rPr>
+                <w:rFonts w:ascii="Arial" w:hAnsi="Arial"/>
+                <w:b/>
+                <w:color w:val="2D3748"/>
+                <w:sz w:val="19"/>
+              </w:rPr>
+              <w:t>Finding</w:t>
+            </w:r>
+          </w:p>
+        </w:tc>
+        <w:tc>
+          <w:tcPr>
+            <w:tcW w:type="dxa" w:w="6768"/>
+            <w:shd w:fill="FFFFFF"/>
+            <w:tcMar>
+              <w:top w:w="70" w:type="dxa"/>
+              <w:bottom w:w="70" w:type="dxa"/>
+              <w:left w:w="100" w:type="dxa"/>
+              <w:right w:w="100" w:type="dxa"/>
+            </w:tcMar>
+          </w:tcPr>
+          <w:p>
+            <w:pPr>
+              <w:spacing w:before="40" w:after="40"/>
+            </w:pPr>
+            <w:r>
+              <w:rPr>
+                <w:rFonts w:ascii="Arial" w:hAnsi="Arial"/>
+                <w:sz w:val="19"/>
+              </w:rPr>
+              <w:t>Abnormal vibration was recorded.</w:t>
+            </w:r>
+          </w:p>
+        </w:tc>
+      </w:tr>
+      <w:tr>
+        <w:tc>
+          <w:tcPr>
+            <w:tcW w:type="dxa" w:w="2592"/>
+            <w:shd w:fill="EDF2F7"/>
+            <w:tcMar>
+              <w:top w:w="70" w:type="dxa"/>
+              <w:bottom w:w="70" w:type="dxa"/>
+              <w:left w:w="100" w:type="dxa"/>
+              <w:right w:w="100" w:type="dxa"/>
+            </w:tcMar>
+          </w:tcPr>
+          <w:p>
+            <w:pPr>
+              <w:spacing w:before="40" w:after="40"/>
+            </w:pPr>
+            <w:r>
+              <w:rPr>
+                <w:rFonts w:ascii="Arial" w:hAnsi="Arial"/>
+                <w:b/>
+                <w:color w:val="2D3748"/>
+                <w:sz w:val="19"/>
+              </w:rPr>
+              <w:t>Equipment</w:t>
+            </w:r>
+          </w:p>
+        </w:tc>
+        <w:tc>
+          <w:tcPr>
+            <w:tcW w:type="dxa" w:w="6768"/>
+            <w:shd w:fill="FFFFFF"/>
+            <w:tcMar>
+              <w:top w:w="70" w:type="dxa"/>
+              <w:bottom w:w="70" w:type="dxa"/>
+              <w:left w:w="100" w:type="dxa"/>
+              <w:right w:w="100" w:type="dxa"/>
+            </w:tcMar>
+          </w:tcPr>
+          <w:p>
+            <w:pPr>
+              <w:spacing w:before="40" w:after="40"/>
+            </w:pPr>
+            <w:r>
+              <w:rPr>
+                <w:rFonts w:ascii="Arial" w:hAnsi="Arial"/>
+                <w:sz w:val="19"/>
+              </w:rPr>
+              <w:t>P-101 Process Pump</w:t>
+            </w:r>
+          </w:p>
+        </w:tc>
+      </w:tr>
+      <w:tr>
+        <w:tc>
+          <w:tcPr>
+            <w:tcW w:type="dxa" w:w="2592"/>
+            <w:shd w:fill="EDF2F7"/>
+            <w:tcMar>
+              <w:top w:w="70" w:type="dxa"/>
+              <w:bottom w:w="70" w:type="dxa"/>
+              <w:left w:w="100" w:type="dxa"/>
+              <w:right w:w="100" w:type="dxa"/>
+            </w:tcMar>
+          </w:tcPr>
+          <w:p>
+            <w:pPr>
+              <w:spacing w:before="40" w:after="40"/>
+            </w:pPr>
+            <w:r>
+              <w:rPr>
+                <w:rFonts w:ascii="Arial" w:hAnsi="Arial"/>
+                <w:b/>
+                <w:color w:val="2D3748"/>
+                <w:sz w:val="19"/>
+              </w:rPr>
+              <w:t>Observed Value</w:t>
+            </w:r>
+          </w:p>
+        </w:tc>
+        <w:tc>
+          <w:tcPr>
+            <w:tcW w:type="dxa" w:w="6768"/>
+            <w:shd w:fill="FFFFFF"/>
+            <w:tcMar>
+              <w:top w:w="70" w:type="dxa"/>
+              <w:bottom w:w="70" w:type="dxa"/>
+              <w:left w:w="100" w:type="dxa"/>
+              <w:right w:w="100" w:type="dxa"/>
+            </w:tcMar>
+          </w:tcPr>
+          <w:p>
+            <w:pPr>
+              <w:spacing w:before="40" w:after="40"/>
+            </w:pPr>
+            <w:r>
+              <w:rPr>
+                <w:rFonts w:ascii="Arial" w:hAnsi="Arial"/>
+                <w:sz w:val="19"/>
+              </w:rPr>
+              <w:t>6.8 mm/s RMS</w:t>
+            </w:r>
+          </w:p>
+        </w:tc>
+      </w:tr>
+      <w:tr>
+        <w:tc>
+          <w:tcPr>
+            <w:tcW w:type="dxa" w:w="2592"/>
+            <w:shd w:fill="EDF2F7"/>
+            <w:tcMar>
+              <w:top w:w="70" w:type="dxa"/>
+              <w:bottom w:w="70" w:type="dxa"/>
+              <w:left w:w="100" w:type="dxa"/>
+              <w:right w:w="100" w:type="dxa"/>
+            </w:tcMar>
+          </w:tcPr>
+          <w:p>
+            <w:pPr>
+              <w:spacing w:before="40" w:after="40"/>
+            </w:pPr>
+            <w:r>
+              <w:rPr>
+                <w:rFonts w:ascii="Arial" w:hAnsi="Arial"/>
+                <w:b/>
+                <w:color w:val="2D3748"/>
+                <w:sz w:val="19"/>
+              </w:rPr>
+              <w:t>Limit</w:t>
+            </w:r>
+          </w:p>
+        </w:tc>
+        <w:tc>
+          <w:tcPr>
+            <w:tcW w:type="dxa" w:w="6768"/>
+            <w:shd w:fill="FFFFFF"/>
+            <w:tcMar>
+              <w:top w:w="70" w:type="dxa"/>
+              <w:bottom w:w="70" w:type="dxa"/>
+              <w:left w:w="100" w:type="dxa"/>
+              <w:right w:w="100" w:type="dxa"/>
+            </w:tcMar>
+          </w:tcPr>
+          <w:p>
+            <w:pPr>
+              <w:spacing w:before="40" w:after="40"/>
+            </w:pPr>
+            <w:r>
+              <w:rPr>
+                <w:rFonts w:ascii="Arial" w:hAnsi="Arial"/>
+                <w:sz w:val="19"/>
+              </w:rPr>
+              <w:t>up to 4.5 mm/s RMS</w:t>
+            </w:r>
+          </w:p>
+        </w:tc>
+      </w:tr>
+      <w:tr>
+        <w:tc>
+          <w:tcPr>
+            <w:tcW w:type="dxa" w:w="2592"/>
+            <w:shd w:fill="EDF2F7"/>
+            <w:tcMar>
+              <w:top w:w="70" w:type="dxa"/>
+              <w:bottom w:w="70" w:type="dxa"/>
+              <w:left w:w="100" w:type="dxa"/>
+              <w:right w:w="100" w:type="dxa"/>
+            </w:tcMar>
+          </w:tcPr>
+          <w:p>
+            <w:pPr>
+              <w:spacing w:before="40" w:after="40"/>
+            </w:pPr>
+            <w:r>
+              <w:rPr>
+                <w:rFonts w:ascii="Arial" w:hAnsi="Arial"/>
+                <w:b/>
+                <w:color w:val="2D3748"/>
+                <w:sz w:val="19"/>
+              </w:rPr>
+              <w:t>Severity</w:t>
+            </w:r>
+          </w:p>
+        </w:tc>
+        <w:tc>
+          <w:tcPr>
+            <w:tcW w:type="dxa" w:w="6768"/>
+            <w:shd w:fill="FFFFFF"/>
+            <w:tcMar>
+              <w:top w:w="70" w:type="dxa"/>
+              <w:bottom w:w="70" w:type="dxa"/>
+              <w:left w:w="100" w:type="dxa"/>
+              <w:right w:w="100" w:type="dxa"/>
+            </w:tcMar>
+          </w:tcPr>
+          <w:p>
+            <w:pPr>
+              <w:spacing w:before="40" w:after="40"/>
+            </w:pPr>
+            <w:r>
+              <w:rPr>
+                <w:rFonts w:ascii="Arial" w:hAnsi="Arial"/>
+                <w:sz w:val="19"/>
+              </w:rPr>
+              <w:t>Abnormal</w:t>
+            </w:r>
+          </w:p>
+        </w:tc>
+      </w:tr>
+      <w:tr>
+        <w:tc>
+          <w:tcPr>
+            <w:tcW w:type="dxa" w:w="2592"/>
+            <w:shd w:fill="EDF2F7"/>
+            <w:tcMar>
+              <w:top w:w="70" w:type="dxa"/>
+              <w:bottom w:w="70" w:type="dxa"/>
+              <w:left w:w="100" w:type="dxa"/>
+              <w:right w:w="100" w:type="dxa"/>
+            </w:tcMar>
+          </w:tcPr>
+          <w:p>
+            <w:pPr>
+              <w:spacing w:before="40" w:after="40"/>
+            </w:pPr>
+            <w:r>
+              <w:rPr>
+                <w:rFonts w:ascii="Arial" w:hAnsi="Arial"/>
+                <w:b/>
+                <w:color w:val="2D3748"/>
+                <w:sz w:val="19"/>
+              </w:rPr>
+              <w:t>Evidence</w:t>
+            </w:r>
+          </w:p>
+        </w:tc>
+        <w:tc>
+          <w:tcPr>
+            <w:tcW w:type="dxa" w:w="6768"/>
+            <w:shd w:fill="FFFFFF"/>
+            <w:tcMar>
+              <w:top w:w="70" w:type="dxa"/>
+              <w:bottom w:w="70" w:type="dxa"/>
+              <w:left w:w="100" w:type="dxa"/>
+              <w:right w:w="100" w:type="dxa"/>
+            </w:tcMar>
+          </w:tcPr>
+          <w:p>
+            <w:pPr>
+              <w:spacing w:before="40" w:after="40"/>
+            </w:pPr>
+            <w:r>
+              <w:rPr>
+                <w:rFonts w:ascii="Arial" w:hAnsi="Arial"/>
+                <w:sz w:val="19"/>
+              </w:rPr>
+              <w:t>Vibration at the pump bearing housing was measured at 6.8 mm/s RMS, compared with the synthetic inspection criterion of 4.5 mm/s RMS.</w:t>
+            </w:r>
+          </w:p>
+        </w:tc>
+      </w:tr>
+    </w:tbl>
+    <w:p>
+      <w:pPr>
+        <w:spacing w:before="0" w:after="120"/>
+      </w:pPr>
+    </w:p>
+    <w:p>
+      <w:pPr>
+        <w:keepNext/>
+        <w:spacing w:before="120" w:after="80"/>
+      </w:pPr>
+      <w:r>
+        <w:rPr>
+          <w:rFonts w:ascii="Arial" w:hAnsi="Arial"/>
+          <w:b/>
+          <w:color w:val="2D3748"/>
+          <w:sz w:val="22"/>
+        </w:rPr>
+        <w:t>Finding 3</w:t>
+      </w:r>
+    </w:p>
+    <w:tbl>
+      <w:tblPr>
+        <w:tblW w:type="auto" w:w="0"/>
+        <w:jc w:val="center"/>
+        <w:tblLayout w:type="fixed"/>
+        <w:tblLook w:firstColumn="1" w:firstRow="1" w:lastColumn="0" w:lastRow="0" w:noHBand="0" w:noVBand="1" w:val="04A0"/>
+      </w:tblPr>
+      <w:tblGrid>
+        <w:gridCol w:w="4680"/>
+        <w:gridCol w:w="4680"/>
+      </w:tblGrid>
+      <w:tr>
+        <w:tc>
+          <w:tcPr>
+            <w:tcW w:type="dxa" w:w="2592"/>
+            <w:shd w:fill="EDF2F7"/>
+            <w:tcMar>
+              <w:top w:w="70" w:type="dxa"/>
+              <w:bottom w:w="70" w:type="dxa"/>
+              <w:left w:w="100" w:type="dxa"/>
+              <w:right w:w="100" w:type="dxa"/>
+            </w:tcMar>
+          </w:tcPr>
+          <w:p>
+            <w:pPr>
+              <w:spacing w:before="40" w:after="40"/>
+            </w:pPr>
+            <w:r>
+              <w:rPr>
+                <w:rFonts w:ascii="Arial" w:hAnsi="Arial"/>
+                <w:b/>
+                <w:color w:val="2D3748"/>
+                <w:sz w:val="19"/>
+              </w:rPr>
+              <w:t>Finding</w:t>
+            </w:r>
+          </w:p>
+        </w:tc>
+        <w:tc>
+          <w:tcPr>
+            <w:tcW w:type="dxa" w:w="6768"/>
+            <w:shd w:fill="FFFFFF"/>
+            <w:tcMar>
+              <w:top w:w="70" w:type="dxa"/>
+              <w:bottom w:w="70" w:type="dxa"/>
+              <w:left w:w="100" w:type="dxa"/>
+              <w:right w:w="100" w:type="dxa"/>
+            </w:tcMar>
+          </w:tcPr>
+          <w:p>
+            <w:pPr>
+              <w:spacing w:before="40" w:after="40"/>
+            </w:pPr>
+            <w:r>
+              <w:rPr>
+                <w:rFonts w:ascii="Arial" w:hAnsi="Arial"/>
+                <w:sz w:val="19"/>
+              </w:rPr>
+              <w:t>Inadequate lubrication condition was observed.</w:t>
+            </w:r>
+          </w:p>
+        </w:tc>
+      </w:tr>
+      <w:tr>
+        <w:tc>
+          <w:tcPr>
+            <w:tcW w:type="dxa" w:w="2592"/>
+            <w:shd w:fill="EDF2F7"/>
+            <w:tcMar>
+              <w:top w:w="70" w:type="dxa"/>
+              <w:bottom w:w="70" w:type="dxa"/>
+              <w:left w:w="100" w:type="dxa"/>
+              <w:right w:w="100" w:type="dxa"/>
+            </w:tcMar>
+          </w:tcPr>
+          <w:p>
+            <w:pPr>
+              <w:spacing w:before="40" w:after="40"/>
+            </w:pPr>
+            <w:r>
+              <w:rPr>
+                <w:rFonts w:ascii="Arial" w:hAnsi="Arial"/>
+                <w:b/>
+                <w:color w:val="2D3748"/>
+                <w:sz w:val="19"/>
+              </w:rPr>
+              <w:t>Equipment</w:t>
+            </w:r>
+          </w:p>
+        </w:tc>
+        <w:tc>
+          <w:tcPr>
+            <w:tcW w:type="dxa" w:w="6768"/>
+            <w:shd w:fill="FFFFFF"/>
+            <w:tcMar>
+              <w:top w:w="70" w:type="dxa"/>
+              <w:bottom w:w="70" w:type="dxa"/>
+              <w:left w:w="100" w:type="dxa"/>
+              <w:right w:w="100" w:type="dxa"/>
+            </w:tcMar>
+          </w:tcPr>
+          <w:p>
+            <w:pPr>
+              <w:spacing w:before="40" w:after="40"/>
+            </w:pPr>
+            <w:r>
+              <w:rPr>
+                <w:rFonts w:ascii="Arial" w:hAnsi="Arial"/>
+                <w:sz w:val="19"/>
+              </w:rPr>
+              <w:t>P-101 Process Pump</w:t>
+            </w:r>
+          </w:p>
+        </w:tc>
+      </w:tr>
+      <w:tr>
+        <w:tc>
+          <w:tcPr>
+            <w:tcW w:type="dxa" w:w="2592"/>
+            <w:shd w:fill="EDF2F7"/>
+            <w:tcMar>
+              <w:top w:w="70" w:type="dxa"/>
+              <w:bottom w:w="70" w:type="dxa"/>
+              <w:left w:w="100" w:type="dxa"/>
+              <w:right w:w="100" w:type="dxa"/>
+            </w:tcMar>
+          </w:tcPr>
+          <w:p>
+            <w:pPr>
+              <w:spacing w:before="40" w:after="40"/>
+            </w:pPr>
+            <w:r>
+              <w:rPr>
+                <w:rFonts w:ascii="Arial" w:hAnsi="Arial"/>
+                <w:b/>
+                <w:color w:val="2D3748"/>
+                <w:sz w:val="19"/>
+              </w:rPr>
+              <w:t>Observed Value</w:t>
+            </w:r>
+          </w:p>
+        </w:tc>
+        <w:tc>
+          <w:tcPr>
+            <w:tcW w:type="dxa" w:w="6768"/>
+            <w:shd w:fill="FFFFFF"/>
+            <w:tcMar>
+              <w:top w:w="70" w:type="dxa"/>
+              <w:bottom w:w="70" w:type="dxa"/>
+              <w:left w:w="100" w:type="dxa"/>
+              <w:right w:w="100" w:type="dxa"/>
+            </w:tcMar>
+          </w:tcPr>
+          <w:p>
+            <w:pPr>
+              <w:spacing w:before="40" w:after="40"/>
+            </w:pPr>
+            <w:r>
+              <w:rPr>
+                <w:rFonts w:ascii="Arial" w:hAnsi="Arial"/>
+                <w:sz w:val="19"/>
+              </w:rPr>
+              <w:t>Low / insufficient grease</w:t>
+            </w:r>
+          </w:p>
+        </w:tc>
+      </w:tr>
+      <w:tr>
+        <w:tc>
+          <w:tcPr>
+            <w:tcW w:type="dxa" w:w="2592"/>
+            <w:shd w:fill="EDF2F7"/>
+            <w:tcMar>
+              <w:top w:w="70" w:type="dxa"/>
+              <w:bottom w:w="70" w:type="dxa"/>
+              <w:left w:w="100" w:type="dxa"/>
+              <w:right w:w="100" w:type="dxa"/>
+            </w:tcMar>
+          </w:tcPr>
+          <w:p>
+            <w:pPr>
+              <w:spacing w:before="40" w:after="40"/>
+            </w:pPr>
+            <w:r>
+              <w:rPr>
+                <w:rFonts w:ascii="Arial" w:hAnsi="Arial"/>
+                <w:b/>
+                <w:color w:val="2D3748"/>
+                <w:sz w:val="19"/>
+              </w:rPr>
+              <w:t>Limit</w:t>
+            </w:r>
+          </w:p>
+        </w:tc>
+        <w:tc>
+          <w:tcPr>
+            <w:tcW w:type="dxa" w:w="6768"/>
+            <w:shd w:fill="FFFFFF"/>
+            <w:tcMar>
+              <w:top w:w="70" w:type="dxa"/>
+              <w:bottom w:w="70" w:type="dxa"/>
+              <w:left w:w="100" w:type="dxa"/>
+              <w:right w:w="100" w:type="dxa"/>
+            </w:tcMar>
+          </w:tcPr>
+          <w:p>
+            <w:pPr>
+              <w:spacing w:before="40" w:after="40"/>
+            </w:pPr>
+            <w:r>
+              <w:rPr>
+                <w:rFonts w:ascii="Arial" w:hAnsi="Arial"/>
+                <w:sz w:val="19"/>
+              </w:rPr>
+              <w:t>Adequate lubrication required</w:t>
+            </w:r>
+          </w:p>
+        </w:tc>
+      </w:tr>
+      <w:tr>
+        <w:tc>
+          <w:tcPr>
+            <w:tcW w:type="dxa" w:w="2592"/>
+            <w:shd w:fill="EDF2F7"/>
+            <w:tcMar>
+              <w:top w:w="70" w:type="dxa"/>
+              <w:bottom w:w="70" w:type="dxa"/>
+              <w:left w:w="100" w:type="dxa"/>
+              <w:right w:w="100" w:type="dxa"/>
+            </w:tcMar>
+          </w:tcPr>
+          <w:p>
+            <w:pPr>
+              <w:spacing w:before="40" w:after="40"/>
+            </w:pPr>
+            <w:r>
+              <w:rPr>
+                <w:rFonts w:ascii="Arial" w:hAnsi="Arial"/>
+                <w:b/>
+                <w:color w:val="2D3748"/>
+                <w:sz w:val="19"/>
+              </w:rPr>
+              <w:t>Severity</w:t>
+            </w:r>
+          </w:p>
+        </w:tc>
+        <w:tc>
+          <w:tcPr>
+            <w:tcW w:type="dxa" w:w="6768"/>
+            <w:shd w:fill="FFFFFF"/>
+            <w:tcMar>
+              <w:top w:w="70" w:type="dxa"/>
+              <w:bottom w:w="70" w:type="dxa"/>
+              <w:left w:w="100" w:type="dxa"/>
+              <w:right w:w="100" w:type="dxa"/>
+            </w:tcMar>
+          </w:tcPr>
+          <w:p>
+            <w:pPr>
+              <w:spacing w:before="40" w:after="40"/>
+            </w:pPr>
+            <w:r>
+              <w:rPr>
+                <w:rFonts w:ascii="Arial" w:hAnsi="Arial"/>
+                <w:sz w:val="19"/>
+              </w:rPr>
+              <w:t>Abnormal</w:t>
+            </w:r>
+          </w:p>
+        </w:tc>
+      </w:tr>
+      <w:tr>
+        <w:tc>
+          <w:tcPr>
+            <w:tcW w:type="dxa" w:w="2592"/>
+            <w:shd w:fill="EDF2F7"/>
+            <w:tcMar>
+              <w:top w:w="70" w:type="dxa"/>
+              <w:bottom w:w="70" w:type="dxa"/>
+              <w:left w:w="100" w:type="dxa"/>
+              <w:right w:w="100" w:type="dxa"/>
+            </w:tcMar>
+          </w:tcPr>
+          <w:p>
+            <w:pPr>
+              <w:spacing w:before="40" w:after="40"/>
+            </w:pPr>
+            <w:r>
+              <w:rPr>
+                <w:rFonts w:ascii="Arial" w:hAnsi="Arial"/>
+                <w:b/>
+                <w:color w:val="2D3748"/>
+                <w:sz w:val="19"/>
+              </w:rPr>
+              <w:t>Evidence</w:t>
+            </w:r>
+          </w:p>
+        </w:tc>
+        <w:tc>
+          <w:tcPr>
+            <w:tcW w:type="dxa" w:w="6768"/>
+            <w:shd w:fill="FFFFFF"/>
+            <w:tcMar>
+              <w:top w:w="70" w:type="dxa"/>
+              <w:bottom w:w="70" w:type="dxa"/>
+              <w:left w:w="100" w:type="dxa"/>
+              <w:right w:w="100" w:type="dxa"/>
+            </w:tcMar>
+          </w:tcPr>
+          <w:p>
+            <w:pPr>
+              <w:spacing w:before="40" w:after="40"/>
+            </w:pPr>
+            <w:r>
+              <w:rPr>
+                <w:rFonts w:ascii="Arial" w:hAnsi="Arial"/>
+                <w:sz w:val="19"/>
+              </w:rPr>
+              <w:t>Low / insufficient grease observed</w:t>
+            </w:r>
+          </w:p>
+        </w:tc>
+      </w:tr>
+    </w:tbl>
+    <w:p>
+      <w:pPr>
+        <w:spacing w:before="0" w:after="120"/>
+      </w:pPr>
+    </w:p>
+    <w:p>
+      <w:pPr>
+        <w:keepNext/>
+        <w:spacing w:before="120" w:after="80"/>
+      </w:pPr>
+      <w:r>
+        <w:rPr>
+          <w:rFonts w:ascii="Arial" w:hAnsi="Arial"/>
+          <w:b/>
+          <w:color w:val="2D3748"/>
+          <w:sz w:val="22"/>
+        </w:rPr>
+        <w:t>Finding 4</w:t>
+      </w:r>
+    </w:p>
+    <w:tbl>
+      <w:tblPr>
+        <w:tblW w:type="auto" w:w="0"/>
+        <w:jc w:val="center"/>
+        <w:tblLayout w:type="fixed"/>
+        <w:tblLook w:firstColumn="1" w:firstRow="1" w:lastColumn="0" w:lastRow="0" w:noHBand="0" w:noVBand="1" w:val="04A0"/>
+      </w:tblPr>
+      <w:tblGrid>
+        <w:gridCol w:w="4680"/>
+        <w:gridCol w:w="4680"/>
+      </w:tblGrid>
+      <w:tr>
+        <w:tc>
+          <w:tcPr>
+            <w:tcW w:type="dxa" w:w="2592"/>
+            <w:shd w:fill="EDF2F7"/>
+            <w:tcMar>
+              <w:top w:w="70" w:type="dxa"/>
+              <w:bottom w:w="70" w:type="dxa"/>
+              <w:left w:w="100" w:type="dxa"/>
+              <w:right w:w="100" w:type="dxa"/>
+            </w:tcMar>
+          </w:tcPr>
+          <w:p>
+            <w:pPr>
+              <w:spacing w:before="40" w:after="40"/>
+            </w:pPr>
+            <w:r>
+              <w:rPr>
+                <w:rFonts w:ascii="Arial" w:hAnsi="Arial"/>
+                <w:b/>
+                <w:color w:val="2D3748"/>
+                <w:sz w:val="19"/>
+              </w:rPr>
+              <w:t>Finding</w:t>
+            </w:r>
+          </w:p>
+        </w:tc>
+        <w:tc>
+          <w:tcPr>
+            <w:tcW w:type="dxa" w:w="6768"/>
+            <w:shd w:fill="FFFFFF"/>
+            <w:tcMar>
+              <w:top w:w="70" w:type="dxa"/>
+              <w:bottom w:w="70" w:type="dxa"/>
+              <w:left w:w="100" w:type="dxa"/>
+              <w:right w:w="100" w:type="dxa"/>
+            </w:tcMar>
+          </w:tcPr>
+          <w:p>
+            <w:pPr>
+              <w:spacing w:before="40" w:after="40"/>
+            </w:pPr>
+            <w:r>
+              <w:rPr>
+                <w:rFonts w:ascii="Arial" w:hAnsi="Arial"/>
+                <w:sz w:val="19"/>
+              </w:rPr>
+              <w:t>No oil leakage was observed.</w:t>
+            </w:r>
+          </w:p>
+        </w:tc>
+      </w:tr>
+      <w:tr>
+        <w:tc>
+          <w:tcPr>
+            <w:tcW w:type="dxa" w:w="2592"/>
+            <w:shd w:fill="EDF2F7"/>
+            <w:tcMar>
+              <w:top w:w="70" w:type="dxa"/>
+              <w:bottom w:w="70" w:type="dxa"/>
+              <w:left w:w="100" w:type="dxa"/>
+              <w:right w:w="100" w:type="dxa"/>
+            </w:tcMar>
+          </w:tcPr>
+          <w:p>
+            <w:pPr>
+              <w:spacing w:before="40" w:after="40"/>
+            </w:pPr>
+            <w:r>
+              <w:rPr>
+                <w:rFonts w:ascii="Arial" w:hAnsi="Arial"/>
+                <w:b/>
+                <w:color w:val="2D3748"/>
+                <w:sz w:val="19"/>
+              </w:rPr>
+              <w:t>Equipment</w:t>
+            </w:r>
+          </w:p>
+        </w:tc>
+        <w:tc>
+          <w:tcPr>
+            <w:tcW w:type="dxa" w:w="6768"/>
+            <w:shd w:fill="FFFFFF"/>
+            <w:tcMar>
+              <w:top w:w="70" w:type="dxa"/>
+              <w:bottom w:w="70" w:type="dxa"/>
+              <w:left w:w="100" w:type="dxa"/>
+              <w:right w:w="100" w:type="dxa"/>
+            </w:tcMar>
+          </w:tcPr>
+          <w:p>
+            <w:pPr>
+              <w:spacing w:before="40" w:after="40"/>
+            </w:pPr>
+            <w:r>
+              <w:rPr>
+                <w:rFonts w:ascii="Arial" w:hAnsi="Arial"/>
+                <w:sz w:val="19"/>
+              </w:rPr>
+              <w:t>P-101 Process Pump</w:t>
+            </w:r>
+          </w:p>
+        </w:tc>
+      </w:tr>
+      <w:tr>
+        <w:tc>
+          <w:tcPr>
+            <w:tcW w:type="dxa" w:w="2592"/>
+            <w:shd w:fill="EDF2F7"/>
+            <w:tcMar>
+              <w:top w:w="70" w:type="dxa"/>
+              <w:bottom w:w="70" w:type="dxa"/>
+              <w:left w:w="100" w:type="dxa"/>
+              <w:right w:w="100" w:type="dxa"/>
+            </w:tcMar>
+          </w:tcPr>
+          <w:p>
+            <w:pPr>
+              <w:spacing w:before="40" w:after="40"/>
+            </w:pPr>
+            <w:r>
+              <w:rPr>
+                <w:rFonts w:ascii="Arial" w:hAnsi="Arial"/>
+                <w:b/>
+                <w:color w:val="2D3748"/>
+                <w:sz w:val="19"/>
+              </w:rPr>
+              <w:t>Observed Value</w:t>
+            </w:r>
+          </w:p>
+        </w:tc>
+        <w:tc>
+          <w:tcPr>
+            <w:tcW w:type="dxa" w:w="6768"/>
+            <w:shd w:fill="FFFFFF"/>
+            <w:tcMar>
+              <w:top w:w="70" w:type="dxa"/>
+              <w:bottom w:w="70" w:type="dxa"/>
+              <w:left w:w="100" w:type="dxa"/>
+              <w:right w:w="100" w:type="dxa"/>
+            </w:tcMar>
+          </w:tcPr>
+          <w:p>
+            <w:pPr>
+              <w:spacing w:before="40" w:after="40"/>
+            </w:pPr>
+            <w:r>
+              <w:rPr>
+                <w:rFonts w:ascii="Arial" w:hAnsi="Arial"/>
+                <w:sz w:val="19"/>
+              </w:rPr>
+              <w:t>No visible leakage</w:t>
+            </w:r>
+          </w:p>
+        </w:tc>
+      </w:tr>
+      <w:tr>
+        <w:tc>
+          <w:tcPr>
+            <w:tcW w:type="dxa" w:w="2592"/>
+            <w:shd w:fill="EDF2F7"/>
+            <w:tcMar>
+              <w:top w:w="70" w:type="dxa"/>
+              <w:bottom w:w="70" w:type="dxa"/>
+              <w:left w:w="100" w:type="dxa"/>
+              <w:right w:w="100" w:type="dxa"/>
+            </w:tcMar>
+          </w:tcPr>
+          <w:p>
+            <w:pPr>
+              <w:spacing w:before="40" w:after="40"/>
+            </w:pPr>
+            <w:r>
+              <w:rPr>
+                <w:rFonts w:ascii="Arial" w:hAnsi="Arial"/>
+                <w:b/>
+                <w:color w:val="2D3748"/>
+                <w:sz w:val="19"/>
+              </w:rPr>
+              <w:t>Limit</w:t>
+            </w:r>
+          </w:p>
+        </w:tc>
+        <w:tc>
+          <w:tcPr>
+            <w:tcW w:type="dxa" w:w="6768"/>
+            <w:shd w:fill="FFFFFF"/>
+            <w:tcMar>
+              <w:top w:w="70" w:type="dxa"/>
+              <w:bottom w:w="70" w:type="dxa"/>
+              <w:left w:w="100" w:type="dxa"/>
+              <w:right w:w="100" w:type="dxa"/>
+            </w:tcMar>
+          </w:tcPr>
+          <w:p>
+            <w:pPr>
+              <w:spacing w:before="40" w:after="40"/>
+            </w:pPr>
+            <w:r>
+              <w:rPr>
+                <w:rFonts w:ascii="Arial" w:hAnsi="Arial"/>
+                <w:sz w:val="19"/>
+              </w:rPr>
+              <w:t>No visible leakage</w:t>
+            </w:r>
+          </w:p>
+        </w:tc>
+      </w:tr>
+      <w:tr>
+        <w:tc>
+          <w:tcPr>
+            <w:tcW w:type="dxa" w:w="2592"/>
+            <w:shd w:fill="EDF2F7"/>
+            <w:tcMar>
+              <w:top w:w="70" w:type="dxa"/>
+              <w:bottom w:w="70" w:type="dxa"/>
+              <w:left w:w="100" w:type="dxa"/>
+              <w:right w:w="100" w:type="dxa"/>
+            </w:tcMar>
+          </w:tcPr>
+          <w:p>
+            <w:pPr>
+              <w:spacing w:before="40" w:after="40"/>
+            </w:pPr>
+            <w:r>
+              <w:rPr>
+                <w:rFonts w:ascii="Arial" w:hAnsi="Arial"/>
+                <w:b/>
+                <w:color w:val="2D3748"/>
+                <w:sz w:val="19"/>
+              </w:rPr>
+              <w:t>Severity</w:t>
+            </w:r>
+          </w:p>
+        </w:tc>
+        <w:tc>
+          <w:tcPr>
+            <w:tcW w:type="dxa" w:w="6768"/>
+            <w:shd w:fill="FFFFFF"/>
+            <w:tcMar>
+              <w:top w:w="70" w:type="dxa"/>
+              <w:bottom w:w="70" w:type="dxa"/>
+              <w:left w:w="100" w:type="dxa"/>
+              <w:right w:w="100" w:type="dxa"/>
+            </w:tcMar>
+          </w:tcPr>
+          <w:p>
+            <w:pPr>
+              <w:spacing w:before="40" w:after="40"/>
+            </w:pPr>
+            <w:r>
+              <w:rPr>
+                <w:rFonts w:ascii="Arial" w:hAnsi="Arial"/>
+                <w:sz w:val="19"/>
+              </w:rPr>
+              <w:t>Normal</w:t>
+            </w:r>
+          </w:p>
+        </w:tc>
+      </w:tr>
+      <w:tr>
+        <w:tc>
+          <w:tcPr>
+            <w:tcW w:type="dxa" w:w="2592"/>
+            <w:shd w:fill="EDF2F7"/>
+            <w:tcMar>
+              <w:top w:w="70" w:type="dxa"/>
+              <w:bottom w:w="70" w:type="dxa"/>
+              <w:left w:w="100" w:type="dxa"/>
+              <w:right w:w="100" w:type="dxa"/>
+            </w:tcMar>
+          </w:tcPr>
+          <w:p>
+            <w:pPr>
+              <w:spacing w:before="40" w:after="40"/>
+            </w:pPr>
+            <w:r>
+              <w:rPr>
+                <w:rFonts w:ascii="Arial" w:hAnsi="Arial"/>
+                <w:b/>
+                <w:color w:val="2D3748"/>
+                <w:sz w:val="19"/>
+              </w:rPr>
+              <w:t>Evidence</w:t>
+            </w:r>
+          </w:p>
+        </w:tc>
+        <w:tc>
+          <w:tcPr>
+            <w:tcW w:type="dxa" w:w="6768"/>
+            <w:shd w:fill="FFFFFF"/>
+            <w:tcMar>
+              <w:top w:w="70" w:type="dxa"/>
+              <w:bottom w:w="70" w:type="dxa"/>
+              <w:left w:w="100" w:type="dxa"/>
+              <w:right w:w="100" w:type="dxa"/>
+            </w:tcMar>
+          </w:tcPr>
+          <w:p>
+            <w:pPr>
+              <w:spacing w:before="40" w:after="40"/>
+            </w:pPr>
+            <w:r>
+              <w:rPr>
+                <w:rFonts w:ascii="Arial" w:hAnsi="Arial"/>
+                <w:sz w:val="19"/>
+              </w:rPr>
+              <w:t>No visible leakage</w:t>
+            </w:r>
+          </w:p>
+        </w:tc>
+      </w:tr>
+    </w:tbl>
+    <w:p>
+      <w:pPr>
+        <w:spacing w:before="0" w:after="120"/>
+      </w:pPr>
     </w:p>
     <w:p>
       <w:pPr>
@@ -137,7 +1501,7 @@
           <w:rFonts w:ascii="Arial" w:hAnsi="Arial"/>
           <w:sz w:val="20"/>
         </w:rPr>
-        <w:t>Technical analysis is unavailable based on the supplied SOP evidence.</w:t>
+        <w:t>Evaluation was performed by correlating observed parameters against standard operating procedures (Demo_Maintenance_SOP.pdf). Assessment analysis indicates: Bearing temperature exceeded the normal operating limit, which may indicate a potential issue with the bearing assembly or lubrication condition.</w:t>
       </w:r>
     </w:p>
     <w:p>
@@ -192,7 +1556,7 @@
         <w:tc>
           <w:tcPr>
             <w:tcW w:type="dxa" w:w="6768"/>
-            <w:shd w:fill="F7FAFC"/>
+            <w:shd w:fill="FEEBC8"/>
             <w:tcMar>
               <w:top w:w="80" w:type="dxa"/>
               <w:bottom w:w="80" w:type="dxa"/>
@@ -205,9 +1569,10 @@
               <w:rPr>
                 <w:rFonts w:ascii="Arial" w:hAnsi="Arial"/>
                 <w:b/>
+                <w:color w:val="B7791F"/>
                 <w:sz w:val="22"/>
               </w:rPr>
-              <w:t>Not Determined</w:t>
+              <w:t>MEDIUM</w:t>
             </w:r>
           </w:p>
         </w:tc>
@@ -252,7 +1617,7 @@
                 <w:rFonts w:ascii="Arial" w:hAnsi="Arial"/>
                 <w:sz w:val="19"/>
               </w:rPr>
-              <w:t>No significant inspection findings were detected in the report.</w:t>
+              <w:t>Bearing temperature exceeded the normal operating limit, which may indicate a potential issue with the bearing assembly or lubrication condition.</w:t>
             </w:r>
           </w:p>
         </w:tc>
@@ -310,7 +1675,7 @@
                 <w:color w:val="2B6CB0"/>
                 <w:sz w:val="20"/>
               </w:rPr>
-              <w:t>Continue standard operating and inspection schedule.</w:t>
+              <w:t>Record the observed temperature and inspect the bearing assembly, lubrication condition, and check for abnormal vibration. Insufficient SOP evidence is available to provide a validated recommendation. Insufficient SOP evidence is available to provide a validated recommendation. Insufficient SOP evidence is available to provide a validated recommendation.</w:t>
             </w:r>
           </w:p>
         </w:tc>
@@ -338,14 +1703,23 @@
     </w:p>
     <w:p>
       <w:pPr>
-        <w:spacing w:after="160"/>
+        <w:spacing w:after="80"/>
+        <w:ind w:left="360"/>
       </w:pPr>
       <w:r>
         <w:rPr>
           <w:rFonts w:ascii="Arial" w:hAnsi="Arial"/>
-          <w:i/>
+          <w:b/>
+          <w:sz w:val="19"/>
         </w:rPr>
-        <w:t>No specific SOP references cited.</w:t>
+        <w:t xml:space="preserve">[1] </w:t>
+      </w:r>
+      <w:r>
+        <w:rPr>
+          <w:rFonts w:ascii="Arial" w:hAnsi="Arial"/>
+          <w:sz w:val="19"/>
+        </w:rPr>
+        <w:t>Filename: Demo_Maintenance_SOP.pdf | Page: 1 | Chunk Index: 0 | Document ID: c2fd4c4f-8d4e-406e-9bb2-7b3c6e94d9b5</w:t>
       </w:r>
     </w:p>
     <w:p>

</xml_diff>

<commit_message>
feat: integrate document reporting services and update project infrastructure configurations
</commit_message>
<xml_diff>
--- a/backend/generated/Approval_Note.docx
+++ b/backend/generated/Approval_Note.docx
@@ -56,7 +56,7 @@
           <w:rFonts w:ascii="Arial" w:hAnsi="Arial"/>
           <w:sz w:val="21"/>
         </w:rPr>
-        <w:t>Inspection Report Analysis and Approval Recommendation — 6de192f1-9978-47bf-90d1-863579beb839</w:t>
+        <w:t>Inspection Report Analysis and Approval Recommendation — 127a43a0-a49f-434e-8deb-2fb106d1f599</w:t>
       </w:r>
     </w:p>
     <w:p>
@@ -83,7 +83,7 @@
           <w:rFonts w:ascii="Arial" w:hAnsi="Arial"/>
           <w:sz w:val="20"/>
         </w:rPr>
-        <w:t>An industrial inspection identified 0 finding(s) . Operational parameters were recorded during standard inspection routines and evaluated against documented standard operating procedures (SOPs) to produce this assessment.</w:t>
+        <w:t>An industrial inspection identified 5 finding(s) on P-101 Process Pump. Operational parameters were recorded during standard inspection routines and evaluated against documented standard operating procedures (SOPs) to produce this assessment.</w:t>
       </w:r>
     </w:p>
     <w:p>
@@ -103,15 +103,1723 @@
     </w:p>
     <w:p>
       <w:pPr>
-        <w:spacing w:after="160"/>
+        <w:keepNext/>
+        <w:spacing w:before="120" w:after="80"/>
       </w:pPr>
       <w:r>
         <w:rPr>
           <w:rFonts w:ascii="Arial" w:hAnsi="Arial"/>
-          <w:i/>
+          <w:b/>
+          <w:color w:val="2D3748"/>
+          <w:sz w:val="22"/>
         </w:rPr>
-        <w:t>No inspection findings recorded.</w:t>
+        <w:t>Finding 1</w:t>
       </w:r>
+    </w:p>
+    <w:tbl>
+      <w:tblPr>
+        <w:tblW w:type="auto" w:w="0"/>
+        <w:jc w:val="center"/>
+        <w:tblLayout w:type="fixed"/>
+        <w:tblLook w:firstColumn="1" w:firstRow="1" w:lastColumn="0" w:lastRow="0" w:noHBand="0" w:noVBand="1" w:val="04A0"/>
+      </w:tblPr>
+      <w:tblGrid>
+        <w:gridCol w:w="4680"/>
+        <w:gridCol w:w="4680"/>
+      </w:tblGrid>
+      <w:tr>
+        <w:tc>
+          <w:tcPr>
+            <w:tcW w:type="dxa" w:w="2592"/>
+            <w:shd w:fill="EDF2F7"/>
+            <w:tcMar>
+              <w:top w:w="70" w:type="dxa"/>
+              <w:bottom w:w="70" w:type="dxa"/>
+              <w:left w:w="100" w:type="dxa"/>
+              <w:right w:w="100" w:type="dxa"/>
+            </w:tcMar>
+          </w:tcPr>
+          <w:p>
+            <w:pPr>
+              <w:spacing w:before="40" w:after="40"/>
+            </w:pPr>
+            <w:r>
+              <w:rPr>
+                <w:rFonts w:ascii="Arial" w:hAnsi="Arial"/>
+                <w:b/>
+                <w:color w:val="2D3748"/>
+                <w:sz w:val="19"/>
+              </w:rPr>
+              <w:t>Finding</w:t>
+            </w:r>
+          </w:p>
+        </w:tc>
+        <w:tc>
+          <w:tcPr>
+            <w:tcW w:type="dxa" w:w="6768"/>
+            <w:shd w:fill="FFFFFF"/>
+            <w:tcMar>
+              <w:top w:w="70" w:type="dxa"/>
+              <w:bottom w:w="70" w:type="dxa"/>
+              <w:left w:w="100" w:type="dxa"/>
+              <w:right w:w="100" w:type="dxa"/>
+            </w:tcMar>
+          </w:tcPr>
+          <w:p>
+            <w:pPr>
+              <w:spacing w:before="40" w:after="40"/>
+            </w:pPr>
+            <w:r>
+              <w:rPr>
+                <w:rFonts w:ascii="Arial" w:hAnsi="Arial"/>
+                <w:sz w:val="19"/>
+              </w:rPr>
+              <w:t>Bearing temperature exceeded the normal operating limit.</w:t>
+            </w:r>
+          </w:p>
+        </w:tc>
+      </w:tr>
+      <w:tr>
+        <w:tc>
+          <w:tcPr>
+            <w:tcW w:type="dxa" w:w="2592"/>
+            <w:shd w:fill="EDF2F7"/>
+            <w:tcMar>
+              <w:top w:w="70" w:type="dxa"/>
+              <w:bottom w:w="70" w:type="dxa"/>
+              <w:left w:w="100" w:type="dxa"/>
+              <w:right w:w="100" w:type="dxa"/>
+            </w:tcMar>
+          </w:tcPr>
+          <w:p>
+            <w:pPr>
+              <w:spacing w:before="40" w:after="40"/>
+            </w:pPr>
+            <w:r>
+              <w:rPr>
+                <w:rFonts w:ascii="Arial" w:hAnsi="Arial"/>
+                <w:b/>
+                <w:color w:val="2D3748"/>
+                <w:sz w:val="19"/>
+              </w:rPr>
+              <w:t>Equipment</w:t>
+            </w:r>
+          </w:p>
+        </w:tc>
+        <w:tc>
+          <w:tcPr>
+            <w:tcW w:type="dxa" w:w="6768"/>
+            <w:shd w:fill="FFFFFF"/>
+            <w:tcMar>
+              <w:top w:w="70" w:type="dxa"/>
+              <w:bottom w:w="70" w:type="dxa"/>
+              <w:left w:w="100" w:type="dxa"/>
+              <w:right w:w="100" w:type="dxa"/>
+            </w:tcMar>
+          </w:tcPr>
+          <w:p>
+            <w:pPr>
+              <w:spacing w:before="40" w:after="40"/>
+            </w:pPr>
+            <w:r>
+              <w:rPr>
+                <w:rFonts w:ascii="Arial" w:hAnsi="Arial"/>
+                <w:sz w:val="19"/>
+              </w:rPr>
+              <w:t>P-101 Process Pump</w:t>
+            </w:r>
+          </w:p>
+        </w:tc>
+      </w:tr>
+      <w:tr>
+        <w:tc>
+          <w:tcPr>
+            <w:tcW w:type="dxa" w:w="2592"/>
+            <w:shd w:fill="EDF2F7"/>
+            <w:tcMar>
+              <w:top w:w="70" w:type="dxa"/>
+              <w:bottom w:w="70" w:type="dxa"/>
+              <w:left w:w="100" w:type="dxa"/>
+              <w:right w:w="100" w:type="dxa"/>
+            </w:tcMar>
+          </w:tcPr>
+          <w:p>
+            <w:pPr>
+              <w:spacing w:before="40" w:after="40"/>
+            </w:pPr>
+            <w:r>
+              <w:rPr>
+                <w:rFonts w:ascii="Arial" w:hAnsi="Arial"/>
+                <w:b/>
+                <w:color w:val="2D3748"/>
+                <w:sz w:val="19"/>
+              </w:rPr>
+              <w:t>Observed Value</w:t>
+            </w:r>
+          </w:p>
+        </w:tc>
+        <w:tc>
+          <w:tcPr>
+            <w:tcW w:type="dxa" w:w="6768"/>
+            <w:shd w:fill="FFFFFF"/>
+            <w:tcMar>
+              <w:top w:w="70" w:type="dxa"/>
+              <w:bottom w:w="70" w:type="dxa"/>
+              <w:left w:w="100" w:type="dxa"/>
+              <w:right w:w="100" w:type="dxa"/>
+            </w:tcMar>
+          </w:tcPr>
+          <w:p>
+            <w:pPr>
+              <w:spacing w:before="40" w:after="40"/>
+            </w:pPr>
+            <w:r>
+              <w:rPr>
+                <w:rFonts w:ascii="Arial" w:hAnsi="Arial"/>
+                <w:sz w:val="19"/>
+              </w:rPr>
+              <w:t>92 °C</w:t>
+            </w:r>
+          </w:p>
+        </w:tc>
+      </w:tr>
+      <w:tr>
+        <w:tc>
+          <w:tcPr>
+            <w:tcW w:type="dxa" w:w="2592"/>
+            <w:shd w:fill="EDF2F7"/>
+            <w:tcMar>
+              <w:top w:w="70" w:type="dxa"/>
+              <w:bottom w:w="70" w:type="dxa"/>
+              <w:left w:w="100" w:type="dxa"/>
+              <w:right w:w="100" w:type="dxa"/>
+            </w:tcMar>
+          </w:tcPr>
+          <w:p>
+            <w:pPr>
+              <w:spacing w:before="40" w:after="40"/>
+            </w:pPr>
+            <w:r>
+              <w:rPr>
+                <w:rFonts w:ascii="Arial" w:hAnsi="Arial"/>
+                <w:b/>
+                <w:color w:val="2D3748"/>
+                <w:sz w:val="19"/>
+              </w:rPr>
+              <w:t>Limit</w:t>
+            </w:r>
+          </w:p>
+        </w:tc>
+        <w:tc>
+          <w:tcPr>
+            <w:tcW w:type="dxa" w:w="6768"/>
+            <w:shd w:fill="FFFFFF"/>
+            <w:tcMar>
+              <w:top w:w="70" w:type="dxa"/>
+              <w:bottom w:w="70" w:type="dxa"/>
+              <w:left w:w="100" w:type="dxa"/>
+              <w:right w:w="100" w:type="dxa"/>
+            </w:tcMar>
+          </w:tcPr>
+          <w:p>
+            <w:pPr>
+              <w:spacing w:before="40" w:after="40"/>
+            </w:pPr>
+            <w:r>
+              <w:rPr>
+                <w:rFonts w:ascii="Arial" w:hAnsi="Arial"/>
+                <w:sz w:val="19"/>
+              </w:rPr>
+              <w:t>up to 80 °C</w:t>
+            </w:r>
+          </w:p>
+        </w:tc>
+      </w:tr>
+      <w:tr>
+        <w:tc>
+          <w:tcPr>
+            <w:tcW w:type="dxa" w:w="2592"/>
+            <w:shd w:fill="EDF2F7"/>
+            <w:tcMar>
+              <w:top w:w="70" w:type="dxa"/>
+              <w:bottom w:w="70" w:type="dxa"/>
+              <w:left w:w="100" w:type="dxa"/>
+              <w:right w:w="100" w:type="dxa"/>
+            </w:tcMar>
+          </w:tcPr>
+          <w:p>
+            <w:pPr>
+              <w:spacing w:before="40" w:after="40"/>
+            </w:pPr>
+            <w:r>
+              <w:rPr>
+                <w:rFonts w:ascii="Arial" w:hAnsi="Arial"/>
+                <w:b/>
+                <w:color w:val="2D3748"/>
+                <w:sz w:val="19"/>
+              </w:rPr>
+              <w:t>Severity</w:t>
+            </w:r>
+          </w:p>
+        </w:tc>
+        <w:tc>
+          <w:tcPr>
+            <w:tcW w:type="dxa" w:w="6768"/>
+            <w:shd w:fill="FFFFFF"/>
+            <w:tcMar>
+              <w:top w:w="70" w:type="dxa"/>
+              <w:bottom w:w="70" w:type="dxa"/>
+              <w:left w:w="100" w:type="dxa"/>
+              <w:right w:w="100" w:type="dxa"/>
+            </w:tcMar>
+          </w:tcPr>
+          <w:p>
+            <w:pPr>
+              <w:spacing w:before="40" w:after="40"/>
+            </w:pPr>
+            <w:r>
+              <w:rPr>
+                <w:rFonts w:ascii="Arial" w:hAnsi="Arial"/>
+                <w:sz w:val="19"/>
+              </w:rPr>
+              <w:t>ABNORMAL</w:t>
+            </w:r>
+          </w:p>
+        </w:tc>
+      </w:tr>
+      <w:tr>
+        <w:tc>
+          <w:tcPr>
+            <w:tcW w:type="dxa" w:w="2592"/>
+            <w:shd w:fill="EDF2F7"/>
+            <w:tcMar>
+              <w:top w:w="70" w:type="dxa"/>
+              <w:bottom w:w="70" w:type="dxa"/>
+              <w:left w:w="100" w:type="dxa"/>
+              <w:right w:w="100" w:type="dxa"/>
+            </w:tcMar>
+          </w:tcPr>
+          <w:p>
+            <w:pPr>
+              <w:spacing w:before="40" w:after="40"/>
+            </w:pPr>
+            <w:r>
+              <w:rPr>
+                <w:rFonts w:ascii="Arial" w:hAnsi="Arial"/>
+                <w:b/>
+                <w:color w:val="2D3748"/>
+                <w:sz w:val="19"/>
+              </w:rPr>
+              <w:t>Evidence</w:t>
+            </w:r>
+          </w:p>
+        </w:tc>
+        <w:tc>
+          <w:tcPr>
+            <w:tcW w:type="dxa" w:w="6768"/>
+            <w:shd w:fill="FFFFFF"/>
+            <w:tcMar>
+              <w:top w:w="70" w:type="dxa"/>
+              <w:bottom w:w="70" w:type="dxa"/>
+              <w:left w:w="100" w:type="dxa"/>
+              <w:right w:w="100" w:type="dxa"/>
+            </w:tcMar>
+          </w:tcPr>
+          <w:p>
+            <w:pPr>
+              <w:spacing w:before="40" w:after="40"/>
+            </w:pPr>
+            <w:r>
+              <w:rPr>
+                <w:rFonts w:ascii="Arial" w:hAnsi="Arial"/>
+                <w:sz w:val="19"/>
+              </w:rPr>
+              <w:t>The applicable synthetic maintenance SOP states that normal bearing operating temperature is up to 80 °C. The reading therefore exceeds the documented limit by 12 °C.</w:t>
+            </w:r>
+          </w:p>
+        </w:tc>
+      </w:tr>
+    </w:tbl>
+    <w:p>
+      <w:pPr>
+        <w:spacing w:before="0" w:after="120"/>
+      </w:pPr>
+    </w:p>
+    <w:p>
+      <w:pPr>
+        <w:keepNext/>
+        <w:spacing w:before="120" w:after="80"/>
+      </w:pPr>
+      <w:r>
+        <w:rPr>
+          <w:rFonts w:ascii="Arial" w:hAnsi="Arial"/>
+          <w:b/>
+          <w:color w:val="2D3748"/>
+          <w:sz w:val="22"/>
+        </w:rPr>
+        <w:t>Finding 2</w:t>
+      </w:r>
+    </w:p>
+    <w:tbl>
+      <w:tblPr>
+        <w:tblW w:type="auto" w:w="0"/>
+        <w:jc w:val="center"/>
+        <w:tblLayout w:type="fixed"/>
+        <w:tblLook w:firstColumn="1" w:firstRow="1" w:lastColumn="0" w:lastRow="0" w:noHBand="0" w:noVBand="1" w:val="04A0"/>
+      </w:tblPr>
+      <w:tblGrid>
+        <w:gridCol w:w="4680"/>
+        <w:gridCol w:w="4680"/>
+      </w:tblGrid>
+      <w:tr>
+        <w:tc>
+          <w:tcPr>
+            <w:tcW w:type="dxa" w:w="2592"/>
+            <w:shd w:fill="EDF2F7"/>
+            <w:tcMar>
+              <w:top w:w="70" w:type="dxa"/>
+              <w:bottom w:w="70" w:type="dxa"/>
+              <w:left w:w="100" w:type="dxa"/>
+              <w:right w:w="100" w:type="dxa"/>
+            </w:tcMar>
+          </w:tcPr>
+          <w:p>
+            <w:pPr>
+              <w:spacing w:before="40" w:after="40"/>
+            </w:pPr>
+            <w:r>
+              <w:rPr>
+                <w:rFonts w:ascii="Arial" w:hAnsi="Arial"/>
+                <w:b/>
+                <w:color w:val="2D3748"/>
+                <w:sz w:val="19"/>
+              </w:rPr>
+              <w:t>Finding</w:t>
+            </w:r>
+          </w:p>
+        </w:tc>
+        <w:tc>
+          <w:tcPr>
+            <w:tcW w:type="dxa" w:w="6768"/>
+            <w:shd w:fill="FFFFFF"/>
+            <w:tcMar>
+              <w:top w:w="70" w:type="dxa"/>
+              <w:bottom w:w="70" w:type="dxa"/>
+              <w:left w:w="100" w:type="dxa"/>
+              <w:right w:w="100" w:type="dxa"/>
+            </w:tcMar>
+          </w:tcPr>
+          <w:p>
+            <w:pPr>
+              <w:spacing w:before="40" w:after="40"/>
+            </w:pPr>
+            <w:r>
+              <w:rPr>
+                <w:rFonts w:ascii="Arial" w:hAnsi="Arial"/>
+                <w:sz w:val="19"/>
+              </w:rPr>
+              <w:t>Abnormal vibration was recorded.</w:t>
+            </w:r>
+          </w:p>
+        </w:tc>
+      </w:tr>
+      <w:tr>
+        <w:tc>
+          <w:tcPr>
+            <w:tcW w:type="dxa" w:w="2592"/>
+            <w:shd w:fill="EDF2F7"/>
+            <w:tcMar>
+              <w:top w:w="70" w:type="dxa"/>
+              <w:bottom w:w="70" w:type="dxa"/>
+              <w:left w:w="100" w:type="dxa"/>
+              <w:right w:w="100" w:type="dxa"/>
+            </w:tcMar>
+          </w:tcPr>
+          <w:p>
+            <w:pPr>
+              <w:spacing w:before="40" w:after="40"/>
+            </w:pPr>
+            <w:r>
+              <w:rPr>
+                <w:rFonts w:ascii="Arial" w:hAnsi="Arial"/>
+                <w:b/>
+                <w:color w:val="2D3748"/>
+                <w:sz w:val="19"/>
+              </w:rPr>
+              <w:t>Equipment</w:t>
+            </w:r>
+          </w:p>
+        </w:tc>
+        <w:tc>
+          <w:tcPr>
+            <w:tcW w:type="dxa" w:w="6768"/>
+            <w:shd w:fill="FFFFFF"/>
+            <w:tcMar>
+              <w:top w:w="70" w:type="dxa"/>
+              <w:bottom w:w="70" w:type="dxa"/>
+              <w:left w:w="100" w:type="dxa"/>
+              <w:right w:w="100" w:type="dxa"/>
+            </w:tcMar>
+          </w:tcPr>
+          <w:p>
+            <w:pPr>
+              <w:spacing w:before="40" w:after="40"/>
+            </w:pPr>
+            <w:r>
+              <w:rPr>
+                <w:rFonts w:ascii="Arial" w:hAnsi="Arial"/>
+                <w:sz w:val="19"/>
+              </w:rPr>
+              <w:t>P-101 Process Pump</w:t>
+            </w:r>
+          </w:p>
+        </w:tc>
+      </w:tr>
+      <w:tr>
+        <w:tc>
+          <w:tcPr>
+            <w:tcW w:type="dxa" w:w="2592"/>
+            <w:shd w:fill="EDF2F7"/>
+            <w:tcMar>
+              <w:top w:w="70" w:type="dxa"/>
+              <w:bottom w:w="70" w:type="dxa"/>
+              <w:left w:w="100" w:type="dxa"/>
+              <w:right w:w="100" w:type="dxa"/>
+            </w:tcMar>
+          </w:tcPr>
+          <w:p>
+            <w:pPr>
+              <w:spacing w:before="40" w:after="40"/>
+            </w:pPr>
+            <w:r>
+              <w:rPr>
+                <w:rFonts w:ascii="Arial" w:hAnsi="Arial"/>
+                <w:b/>
+                <w:color w:val="2D3748"/>
+                <w:sz w:val="19"/>
+              </w:rPr>
+              <w:t>Observed Value</w:t>
+            </w:r>
+          </w:p>
+        </w:tc>
+        <w:tc>
+          <w:tcPr>
+            <w:tcW w:type="dxa" w:w="6768"/>
+            <w:shd w:fill="FFFFFF"/>
+            <w:tcMar>
+              <w:top w:w="70" w:type="dxa"/>
+              <w:bottom w:w="70" w:type="dxa"/>
+              <w:left w:w="100" w:type="dxa"/>
+              <w:right w:w="100" w:type="dxa"/>
+            </w:tcMar>
+          </w:tcPr>
+          <w:p>
+            <w:pPr>
+              <w:spacing w:before="40" w:after="40"/>
+            </w:pPr>
+            <w:r>
+              <w:rPr>
+                <w:rFonts w:ascii="Arial" w:hAnsi="Arial"/>
+                <w:sz w:val="19"/>
+              </w:rPr>
+              <w:t>6.8 mm/s RMS</w:t>
+            </w:r>
+          </w:p>
+        </w:tc>
+      </w:tr>
+      <w:tr>
+        <w:tc>
+          <w:tcPr>
+            <w:tcW w:type="dxa" w:w="2592"/>
+            <w:shd w:fill="EDF2F7"/>
+            <w:tcMar>
+              <w:top w:w="70" w:type="dxa"/>
+              <w:bottom w:w="70" w:type="dxa"/>
+              <w:left w:w="100" w:type="dxa"/>
+              <w:right w:w="100" w:type="dxa"/>
+            </w:tcMar>
+          </w:tcPr>
+          <w:p>
+            <w:pPr>
+              <w:spacing w:before="40" w:after="40"/>
+            </w:pPr>
+            <w:r>
+              <w:rPr>
+                <w:rFonts w:ascii="Arial" w:hAnsi="Arial"/>
+                <w:b/>
+                <w:color w:val="2D3748"/>
+                <w:sz w:val="19"/>
+              </w:rPr>
+              <w:t>Limit</w:t>
+            </w:r>
+          </w:p>
+        </w:tc>
+        <w:tc>
+          <w:tcPr>
+            <w:tcW w:type="dxa" w:w="6768"/>
+            <w:shd w:fill="FFFFFF"/>
+            <w:tcMar>
+              <w:top w:w="70" w:type="dxa"/>
+              <w:bottom w:w="70" w:type="dxa"/>
+              <w:left w:w="100" w:type="dxa"/>
+              <w:right w:w="100" w:type="dxa"/>
+            </w:tcMar>
+          </w:tcPr>
+          <w:p>
+            <w:pPr>
+              <w:spacing w:before="40" w:after="40"/>
+            </w:pPr>
+            <w:r>
+              <w:rPr>
+                <w:rFonts w:ascii="Arial" w:hAnsi="Arial"/>
+                <w:sz w:val="19"/>
+              </w:rPr>
+              <w:t>up to 4.5 mm/s RMS</w:t>
+            </w:r>
+          </w:p>
+        </w:tc>
+      </w:tr>
+      <w:tr>
+        <w:tc>
+          <w:tcPr>
+            <w:tcW w:type="dxa" w:w="2592"/>
+            <w:shd w:fill="EDF2F7"/>
+            <w:tcMar>
+              <w:top w:w="70" w:type="dxa"/>
+              <w:bottom w:w="70" w:type="dxa"/>
+              <w:left w:w="100" w:type="dxa"/>
+              <w:right w:w="100" w:type="dxa"/>
+            </w:tcMar>
+          </w:tcPr>
+          <w:p>
+            <w:pPr>
+              <w:spacing w:before="40" w:after="40"/>
+            </w:pPr>
+            <w:r>
+              <w:rPr>
+                <w:rFonts w:ascii="Arial" w:hAnsi="Arial"/>
+                <w:b/>
+                <w:color w:val="2D3748"/>
+                <w:sz w:val="19"/>
+              </w:rPr>
+              <w:t>Severity</w:t>
+            </w:r>
+          </w:p>
+        </w:tc>
+        <w:tc>
+          <w:tcPr>
+            <w:tcW w:type="dxa" w:w="6768"/>
+            <w:shd w:fill="FFFFFF"/>
+            <w:tcMar>
+              <w:top w:w="70" w:type="dxa"/>
+              <w:bottom w:w="70" w:type="dxa"/>
+              <w:left w:w="100" w:type="dxa"/>
+              <w:right w:w="100" w:type="dxa"/>
+            </w:tcMar>
+          </w:tcPr>
+          <w:p>
+            <w:pPr>
+              <w:spacing w:before="40" w:after="40"/>
+            </w:pPr>
+            <w:r>
+              <w:rPr>
+                <w:rFonts w:ascii="Arial" w:hAnsi="Arial"/>
+                <w:sz w:val="19"/>
+              </w:rPr>
+              <w:t>ABNORMAL</w:t>
+            </w:r>
+          </w:p>
+        </w:tc>
+      </w:tr>
+      <w:tr>
+        <w:tc>
+          <w:tcPr>
+            <w:tcW w:type="dxa" w:w="2592"/>
+            <w:shd w:fill="EDF2F7"/>
+            <w:tcMar>
+              <w:top w:w="70" w:type="dxa"/>
+              <w:bottom w:w="70" w:type="dxa"/>
+              <w:left w:w="100" w:type="dxa"/>
+              <w:right w:w="100" w:type="dxa"/>
+            </w:tcMar>
+          </w:tcPr>
+          <w:p>
+            <w:pPr>
+              <w:spacing w:before="40" w:after="40"/>
+            </w:pPr>
+            <w:r>
+              <w:rPr>
+                <w:rFonts w:ascii="Arial" w:hAnsi="Arial"/>
+                <w:b/>
+                <w:color w:val="2D3748"/>
+                <w:sz w:val="19"/>
+              </w:rPr>
+              <w:t>Evidence</w:t>
+            </w:r>
+          </w:p>
+        </w:tc>
+        <w:tc>
+          <w:tcPr>
+            <w:tcW w:type="dxa" w:w="6768"/>
+            <w:shd w:fill="FFFFFF"/>
+            <w:tcMar>
+              <w:top w:w="70" w:type="dxa"/>
+              <w:bottom w:w="70" w:type="dxa"/>
+              <w:left w:w="100" w:type="dxa"/>
+              <w:right w:w="100" w:type="dxa"/>
+            </w:tcMar>
+          </w:tcPr>
+          <w:p>
+            <w:pPr>
+              <w:spacing w:before="40" w:after="40"/>
+            </w:pPr>
+            <w:r>
+              <w:rPr>
+                <w:rFonts w:ascii="Arial" w:hAnsi="Arial"/>
+                <w:sz w:val="19"/>
+              </w:rPr>
+              <w:t>Vibration at the pump bearing housing was measured at 6.8 mm/s RMS, compared with the synthetic inspection criterion of 4.5 mm/s RMS.</w:t>
+            </w:r>
+          </w:p>
+        </w:tc>
+      </w:tr>
+    </w:tbl>
+    <w:p>
+      <w:pPr>
+        <w:spacing w:before="0" w:after="120"/>
+      </w:pPr>
+    </w:p>
+    <w:p>
+      <w:pPr>
+        <w:keepNext/>
+        <w:spacing w:before="120" w:after="80"/>
+      </w:pPr>
+      <w:r>
+        <w:rPr>
+          <w:rFonts w:ascii="Arial" w:hAnsi="Arial"/>
+          <w:b/>
+          <w:color w:val="2D3748"/>
+          <w:sz w:val="22"/>
+        </w:rPr>
+        <w:t>Finding 3</w:t>
+      </w:r>
+    </w:p>
+    <w:tbl>
+      <w:tblPr>
+        <w:tblW w:type="auto" w:w="0"/>
+        <w:jc w:val="center"/>
+        <w:tblLayout w:type="fixed"/>
+        <w:tblLook w:firstColumn="1" w:firstRow="1" w:lastColumn="0" w:lastRow="0" w:noHBand="0" w:noVBand="1" w:val="04A0"/>
+      </w:tblPr>
+      <w:tblGrid>
+        <w:gridCol w:w="4680"/>
+        <w:gridCol w:w="4680"/>
+      </w:tblGrid>
+      <w:tr>
+        <w:tc>
+          <w:tcPr>
+            <w:tcW w:type="dxa" w:w="2592"/>
+            <w:shd w:fill="EDF2F7"/>
+            <w:tcMar>
+              <w:top w:w="70" w:type="dxa"/>
+              <w:bottom w:w="70" w:type="dxa"/>
+              <w:left w:w="100" w:type="dxa"/>
+              <w:right w:w="100" w:type="dxa"/>
+            </w:tcMar>
+          </w:tcPr>
+          <w:p>
+            <w:pPr>
+              <w:spacing w:before="40" w:after="40"/>
+            </w:pPr>
+            <w:r>
+              <w:rPr>
+                <w:rFonts w:ascii="Arial" w:hAnsi="Arial"/>
+                <w:b/>
+                <w:color w:val="2D3748"/>
+                <w:sz w:val="19"/>
+              </w:rPr>
+              <w:t>Finding</w:t>
+            </w:r>
+          </w:p>
+        </w:tc>
+        <w:tc>
+          <w:tcPr>
+            <w:tcW w:type="dxa" w:w="6768"/>
+            <w:shd w:fill="FFFFFF"/>
+            <w:tcMar>
+              <w:top w:w="70" w:type="dxa"/>
+              <w:bottom w:w="70" w:type="dxa"/>
+              <w:left w:w="100" w:type="dxa"/>
+              <w:right w:w="100" w:type="dxa"/>
+            </w:tcMar>
+          </w:tcPr>
+          <w:p>
+            <w:pPr>
+              <w:spacing w:before="40" w:after="40"/>
+            </w:pPr>
+            <w:r>
+              <w:rPr>
+                <w:rFonts w:ascii="Arial" w:hAnsi="Arial"/>
+                <w:sz w:val="19"/>
+              </w:rPr>
+              <w:t>Inadequate lubrication condition was observed.</w:t>
+            </w:r>
+          </w:p>
+        </w:tc>
+      </w:tr>
+      <w:tr>
+        <w:tc>
+          <w:tcPr>
+            <w:tcW w:type="dxa" w:w="2592"/>
+            <w:shd w:fill="EDF2F7"/>
+            <w:tcMar>
+              <w:top w:w="70" w:type="dxa"/>
+              <w:bottom w:w="70" w:type="dxa"/>
+              <w:left w:w="100" w:type="dxa"/>
+              <w:right w:w="100" w:type="dxa"/>
+            </w:tcMar>
+          </w:tcPr>
+          <w:p>
+            <w:pPr>
+              <w:spacing w:before="40" w:after="40"/>
+            </w:pPr>
+            <w:r>
+              <w:rPr>
+                <w:rFonts w:ascii="Arial" w:hAnsi="Arial"/>
+                <w:b/>
+                <w:color w:val="2D3748"/>
+                <w:sz w:val="19"/>
+              </w:rPr>
+              <w:t>Equipment</w:t>
+            </w:r>
+          </w:p>
+        </w:tc>
+        <w:tc>
+          <w:tcPr>
+            <w:tcW w:type="dxa" w:w="6768"/>
+            <w:shd w:fill="FFFFFF"/>
+            <w:tcMar>
+              <w:top w:w="70" w:type="dxa"/>
+              <w:bottom w:w="70" w:type="dxa"/>
+              <w:left w:w="100" w:type="dxa"/>
+              <w:right w:w="100" w:type="dxa"/>
+            </w:tcMar>
+          </w:tcPr>
+          <w:p>
+            <w:pPr>
+              <w:spacing w:before="40" w:after="40"/>
+            </w:pPr>
+            <w:r>
+              <w:rPr>
+                <w:rFonts w:ascii="Arial" w:hAnsi="Arial"/>
+                <w:sz w:val="19"/>
+              </w:rPr>
+              <w:t>P-101 Process Pump</w:t>
+            </w:r>
+          </w:p>
+        </w:tc>
+      </w:tr>
+      <w:tr>
+        <w:tc>
+          <w:tcPr>
+            <w:tcW w:type="dxa" w:w="2592"/>
+            <w:shd w:fill="EDF2F7"/>
+            <w:tcMar>
+              <w:top w:w="70" w:type="dxa"/>
+              <w:bottom w:w="70" w:type="dxa"/>
+              <w:left w:w="100" w:type="dxa"/>
+              <w:right w:w="100" w:type="dxa"/>
+            </w:tcMar>
+          </w:tcPr>
+          <w:p>
+            <w:pPr>
+              <w:spacing w:before="40" w:after="40"/>
+            </w:pPr>
+            <w:r>
+              <w:rPr>
+                <w:rFonts w:ascii="Arial" w:hAnsi="Arial"/>
+                <w:b/>
+                <w:color w:val="2D3748"/>
+                <w:sz w:val="19"/>
+              </w:rPr>
+              <w:t>Observed Value</w:t>
+            </w:r>
+          </w:p>
+        </w:tc>
+        <w:tc>
+          <w:tcPr>
+            <w:tcW w:type="dxa" w:w="6768"/>
+            <w:shd w:fill="FFFFFF"/>
+            <w:tcMar>
+              <w:top w:w="70" w:type="dxa"/>
+              <w:bottom w:w="70" w:type="dxa"/>
+              <w:left w:w="100" w:type="dxa"/>
+              <w:right w:w="100" w:type="dxa"/>
+            </w:tcMar>
+          </w:tcPr>
+          <w:p>
+            <w:pPr>
+              <w:spacing w:before="40" w:after="40"/>
+            </w:pPr>
+            <w:r>
+              <w:rPr>
+                <w:rFonts w:ascii="Arial" w:hAnsi="Arial"/>
+                <w:sz w:val="19"/>
+              </w:rPr>
+              <w:t>Low / insufficient grease</w:t>
+            </w:r>
+          </w:p>
+        </w:tc>
+      </w:tr>
+      <w:tr>
+        <w:tc>
+          <w:tcPr>
+            <w:tcW w:type="dxa" w:w="2592"/>
+            <w:shd w:fill="EDF2F7"/>
+            <w:tcMar>
+              <w:top w:w="70" w:type="dxa"/>
+              <w:bottom w:w="70" w:type="dxa"/>
+              <w:left w:w="100" w:type="dxa"/>
+              <w:right w:w="100" w:type="dxa"/>
+            </w:tcMar>
+          </w:tcPr>
+          <w:p>
+            <w:pPr>
+              <w:spacing w:before="40" w:after="40"/>
+            </w:pPr>
+            <w:r>
+              <w:rPr>
+                <w:rFonts w:ascii="Arial" w:hAnsi="Arial"/>
+                <w:b/>
+                <w:color w:val="2D3748"/>
+                <w:sz w:val="19"/>
+              </w:rPr>
+              <w:t>Limit</w:t>
+            </w:r>
+          </w:p>
+        </w:tc>
+        <w:tc>
+          <w:tcPr>
+            <w:tcW w:type="dxa" w:w="6768"/>
+            <w:shd w:fill="FFFFFF"/>
+            <w:tcMar>
+              <w:top w:w="70" w:type="dxa"/>
+              <w:bottom w:w="70" w:type="dxa"/>
+              <w:left w:w="100" w:type="dxa"/>
+              <w:right w:w="100" w:type="dxa"/>
+            </w:tcMar>
+          </w:tcPr>
+          <w:p>
+            <w:pPr>
+              <w:spacing w:before="40" w:after="40"/>
+            </w:pPr>
+            <w:r>
+              <w:rPr>
+                <w:rFonts w:ascii="Arial" w:hAnsi="Arial"/>
+                <w:sz w:val="19"/>
+              </w:rPr>
+              <w:t>Adequate lubrication required</w:t>
+            </w:r>
+          </w:p>
+        </w:tc>
+      </w:tr>
+      <w:tr>
+        <w:tc>
+          <w:tcPr>
+            <w:tcW w:type="dxa" w:w="2592"/>
+            <w:shd w:fill="EDF2F7"/>
+            <w:tcMar>
+              <w:top w:w="70" w:type="dxa"/>
+              <w:bottom w:w="70" w:type="dxa"/>
+              <w:left w:w="100" w:type="dxa"/>
+              <w:right w:w="100" w:type="dxa"/>
+            </w:tcMar>
+          </w:tcPr>
+          <w:p>
+            <w:pPr>
+              <w:spacing w:before="40" w:after="40"/>
+            </w:pPr>
+            <w:r>
+              <w:rPr>
+                <w:rFonts w:ascii="Arial" w:hAnsi="Arial"/>
+                <w:b/>
+                <w:color w:val="2D3748"/>
+                <w:sz w:val="19"/>
+              </w:rPr>
+              <w:t>Severity</w:t>
+            </w:r>
+          </w:p>
+        </w:tc>
+        <w:tc>
+          <w:tcPr>
+            <w:tcW w:type="dxa" w:w="6768"/>
+            <w:shd w:fill="FFFFFF"/>
+            <w:tcMar>
+              <w:top w:w="70" w:type="dxa"/>
+              <w:bottom w:w="70" w:type="dxa"/>
+              <w:left w:w="100" w:type="dxa"/>
+              <w:right w:w="100" w:type="dxa"/>
+            </w:tcMar>
+          </w:tcPr>
+          <w:p>
+            <w:pPr>
+              <w:spacing w:before="40" w:after="40"/>
+            </w:pPr>
+            <w:r>
+              <w:rPr>
+                <w:rFonts w:ascii="Arial" w:hAnsi="Arial"/>
+                <w:sz w:val="19"/>
+              </w:rPr>
+              <w:t>ABNORMAL</w:t>
+            </w:r>
+          </w:p>
+        </w:tc>
+      </w:tr>
+      <w:tr>
+        <w:tc>
+          <w:tcPr>
+            <w:tcW w:type="dxa" w:w="2592"/>
+            <w:shd w:fill="EDF2F7"/>
+            <w:tcMar>
+              <w:top w:w="70" w:type="dxa"/>
+              <w:bottom w:w="70" w:type="dxa"/>
+              <w:left w:w="100" w:type="dxa"/>
+              <w:right w:w="100" w:type="dxa"/>
+            </w:tcMar>
+          </w:tcPr>
+          <w:p>
+            <w:pPr>
+              <w:spacing w:before="40" w:after="40"/>
+            </w:pPr>
+            <w:r>
+              <w:rPr>
+                <w:rFonts w:ascii="Arial" w:hAnsi="Arial"/>
+                <w:b/>
+                <w:color w:val="2D3748"/>
+                <w:sz w:val="19"/>
+              </w:rPr>
+              <w:t>Evidence</w:t>
+            </w:r>
+          </w:p>
+        </w:tc>
+        <w:tc>
+          <w:tcPr>
+            <w:tcW w:type="dxa" w:w="6768"/>
+            <w:shd w:fill="FFFFFF"/>
+            <w:tcMar>
+              <w:top w:w="70" w:type="dxa"/>
+              <w:bottom w:w="70" w:type="dxa"/>
+              <w:left w:w="100" w:type="dxa"/>
+              <w:right w:w="100" w:type="dxa"/>
+            </w:tcMar>
+          </w:tcPr>
+          <w:p>
+            <w:pPr>
+              <w:spacing w:before="40" w:after="40"/>
+            </w:pPr>
+            <w:r>
+              <w:rPr>
+                <w:rFonts w:ascii="Arial" w:hAnsi="Arial"/>
+                <w:sz w:val="19"/>
+              </w:rPr>
+              <w:t>Low / insufficient grease observed Adequate lubrication required</w:t>
+            </w:r>
+          </w:p>
+        </w:tc>
+      </w:tr>
+    </w:tbl>
+    <w:p>
+      <w:pPr>
+        <w:spacing w:before="0" w:after="120"/>
+      </w:pPr>
+    </w:p>
+    <w:p>
+      <w:pPr>
+        <w:keepNext/>
+        <w:spacing w:before="120" w:after="80"/>
+      </w:pPr>
+      <w:r>
+        <w:rPr>
+          <w:rFonts w:ascii="Arial" w:hAnsi="Arial"/>
+          <w:b/>
+          <w:color w:val="2D3748"/>
+          <w:sz w:val="22"/>
+        </w:rPr>
+        <w:t>Finding 4</w:t>
+      </w:r>
+    </w:p>
+    <w:tbl>
+      <w:tblPr>
+        <w:tblW w:type="auto" w:w="0"/>
+        <w:jc w:val="center"/>
+        <w:tblLayout w:type="fixed"/>
+        <w:tblLook w:firstColumn="1" w:firstRow="1" w:lastColumn="0" w:lastRow="0" w:noHBand="0" w:noVBand="1" w:val="04A0"/>
+      </w:tblPr>
+      <w:tblGrid>
+        <w:gridCol w:w="4680"/>
+        <w:gridCol w:w="4680"/>
+      </w:tblGrid>
+      <w:tr>
+        <w:tc>
+          <w:tcPr>
+            <w:tcW w:type="dxa" w:w="2592"/>
+            <w:shd w:fill="EDF2F7"/>
+            <w:tcMar>
+              <w:top w:w="70" w:type="dxa"/>
+              <w:bottom w:w="70" w:type="dxa"/>
+              <w:left w:w="100" w:type="dxa"/>
+              <w:right w:w="100" w:type="dxa"/>
+            </w:tcMar>
+          </w:tcPr>
+          <w:p>
+            <w:pPr>
+              <w:spacing w:before="40" w:after="40"/>
+            </w:pPr>
+            <w:r>
+              <w:rPr>
+                <w:rFonts w:ascii="Arial" w:hAnsi="Arial"/>
+                <w:b/>
+                <w:color w:val="2D3748"/>
+                <w:sz w:val="19"/>
+              </w:rPr>
+              <w:t>Finding</w:t>
+            </w:r>
+          </w:p>
+        </w:tc>
+        <w:tc>
+          <w:tcPr>
+            <w:tcW w:type="dxa" w:w="6768"/>
+            <w:shd w:fill="FFFFFF"/>
+            <w:tcMar>
+              <w:top w:w="70" w:type="dxa"/>
+              <w:bottom w:w="70" w:type="dxa"/>
+              <w:left w:w="100" w:type="dxa"/>
+              <w:right w:w="100" w:type="dxa"/>
+            </w:tcMar>
+          </w:tcPr>
+          <w:p>
+            <w:pPr>
+              <w:spacing w:before="40" w:after="40"/>
+            </w:pPr>
+            <w:r>
+              <w:rPr>
+                <w:rFonts w:ascii="Arial" w:hAnsi="Arial"/>
+                <w:sz w:val="19"/>
+              </w:rPr>
+              <w:t>Oil leakage was not observed.</w:t>
+            </w:r>
+          </w:p>
+        </w:tc>
+      </w:tr>
+      <w:tr>
+        <w:tc>
+          <w:tcPr>
+            <w:tcW w:type="dxa" w:w="2592"/>
+            <w:shd w:fill="EDF2F7"/>
+            <w:tcMar>
+              <w:top w:w="70" w:type="dxa"/>
+              <w:bottom w:w="70" w:type="dxa"/>
+              <w:left w:w="100" w:type="dxa"/>
+              <w:right w:w="100" w:type="dxa"/>
+            </w:tcMar>
+          </w:tcPr>
+          <w:p>
+            <w:pPr>
+              <w:spacing w:before="40" w:after="40"/>
+            </w:pPr>
+            <w:r>
+              <w:rPr>
+                <w:rFonts w:ascii="Arial" w:hAnsi="Arial"/>
+                <w:b/>
+                <w:color w:val="2D3748"/>
+                <w:sz w:val="19"/>
+              </w:rPr>
+              <w:t>Equipment</w:t>
+            </w:r>
+          </w:p>
+        </w:tc>
+        <w:tc>
+          <w:tcPr>
+            <w:tcW w:type="dxa" w:w="6768"/>
+            <w:shd w:fill="FFFFFF"/>
+            <w:tcMar>
+              <w:top w:w="70" w:type="dxa"/>
+              <w:bottom w:w="70" w:type="dxa"/>
+              <w:left w:w="100" w:type="dxa"/>
+              <w:right w:w="100" w:type="dxa"/>
+            </w:tcMar>
+          </w:tcPr>
+          <w:p>
+            <w:pPr>
+              <w:spacing w:before="40" w:after="40"/>
+            </w:pPr>
+            <w:r>
+              <w:rPr>
+                <w:rFonts w:ascii="Arial" w:hAnsi="Arial"/>
+                <w:sz w:val="19"/>
+              </w:rPr>
+              <w:t>P-101 Process Pump</w:t>
+            </w:r>
+          </w:p>
+        </w:tc>
+      </w:tr>
+      <w:tr>
+        <w:tc>
+          <w:tcPr>
+            <w:tcW w:type="dxa" w:w="2592"/>
+            <w:shd w:fill="EDF2F7"/>
+            <w:tcMar>
+              <w:top w:w="70" w:type="dxa"/>
+              <w:bottom w:w="70" w:type="dxa"/>
+              <w:left w:w="100" w:type="dxa"/>
+              <w:right w:w="100" w:type="dxa"/>
+            </w:tcMar>
+          </w:tcPr>
+          <w:p>
+            <w:pPr>
+              <w:spacing w:before="40" w:after="40"/>
+            </w:pPr>
+            <w:r>
+              <w:rPr>
+                <w:rFonts w:ascii="Arial" w:hAnsi="Arial"/>
+                <w:b/>
+                <w:color w:val="2D3748"/>
+                <w:sz w:val="19"/>
+              </w:rPr>
+              <w:t>Observed Value</w:t>
+            </w:r>
+          </w:p>
+        </w:tc>
+        <w:tc>
+          <w:tcPr>
+            <w:tcW w:type="dxa" w:w="6768"/>
+            <w:shd w:fill="FFFFFF"/>
+            <w:tcMar>
+              <w:top w:w="70" w:type="dxa"/>
+              <w:bottom w:w="70" w:type="dxa"/>
+              <w:left w:w="100" w:type="dxa"/>
+              <w:right w:w="100" w:type="dxa"/>
+            </w:tcMar>
+          </w:tcPr>
+          <w:p>
+            <w:pPr>
+              <w:spacing w:before="40" w:after="40"/>
+            </w:pPr>
+            <w:r>
+              <w:rPr>
+                <w:rFonts w:ascii="Arial" w:hAnsi="Arial"/>
+                <w:sz w:val="19"/>
+              </w:rPr>
+              <w:t>No visible leakage</w:t>
+            </w:r>
+          </w:p>
+        </w:tc>
+      </w:tr>
+      <w:tr>
+        <w:tc>
+          <w:tcPr>
+            <w:tcW w:type="dxa" w:w="2592"/>
+            <w:shd w:fill="EDF2F7"/>
+            <w:tcMar>
+              <w:top w:w="70" w:type="dxa"/>
+              <w:bottom w:w="70" w:type="dxa"/>
+              <w:left w:w="100" w:type="dxa"/>
+              <w:right w:w="100" w:type="dxa"/>
+            </w:tcMar>
+          </w:tcPr>
+          <w:p>
+            <w:pPr>
+              <w:spacing w:before="40" w:after="40"/>
+            </w:pPr>
+            <w:r>
+              <w:rPr>
+                <w:rFonts w:ascii="Arial" w:hAnsi="Arial"/>
+                <w:b/>
+                <w:color w:val="2D3748"/>
+                <w:sz w:val="19"/>
+              </w:rPr>
+              <w:t>Limit</w:t>
+            </w:r>
+          </w:p>
+        </w:tc>
+        <w:tc>
+          <w:tcPr>
+            <w:tcW w:type="dxa" w:w="6768"/>
+            <w:shd w:fill="FFFFFF"/>
+            <w:tcMar>
+              <w:top w:w="70" w:type="dxa"/>
+              <w:bottom w:w="70" w:type="dxa"/>
+              <w:left w:w="100" w:type="dxa"/>
+              <w:right w:w="100" w:type="dxa"/>
+            </w:tcMar>
+          </w:tcPr>
+          <w:p>
+            <w:pPr>
+              <w:spacing w:before="40" w:after="40"/>
+            </w:pPr>
+            <w:r>
+              <w:rPr>
+                <w:rFonts w:ascii="Arial" w:hAnsi="Arial"/>
+                <w:sz w:val="19"/>
+              </w:rPr>
+              <w:t>No visible leakage</w:t>
+            </w:r>
+          </w:p>
+        </w:tc>
+      </w:tr>
+      <w:tr>
+        <w:tc>
+          <w:tcPr>
+            <w:tcW w:type="dxa" w:w="2592"/>
+            <w:shd w:fill="EDF2F7"/>
+            <w:tcMar>
+              <w:top w:w="70" w:type="dxa"/>
+              <w:bottom w:w="70" w:type="dxa"/>
+              <w:left w:w="100" w:type="dxa"/>
+              <w:right w:w="100" w:type="dxa"/>
+            </w:tcMar>
+          </w:tcPr>
+          <w:p>
+            <w:pPr>
+              <w:spacing w:before="40" w:after="40"/>
+            </w:pPr>
+            <w:r>
+              <w:rPr>
+                <w:rFonts w:ascii="Arial" w:hAnsi="Arial"/>
+                <w:b/>
+                <w:color w:val="2D3748"/>
+                <w:sz w:val="19"/>
+              </w:rPr>
+              <w:t>Severity</w:t>
+            </w:r>
+          </w:p>
+        </w:tc>
+        <w:tc>
+          <w:tcPr>
+            <w:tcW w:type="dxa" w:w="6768"/>
+            <w:shd w:fill="FFFFFF"/>
+            <w:tcMar>
+              <w:top w:w="70" w:type="dxa"/>
+              <w:bottom w:w="70" w:type="dxa"/>
+              <w:left w:w="100" w:type="dxa"/>
+              <w:right w:w="100" w:type="dxa"/>
+            </w:tcMar>
+          </w:tcPr>
+          <w:p>
+            <w:pPr>
+              <w:spacing w:before="40" w:after="40"/>
+            </w:pPr>
+            <w:r>
+              <w:rPr>
+                <w:rFonts w:ascii="Arial" w:hAnsi="Arial"/>
+                <w:sz w:val="19"/>
+              </w:rPr>
+              <w:t>NORMAL</w:t>
+            </w:r>
+          </w:p>
+        </w:tc>
+      </w:tr>
+      <w:tr>
+        <w:tc>
+          <w:tcPr>
+            <w:tcW w:type="dxa" w:w="2592"/>
+            <w:shd w:fill="EDF2F7"/>
+            <w:tcMar>
+              <w:top w:w="70" w:type="dxa"/>
+              <w:bottom w:w="70" w:type="dxa"/>
+              <w:left w:w="100" w:type="dxa"/>
+              <w:right w:w="100" w:type="dxa"/>
+            </w:tcMar>
+          </w:tcPr>
+          <w:p>
+            <w:pPr>
+              <w:spacing w:before="40" w:after="40"/>
+            </w:pPr>
+            <w:r>
+              <w:rPr>
+                <w:rFonts w:ascii="Arial" w:hAnsi="Arial"/>
+                <w:b/>
+                <w:color w:val="2D3748"/>
+                <w:sz w:val="19"/>
+              </w:rPr>
+              <w:t>Evidence</w:t>
+            </w:r>
+          </w:p>
+        </w:tc>
+        <w:tc>
+          <w:tcPr>
+            <w:tcW w:type="dxa" w:w="6768"/>
+            <w:shd w:fill="FFFFFF"/>
+            <w:tcMar>
+              <w:top w:w="70" w:type="dxa"/>
+              <w:bottom w:w="70" w:type="dxa"/>
+              <w:left w:w="100" w:type="dxa"/>
+              <w:right w:w="100" w:type="dxa"/>
+            </w:tcMar>
+          </w:tcPr>
+          <w:p>
+            <w:pPr>
+              <w:spacing w:before="40" w:after="40"/>
+            </w:pPr>
+            <w:r>
+              <w:rPr>
+                <w:rFonts w:ascii="Arial" w:hAnsi="Arial"/>
+                <w:sz w:val="19"/>
+              </w:rPr>
+              <w:t>No visible leakage No visible leakage</w:t>
+            </w:r>
+          </w:p>
+        </w:tc>
+      </w:tr>
+    </w:tbl>
+    <w:p>
+      <w:pPr>
+        <w:spacing w:before="0" w:after="120"/>
+      </w:pPr>
+    </w:p>
+    <w:p>
+      <w:pPr>
+        <w:keepNext/>
+        <w:spacing w:before="120" w:after="80"/>
+      </w:pPr>
+      <w:r>
+        <w:rPr>
+          <w:rFonts w:ascii="Arial" w:hAnsi="Arial"/>
+          <w:b/>
+          <w:color w:val="2D3748"/>
+          <w:sz w:val="22"/>
+        </w:rPr>
+        <w:t>Finding 5</w:t>
+      </w:r>
+    </w:p>
+    <w:tbl>
+      <w:tblPr>
+        <w:tblW w:type="auto" w:w="0"/>
+        <w:jc w:val="center"/>
+        <w:tblLayout w:type="fixed"/>
+        <w:tblLook w:firstColumn="1" w:firstRow="1" w:lastColumn="0" w:lastRow="0" w:noHBand="0" w:noVBand="1" w:val="04A0"/>
+      </w:tblPr>
+      <w:tblGrid>
+        <w:gridCol w:w="4680"/>
+        <w:gridCol w:w="4680"/>
+      </w:tblGrid>
+      <w:tr>
+        <w:tc>
+          <w:tcPr>
+            <w:tcW w:type="dxa" w:w="2592"/>
+            <w:shd w:fill="EDF2F7"/>
+            <w:tcMar>
+              <w:top w:w="70" w:type="dxa"/>
+              <w:bottom w:w="70" w:type="dxa"/>
+              <w:left w:w="100" w:type="dxa"/>
+              <w:right w:w="100" w:type="dxa"/>
+            </w:tcMar>
+          </w:tcPr>
+          <w:p>
+            <w:pPr>
+              <w:spacing w:before="40" w:after="40"/>
+            </w:pPr>
+            <w:r>
+              <w:rPr>
+                <w:rFonts w:ascii="Arial" w:hAnsi="Arial"/>
+                <w:b/>
+                <w:color w:val="2D3748"/>
+                <w:sz w:val="19"/>
+              </w:rPr>
+              <w:t>Finding</w:t>
+            </w:r>
+          </w:p>
+        </w:tc>
+        <w:tc>
+          <w:tcPr>
+            <w:tcW w:type="dxa" w:w="6768"/>
+            <w:shd w:fill="FFFFFF"/>
+            <w:tcMar>
+              <w:top w:w="70" w:type="dxa"/>
+              <w:bottom w:w="70" w:type="dxa"/>
+              <w:left w:w="100" w:type="dxa"/>
+              <w:right w:w="100" w:type="dxa"/>
+            </w:tcMar>
+          </w:tcPr>
+          <w:p>
+            <w:pPr>
+              <w:spacing w:before="40" w:after="40"/>
+            </w:pPr>
+            <w:r>
+              <w:rPr>
+                <w:rFonts w:ascii="Arial" w:hAnsi="Arial"/>
+                <w:sz w:val="19"/>
+              </w:rPr>
+              <w:t>Equipment was kept out of normal service pending inspection and corrective action.</w:t>
+            </w:r>
+          </w:p>
+        </w:tc>
+      </w:tr>
+      <w:tr>
+        <w:tc>
+          <w:tcPr>
+            <w:tcW w:type="dxa" w:w="2592"/>
+            <w:shd w:fill="EDF2F7"/>
+            <w:tcMar>
+              <w:top w:w="70" w:type="dxa"/>
+              <w:bottom w:w="70" w:type="dxa"/>
+              <w:left w:w="100" w:type="dxa"/>
+              <w:right w:w="100" w:type="dxa"/>
+            </w:tcMar>
+          </w:tcPr>
+          <w:p>
+            <w:pPr>
+              <w:spacing w:before="40" w:after="40"/>
+            </w:pPr>
+            <w:r>
+              <w:rPr>
+                <w:rFonts w:ascii="Arial" w:hAnsi="Arial"/>
+                <w:b/>
+                <w:color w:val="2D3748"/>
+                <w:sz w:val="19"/>
+              </w:rPr>
+              <w:t>Equipment</w:t>
+            </w:r>
+          </w:p>
+        </w:tc>
+        <w:tc>
+          <w:tcPr>
+            <w:tcW w:type="dxa" w:w="6768"/>
+            <w:shd w:fill="FFFFFF"/>
+            <w:tcMar>
+              <w:top w:w="70" w:type="dxa"/>
+              <w:bottom w:w="70" w:type="dxa"/>
+              <w:left w:w="100" w:type="dxa"/>
+              <w:right w:w="100" w:type="dxa"/>
+            </w:tcMar>
+          </w:tcPr>
+          <w:p>
+            <w:pPr>
+              <w:spacing w:before="40" w:after="40"/>
+            </w:pPr>
+            <w:r>
+              <w:rPr>
+                <w:rFonts w:ascii="Arial" w:hAnsi="Arial"/>
+                <w:sz w:val="19"/>
+              </w:rPr>
+              <w:t>P-101 Process Pump</w:t>
+            </w:r>
+          </w:p>
+        </w:tc>
+      </w:tr>
+      <w:tr>
+        <w:tc>
+          <w:tcPr>
+            <w:tcW w:type="dxa" w:w="2592"/>
+            <w:shd w:fill="EDF2F7"/>
+            <w:tcMar>
+              <w:top w:w="70" w:type="dxa"/>
+              <w:bottom w:w="70" w:type="dxa"/>
+              <w:left w:w="100" w:type="dxa"/>
+              <w:right w:w="100" w:type="dxa"/>
+            </w:tcMar>
+          </w:tcPr>
+          <w:p>
+            <w:pPr>
+              <w:spacing w:before="40" w:after="40"/>
+            </w:pPr>
+            <w:r>
+              <w:rPr>
+                <w:rFonts w:ascii="Arial" w:hAnsi="Arial"/>
+                <w:b/>
+                <w:color w:val="2D3748"/>
+                <w:sz w:val="19"/>
+              </w:rPr>
+              <w:t>Observed Value</w:t>
+            </w:r>
+          </w:p>
+        </w:tc>
+        <w:tc>
+          <w:tcPr>
+            <w:tcW w:type="dxa" w:w="6768"/>
+            <w:shd w:fill="FFFFFF"/>
+            <w:tcMar>
+              <w:top w:w="70" w:type="dxa"/>
+              <w:bottom w:w="70" w:type="dxa"/>
+              <w:left w:w="100" w:type="dxa"/>
+              <w:right w:w="100" w:type="dxa"/>
+            </w:tcMar>
+          </w:tcPr>
+          <w:p>
+            <w:pPr>
+              <w:spacing w:before="40" w:after="40"/>
+            </w:pPr>
+            <w:r>
+              <w:rPr>
+                <w:rFonts w:ascii="Arial" w:hAnsi="Arial"/>
+                <w:sz w:val="19"/>
+              </w:rPr>
+              <w:t>N/A</w:t>
+            </w:r>
+          </w:p>
+        </w:tc>
+      </w:tr>
+      <w:tr>
+        <w:tc>
+          <w:tcPr>
+            <w:tcW w:type="dxa" w:w="2592"/>
+            <w:shd w:fill="EDF2F7"/>
+            <w:tcMar>
+              <w:top w:w="70" w:type="dxa"/>
+              <w:bottom w:w="70" w:type="dxa"/>
+              <w:left w:w="100" w:type="dxa"/>
+              <w:right w:w="100" w:type="dxa"/>
+            </w:tcMar>
+          </w:tcPr>
+          <w:p>
+            <w:pPr>
+              <w:spacing w:before="40" w:after="40"/>
+            </w:pPr>
+            <w:r>
+              <w:rPr>
+                <w:rFonts w:ascii="Arial" w:hAnsi="Arial"/>
+                <w:b/>
+                <w:color w:val="2D3748"/>
+                <w:sz w:val="19"/>
+              </w:rPr>
+              <w:t>Limit</w:t>
+            </w:r>
+          </w:p>
+        </w:tc>
+        <w:tc>
+          <w:tcPr>
+            <w:tcW w:type="dxa" w:w="6768"/>
+            <w:shd w:fill="FFFFFF"/>
+            <w:tcMar>
+              <w:top w:w="70" w:type="dxa"/>
+              <w:bottom w:w="70" w:type="dxa"/>
+              <w:left w:w="100" w:type="dxa"/>
+              <w:right w:w="100" w:type="dxa"/>
+            </w:tcMar>
+          </w:tcPr>
+          <w:p>
+            <w:pPr>
+              <w:spacing w:before="40" w:after="40"/>
+            </w:pPr>
+            <w:r>
+              <w:rPr>
+                <w:rFonts w:ascii="Arial" w:hAnsi="Arial"/>
+                <w:sz w:val="19"/>
+              </w:rPr>
+              <w:t>N/A</w:t>
+            </w:r>
+          </w:p>
+        </w:tc>
+      </w:tr>
+      <w:tr>
+        <w:tc>
+          <w:tcPr>
+            <w:tcW w:type="dxa" w:w="2592"/>
+            <w:shd w:fill="EDF2F7"/>
+            <w:tcMar>
+              <w:top w:w="70" w:type="dxa"/>
+              <w:bottom w:w="70" w:type="dxa"/>
+              <w:left w:w="100" w:type="dxa"/>
+              <w:right w:w="100" w:type="dxa"/>
+            </w:tcMar>
+          </w:tcPr>
+          <w:p>
+            <w:pPr>
+              <w:spacing w:before="40" w:after="40"/>
+            </w:pPr>
+            <w:r>
+              <w:rPr>
+                <w:rFonts w:ascii="Arial" w:hAnsi="Arial"/>
+                <w:b/>
+                <w:color w:val="2D3748"/>
+                <w:sz w:val="19"/>
+              </w:rPr>
+              <w:t>Severity</w:t>
+            </w:r>
+          </w:p>
+        </w:tc>
+        <w:tc>
+          <w:tcPr>
+            <w:tcW w:type="dxa" w:w="6768"/>
+            <w:shd w:fill="FFFFFF"/>
+            <w:tcMar>
+              <w:top w:w="70" w:type="dxa"/>
+              <w:bottom w:w="70" w:type="dxa"/>
+              <w:left w:w="100" w:type="dxa"/>
+              <w:right w:w="100" w:type="dxa"/>
+            </w:tcMar>
+          </w:tcPr>
+          <w:p>
+            <w:pPr>
+              <w:spacing w:before="40" w:after="40"/>
+            </w:pPr>
+            <w:r>
+              <w:rPr>
+                <w:rFonts w:ascii="Arial" w:hAnsi="Arial"/>
+                <w:sz w:val="19"/>
+              </w:rPr>
+              <w:t>N/A</w:t>
+            </w:r>
+          </w:p>
+        </w:tc>
+      </w:tr>
+      <w:tr>
+        <w:tc>
+          <w:tcPr>
+            <w:tcW w:type="dxa" w:w="2592"/>
+            <w:shd w:fill="EDF2F7"/>
+            <w:tcMar>
+              <w:top w:w="70" w:type="dxa"/>
+              <w:bottom w:w="70" w:type="dxa"/>
+              <w:left w:w="100" w:type="dxa"/>
+              <w:right w:w="100" w:type="dxa"/>
+            </w:tcMar>
+          </w:tcPr>
+          <w:p>
+            <w:pPr>
+              <w:spacing w:before="40" w:after="40"/>
+            </w:pPr>
+            <w:r>
+              <w:rPr>
+                <w:rFonts w:ascii="Arial" w:hAnsi="Arial"/>
+                <w:b/>
+                <w:color w:val="2D3748"/>
+                <w:sz w:val="19"/>
+              </w:rPr>
+              <w:t>Evidence</w:t>
+            </w:r>
+          </w:p>
+        </w:tc>
+        <w:tc>
+          <w:tcPr>
+            <w:tcW w:type="dxa" w:w="6768"/>
+            <w:shd w:fill="FFFFFF"/>
+            <w:tcMar>
+              <w:top w:w="70" w:type="dxa"/>
+              <w:bottom w:w="70" w:type="dxa"/>
+              <w:left w:w="100" w:type="dxa"/>
+              <w:right w:w="100" w:type="dxa"/>
+            </w:tcMar>
+          </w:tcPr>
+          <w:p>
+            <w:pPr>
+              <w:spacing w:before="40" w:after="40"/>
+            </w:pPr>
+            <w:r>
+              <w:rPr>
+                <w:rFonts w:ascii="Arial" w:hAnsi="Arial"/>
+                <w:sz w:val="19"/>
+              </w:rPr>
+              <w:t>The equipment was kept out of normal service pending inspection and corrective action.</w:t>
+            </w:r>
+          </w:p>
+        </w:tc>
+      </w:tr>
+    </w:tbl>
+    <w:p>
+      <w:pPr>
+        <w:spacing w:before="0" w:after="120"/>
+      </w:pPr>
     </w:p>
     <w:p>
       <w:pPr>
@@ -137,7 +1845,7 @@
           <w:rFonts w:ascii="Arial" w:hAnsi="Arial"/>
           <w:sz w:val="20"/>
         </w:rPr>
-        <w:t>Technical analysis is unavailable based on the supplied SOP evidence.</w:t>
+        <w:t>Evaluation was performed by correlating observed parameters against standard operating procedures (Demo_Maintenance_SOP.pdf). Assessment analysis indicates: Bearing temperature exceeded the normal operating limit, which could lead to premature bearing failure, resulting in equipment downtime and potential safety hazards.</w:t>
       </w:r>
     </w:p>
     <w:p>
@@ -192,7 +1900,7 @@
         <w:tc>
           <w:tcPr>
             <w:tcW w:type="dxa" w:w="6768"/>
-            <w:shd w:fill="F7FAFC"/>
+            <w:shd w:fill="FED7D7"/>
             <w:tcMar>
               <w:top w:w="80" w:type="dxa"/>
               <w:bottom w:w="80" w:type="dxa"/>
@@ -205,9 +1913,10 @@
               <w:rPr>
                 <w:rFonts w:ascii="Arial" w:hAnsi="Arial"/>
                 <w:b/>
+                <w:color w:val="C53030"/>
                 <w:sz w:val="22"/>
               </w:rPr>
-              <w:t>Not Determined</w:t>
+              <w:t>HIGH</w:t>
             </w:r>
           </w:p>
         </w:tc>
@@ -252,7 +1961,7 @@
                 <w:rFonts w:ascii="Arial" w:hAnsi="Arial"/>
                 <w:sz w:val="19"/>
               </w:rPr>
-              <w:t>No significant inspection findings were detected in the report.</w:t>
+              <w:t>Bearing temperature exceeded the normal operating limit, which could lead to premature bearing failure, resulting in equipment downtime and potential safety hazards.</w:t>
             </w:r>
           </w:p>
         </w:tc>
@@ -310,7 +2019,7 @@
                 <w:color w:val="2B6CB0"/>
                 <w:sz w:val="20"/>
               </w:rPr>
-              <w:t>Continue standard operating and inspection schedule.</w:t>
+              <w:t>Immediate inspection and repair of the bearing assembly is required. Check lubrication condition and look for signs of abnormal vibration. Do not return the equipment to service until the inspection is complete. Insufficient SOP evidence is available to provide a validated recommendation. Insufficient SOP evidence is available to provide a validated recommendation. Insufficient SOP evidence is available to provide a validated recommendation. Insufficient SOP evidence is available to provide a validated recommendation.</w:t>
             </w:r>
           </w:p>
         </w:tc>
@@ -338,14 +2047,23 @@
     </w:p>
     <w:p>
       <w:pPr>
-        <w:spacing w:after="160"/>
+        <w:spacing w:after="80"/>
+        <w:ind w:left="360"/>
       </w:pPr>
       <w:r>
         <w:rPr>
           <w:rFonts w:ascii="Arial" w:hAnsi="Arial"/>
-          <w:i/>
+          <w:b/>
+          <w:sz w:val="19"/>
         </w:rPr>
-        <w:t>No specific SOP references cited.</w:t>
+        <w:t xml:space="preserve">[1] </w:t>
+      </w:r>
+      <w:r>
+        <w:rPr>
+          <w:rFonts w:ascii="Arial" w:hAnsi="Arial"/>
+          <w:sz w:val="19"/>
+        </w:rPr>
+        <w:t>Filename: Demo_Maintenance_SOP.pdf | Page: 1 | Chunk Index: 0 | Document ID: c2fd4c4f-8d4e-406e-9bb2-7b3c6e94d9b5</w:t>
       </w:r>
     </w:p>
     <w:p>

</xml_diff>

<commit_message>
docs: add current implementation baseline documentation and support files for inspection workflow
</commit_message>
<xml_diff>
--- a/backend/generated/Approval_Note.docx
+++ b/backend/generated/Approval_Note.docx
@@ -56,7 +56,7 @@
           <w:rFonts w:ascii="Arial" w:hAnsi="Arial"/>
           <w:sz w:val="21"/>
         </w:rPr>
-        <w:t>Inspection Report Analysis and Approval Recommendation — 127a43a0-a49f-434e-8deb-2fb106d1f599</w:t>
+        <w:t>Inspection Report Analysis and Approval Recommendation — b4cd2dd0-e6fd-4823-8ddd-3199bdafc846</w:t>
       </w:r>
     </w:p>
     <w:p>
@@ -83,7 +83,7 @@
           <w:rFonts w:ascii="Arial" w:hAnsi="Arial"/>
           <w:sz w:val="20"/>
         </w:rPr>
-        <w:t>An industrial inspection identified 5 finding(s) on P-101 Process Pump. Operational parameters were recorded during standard inspection routines and evaluated against documented standard operating procedures (SOPs) to produce this assessment.</w:t>
+        <w:t>An industrial inspection identified 1 finding(s) on Pump-03. Operational parameters were recorded during standard inspection routines and evaluated against documented standard operating procedures (SOPs) to produce this assessment.</w:t>
       </w:r>
     </w:p>
     <w:p>
@@ -99,21 +99,6 @@
           <w:sz w:val="26"/>
         </w:rPr>
         <w:t>3. Inspection Findings</w:t>
-      </w:r>
-    </w:p>
-    <w:p>
-      <w:pPr>
-        <w:keepNext/>
-        <w:spacing w:before="120" w:after="80"/>
-      </w:pPr>
-      <w:r>
-        <w:rPr>
-          <w:rFonts w:ascii="Arial" w:hAnsi="Arial"/>
-          <w:b/>
-          <w:color w:val="2D3748"/>
-          <w:sz w:val="22"/>
-        </w:rPr>
-        <w:t>Finding 1</w:t>
       </w:r>
     </w:p>
     <w:tbl>
@@ -174,7 +159,7 @@
                 <w:rFonts w:ascii="Arial" w:hAnsi="Arial"/>
                 <w:sz w:val="19"/>
               </w:rPr>
-              <w:t>Bearing temperature exceeded the normal operating limit.</w:t>
+              <w:t>High temperature condition requiring evaluation</w:t>
             </w:r>
           </w:p>
         </w:tc>
@@ -226,7 +211,7 @@
                 <w:rFonts w:ascii="Arial" w:hAnsi="Arial"/>
                 <w:sz w:val="19"/>
               </w:rPr>
-              <w:t>P-101 Process Pump</w:t>
+              <w:t>Pump-03</w:t>
             </w:r>
           </w:p>
         </w:tc>
@@ -278,7 +263,7 @@
                 <w:rFonts w:ascii="Arial" w:hAnsi="Arial"/>
                 <w:sz w:val="19"/>
               </w:rPr>
-              <w:t>92 °C</w:t>
+              <w:t>92 degrees C</w:t>
             </w:r>
           </w:p>
         </w:tc>
@@ -330,7 +315,7 @@
                 <w:rFonts w:ascii="Arial" w:hAnsi="Arial"/>
                 <w:sz w:val="19"/>
               </w:rPr>
-              <w:t>up to 80 °C</w:t>
+              <w:t>80 degrees C</w:t>
             </w:r>
           </w:p>
         </w:tc>
@@ -382,7 +367,7 @@
                 <w:rFonts w:ascii="Arial" w:hAnsi="Arial"/>
                 <w:sz w:val="19"/>
               </w:rPr>
-              <w:t>ABNORMAL</w:t>
+              <w:t>High</w:t>
             </w:r>
           </w:p>
         </w:tc>
@@ -434,1383 +419,7 @@
                 <w:rFonts w:ascii="Arial" w:hAnsi="Arial"/>
                 <w:sz w:val="19"/>
               </w:rPr>
-              <w:t>The applicable synthetic maintenance SOP states that normal bearing operating temperature is up to 80 °C. The reading therefore exceeds the documented limit by 12 °C.</w:t>
-            </w:r>
-          </w:p>
-        </w:tc>
-      </w:tr>
-    </w:tbl>
-    <w:p>
-      <w:pPr>
-        <w:spacing w:before="0" w:after="120"/>
-      </w:pPr>
-    </w:p>
-    <w:p>
-      <w:pPr>
-        <w:keepNext/>
-        <w:spacing w:before="120" w:after="80"/>
-      </w:pPr>
-      <w:r>
-        <w:rPr>
-          <w:rFonts w:ascii="Arial" w:hAnsi="Arial"/>
-          <w:b/>
-          <w:color w:val="2D3748"/>
-          <w:sz w:val="22"/>
-        </w:rPr>
-        <w:t>Finding 2</w:t>
-      </w:r>
-    </w:p>
-    <w:tbl>
-      <w:tblPr>
-        <w:tblW w:type="auto" w:w="0"/>
-        <w:jc w:val="center"/>
-        <w:tblLayout w:type="fixed"/>
-        <w:tblLook w:firstColumn="1" w:firstRow="1" w:lastColumn="0" w:lastRow="0" w:noHBand="0" w:noVBand="1" w:val="04A0"/>
-      </w:tblPr>
-      <w:tblGrid>
-        <w:gridCol w:w="4680"/>
-        <w:gridCol w:w="4680"/>
-      </w:tblGrid>
-      <w:tr>
-        <w:tc>
-          <w:tcPr>
-            <w:tcW w:type="dxa" w:w="2592"/>
-            <w:shd w:fill="EDF2F7"/>
-            <w:tcMar>
-              <w:top w:w="70" w:type="dxa"/>
-              <w:bottom w:w="70" w:type="dxa"/>
-              <w:left w:w="100" w:type="dxa"/>
-              <w:right w:w="100" w:type="dxa"/>
-            </w:tcMar>
-          </w:tcPr>
-          <w:p>
-            <w:pPr>
-              <w:spacing w:before="40" w:after="40"/>
-            </w:pPr>
-            <w:r>
-              <w:rPr>
-                <w:rFonts w:ascii="Arial" w:hAnsi="Arial"/>
-                <w:b/>
-                <w:color w:val="2D3748"/>
-                <w:sz w:val="19"/>
-              </w:rPr>
-              <w:t>Finding</w:t>
-            </w:r>
-          </w:p>
-        </w:tc>
-        <w:tc>
-          <w:tcPr>
-            <w:tcW w:type="dxa" w:w="6768"/>
-            <w:shd w:fill="FFFFFF"/>
-            <w:tcMar>
-              <w:top w:w="70" w:type="dxa"/>
-              <w:bottom w:w="70" w:type="dxa"/>
-              <w:left w:w="100" w:type="dxa"/>
-              <w:right w:w="100" w:type="dxa"/>
-            </w:tcMar>
-          </w:tcPr>
-          <w:p>
-            <w:pPr>
-              <w:spacing w:before="40" w:after="40"/>
-            </w:pPr>
-            <w:r>
-              <w:rPr>
-                <w:rFonts w:ascii="Arial" w:hAnsi="Arial"/>
-                <w:sz w:val="19"/>
-              </w:rPr>
-              <w:t>Abnormal vibration was recorded.</w:t>
-            </w:r>
-          </w:p>
-        </w:tc>
-      </w:tr>
-      <w:tr>
-        <w:tc>
-          <w:tcPr>
-            <w:tcW w:type="dxa" w:w="2592"/>
-            <w:shd w:fill="EDF2F7"/>
-            <w:tcMar>
-              <w:top w:w="70" w:type="dxa"/>
-              <w:bottom w:w="70" w:type="dxa"/>
-              <w:left w:w="100" w:type="dxa"/>
-              <w:right w:w="100" w:type="dxa"/>
-            </w:tcMar>
-          </w:tcPr>
-          <w:p>
-            <w:pPr>
-              <w:spacing w:before="40" w:after="40"/>
-            </w:pPr>
-            <w:r>
-              <w:rPr>
-                <w:rFonts w:ascii="Arial" w:hAnsi="Arial"/>
-                <w:b/>
-                <w:color w:val="2D3748"/>
-                <w:sz w:val="19"/>
-              </w:rPr>
-              <w:t>Equipment</w:t>
-            </w:r>
-          </w:p>
-        </w:tc>
-        <w:tc>
-          <w:tcPr>
-            <w:tcW w:type="dxa" w:w="6768"/>
-            <w:shd w:fill="FFFFFF"/>
-            <w:tcMar>
-              <w:top w:w="70" w:type="dxa"/>
-              <w:bottom w:w="70" w:type="dxa"/>
-              <w:left w:w="100" w:type="dxa"/>
-              <w:right w:w="100" w:type="dxa"/>
-            </w:tcMar>
-          </w:tcPr>
-          <w:p>
-            <w:pPr>
-              <w:spacing w:before="40" w:after="40"/>
-            </w:pPr>
-            <w:r>
-              <w:rPr>
-                <w:rFonts w:ascii="Arial" w:hAnsi="Arial"/>
-                <w:sz w:val="19"/>
-              </w:rPr>
-              <w:t>P-101 Process Pump</w:t>
-            </w:r>
-          </w:p>
-        </w:tc>
-      </w:tr>
-      <w:tr>
-        <w:tc>
-          <w:tcPr>
-            <w:tcW w:type="dxa" w:w="2592"/>
-            <w:shd w:fill="EDF2F7"/>
-            <w:tcMar>
-              <w:top w:w="70" w:type="dxa"/>
-              <w:bottom w:w="70" w:type="dxa"/>
-              <w:left w:w="100" w:type="dxa"/>
-              <w:right w:w="100" w:type="dxa"/>
-            </w:tcMar>
-          </w:tcPr>
-          <w:p>
-            <w:pPr>
-              <w:spacing w:before="40" w:after="40"/>
-            </w:pPr>
-            <w:r>
-              <w:rPr>
-                <w:rFonts w:ascii="Arial" w:hAnsi="Arial"/>
-                <w:b/>
-                <w:color w:val="2D3748"/>
-                <w:sz w:val="19"/>
-              </w:rPr>
-              <w:t>Observed Value</w:t>
-            </w:r>
-          </w:p>
-        </w:tc>
-        <w:tc>
-          <w:tcPr>
-            <w:tcW w:type="dxa" w:w="6768"/>
-            <w:shd w:fill="FFFFFF"/>
-            <w:tcMar>
-              <w:top w:w="70" w:type="dxa"/>
-              <w:bottom w:w="70" w:type="dxa"/>
-              <w:left w:w="100" w:type="dxa"/>
-              <w:right w:w="100" w:type="dxa"/>
-            </w:tcMar>
-          </w:tcPr>
-          <w:p>
-            <w:pPr>
-              <w:spacing w:before="40" w:after="40"/>
-            </w:pPr>
-            <w:r>
-              <w:rPr>
-                <w:rFonts w:ascii="Arial" w:hAnsi="Arial"/>
-                <w:sz w:val="19"/>
-              </w:rPr>
-              <w:t>6.8 mm/s RMS</w:t>
-            </w:r>
-          </w:p>
-        </w:tc>
-      </w:tr>
-      <w:tr>
-        <w:tc>
-          <w:tcPr>
-            <w:tcW w:type="dxa" w:w="2592"/>
-            <w:shd w:fill="EDF2F7"/>
-            <w:tcMar>
-              <w:top w:w="70" w:type="dxa"/>
-              <w:bottom w:w="70" w:type="dxa"/>
-              <w:left w:w="100" w:type="dxa"/>
-              <w:right w:w="100" w:type="dxa"/>
-            </w:tcMar>
-          </w:tcPr>
-          <w:p>
-            <w:pPr>
-              <w:spacing w:before="40" w:after="40"/>
-            </w:pPr>
-            <w:r>
-              <w:rPr>
-                <w:rFonts w:ascii="Arial" w:hAnsi="Arial"/>
-                <w:b/>
-                <w:color w:val="2D3748"/>
-                <w:sz w:val="19"/>
-              </w:rPr>
-              <w:t>Limit</w:t>
-            </w:r>
-          </w:p>
-        </w:tc>
-        <w:tc>
-          <w:tcPr>
-            <w:tcW w:type="dxa" w:w="6768"/>
-            <w:shd w:fill="FFFFFF"/>
-            <w:tcMar>
-              <w:top w:w="70" w:type="dxa"/>
-              <w:bottom w:w="70" w:type="dxa"/>
-              <w:left w:w="100" w:type="dxa"/>
-              <w:right w:w="100" w:type="dxa"/>
-            </w:tcMar>
-          </w:tcPr>
-          <w:p>
-            <w:pPr>
-              <w:spacing w:before="40" w:after="40"/>
-            </w:pPr>
-            <w:r>
-              <w:rPr>
-                <w:rFonts w:ascii="Arial" w:hAnsi="Arial"/>
-                <w:sz w:val="19"/>
-              </w:rPr>
-              <w:t>up to 4.5 mm/s RMS</w:t>
-            </w:r>
-          </w:p>
-        </w:tc>
-      </w:tr>
-      <w:tr>
-        <w:tc>
-          <w:tcPr>
-            <w:tcW w:type="dxa" w:w="2592"/>
-            <w:shd w:fill="EDF2F7"/>
-            <w:tcMar>
-              <w:top w:w="70" w:type="dxa"/>
-              <w:bottom w:w="70" w:type="dxa"/>
-              <w:left w:w="100" w:type="dxa"/>
-              <w:right w:w="100" w:type="dxa"/>
-            </w:tcMar>
-          </w:tcPr>
-          <w:p>
-            <w:pPr>
-              <w:spacing w:before="40" w:after="40"/>
-            </w:pPr>
-            <w:r>
-              <w:rPr>
-                <w:rFonts w:ascii="Arial" w:hAnsi="Arial"/>
-                <w:b/>
-                <w:color w:val="2D3748"/>
-                <w:sz w:val="19"/>
-              </w:rPr>
-              <w:t>Severity</w:t>
-            </w:r>
-          </w:p>
-        </w:tc>
-        <w:tc>
-          <w:tcPr>
-            <w:tcW w:type="dxa" w:w="6768"/>
-            <w:shd w:fill="FFFFFF"/>
-            <w:tcMar>
-              <w:top w:w="70" w:type="dxa"/>
-              <w:bottom w:w="70" w:type="dxa"/>
-              <w:left w:w="100" w:type="dxa"/>
-              <w:right w:w="100" w:type="dxa"/>
-            </w:tcMar>
-          </w:tcPr>
-          <w:p>
-            <w:pPr>
-              <w:spacing w:before="40" w:after="40"/>
-            </w:pPr>
-            <w:r>
-              <w:rPr>
-                <w:rFonts w:ascii="Arial" w:hAnsi="Arial"/>
-                <w:sz w:val="19"/>
-              </w:rPr>
-              <w:t>ABNORMAL</w:t>
-            </w:r>
-          </w:p>
-        </w:tc>
-      </w:tr>
-      <w:tr>
-        <w:tc>
-          <w:tcPr>
-            <w:tcW w:type="dxa" w:w="2592"/>
-            <w:shd w:fill="EDF2F7"/>
-            <w:tcMar>
-              <w:top w:w="70" w:type="dxa"/>
-              <w:bottom w:w="70" w:type="dxa"/>
-              <w:left w:w="100" w:type="dxa"/>
-              <w:right w:w="100" w:type="dxa"/>
-            </w:tcMar>
-          </w:tcPr>
-          <w:p>
-            <w:pPr>
-              <w:spacing w:before="40" w:after="40"/>
-            </w:pPr>
-            <w:r>
-              <w:rPr>
-                <w:rFonts w:ascii="Arial" w:hAnsi="Arial"/>
-                <w:b/>
-                <w:color w:val="2D3748"/>
-                <w:sz w:val="19"/>
-              </w:rPr>
-              <w:t>Evidence</w:t>
-            </w:r>
-          </w:p>
-        </w:tc>
-        <w:tc>
-          <w:tcPr>
-            <w:tcW w:type="dxa" w:w="6768"/>
-            <w:shd w:fill="FFFFFF"/>
-            <w:tcMar>
-              <w:top w:w="70" w:type="dxa"/>
-              <w:bottom w:w="70" w:type="dxa"/>
-              <w:left w:w="100" w:type="dxa"/>
-              <w:right w:w="100" w:type="dxa"/>
-            </w:tcMar>
-          </w:tcPr>
-          <w:p>
-            <w:pPr>
-              <w:spacing w:before="40" w:after="40"/>
-            </w:pPr>
-            <w:r>
-              <w:rPr>
-                <w:rFonts w:ascii="Arial" w:hAnsi="Arial"/>
-                <w:sz w:val="19"/>
-              </w:rPr>
-              <w:t>Vibration at the pump bearing housing was measured at 6.8 mm/s RMS, compared with the synthetic inspection criterion of 4.5 mm/s RMS.</w:t>
-            </w:r>
-          </w:p>
-        </w:tc>
-      </w:tr>
-    </w:tbl>
-    <w:p>
-      <w:pPr>
-        <w:spacing w:before="0" w:after="120"/>
-      </w:pPr>
-    </w:p>
-    <w:p>
-      <w:pPr>
-        <w:keepNext/>
-        <w:spacing w:before="120" w:after="80"/>
-      </w:pPr>
-      <w:r>
-        <w:rPr>
-          <w:rFonts w:ascii="Arial" w:hAnsi="Arial"/>
-          <w:b/>
-          <w:color w:val="2D3748"/>
-          <w:sz w:val="22"/>
-        </w:rPr>
-        <w:t>Finding 3</w:t>
-      </w:r>
-    </w:p>
-    <w:tbl>
-      <w:tblPr>
-        <w:tblW w:type="auto" w:w="0"/>
-        <w:jc w:val="center"/>
-        <w:tblLayout w:type="fixed"/>
-        <w:tblLook w:firstColumn="1" w:firstRow="1" w:lastColumn="0" w:lastRow="0" w:noHBand="0" w:noVBand="1" w:val="04A0"/>
-      </w:tblPr>
-      <w:tblGrid>
-        <w:gridCol w:w="4680"/>
-        <w:gridCol w:w="4680"/>
-      </w:tblGrid>
-      <w:tr>
-        <w:tc>
-          <w:tcPr>
-            <w:tcW w:type="dxa" w:w="2592"/>
-            <w:shd w:fill="EDF2F7"/>
-            <w:tcMar>
-              <w:top w:w="70" w:type="dxa"/>
-              <w:bottom w:w="70" w:type="dxa"/>
-              <w:left w:w="100" w:type="dxa"/>
-              <w:right w:w="100" w:type="dxa"/>
-            </w:tcMar>
-          </w:tcPr>
-          <w:p>
-            <w:pPr>
-              <w:spacing w:before="40" w:after="40"/>
-            </w:pPr>
-            <w:r>
-              <w:rPr>
-                <w:rFonts w:ascii="Arial" w:hAnsi="Arial"/>
-                <w:b/>
-                <w:color w:val="2D3748"/>
-                <w:sz w:val="19"/>
-              </w:rPr>
-              <w:t>Finding</w:t>
-            </w:r>
-          </w:p>
-        </w:tc>
-        <w:tc>
-          <w:tcPr>
-            <w:tcW w:type="dxa" w:w="6768"/>
-            <w:shd w:fill="FFFFFF"/>
-            <w:tcMar>
-              <w:top w:w="70" w:type="dxa"/>
-              <w:bottom w:w="70" w:type="dxa"/>
-              <w:left w:w="100" w:type="dxa"/>
-              <w:right w:w="100" w:type="dxa"/>
-            </w:tcMar>
-          </w:tcPr>
-          <w:p>
-            <w:pPr>
-              <w:spacing w:before="40" w:after="40"/>
-            </w:pPr>
-            <w:r>
-              <w:rPr>
-                <w:rFonts w:ascii="Arial" w:hAnsi="Arial"/>
-                <w:sz w:val="19"/>
-              </w:rPr>
-              <w:t>Inadequate lubrication condition was observed.</w:t>
-            </w:r>
-          </w:p>
-        </w:tc>
-      </w:tr>
-      <w:tr>
-        <w:tc>
-          <w:tcPr>
-            <w:tcW w:type="dxa" w:w="2592"/>
-            <w:shd w:fill="EDF2F7"/>
-            <w:tcMar>
-              <w:top w:w="70" w:type="dxa"/>
-              <w:bottom w:w="70" w:type="dxa"/>
-              <w:left w:w="100" w:type="dxa"/>
-              <w:right w:w="100" w:type="dxa"/>
-            </w:tcMar>
-          </w:tcPr>
-          <w:p>
-            <w:pPr>
-              <w:spacing w:before="40" w:after="40"/>
-            </w:pPr>
-            <w:r>
-              <w:rPr>
-                <w:rFonts w:ascii="Arial" w:hAnsi="Arial"/>
-                <w:b/>
-                <w:color w:val="2D3748"/>
-                <w:sz w:val="19"/>
-              </w:rPr>
-              <w:t>Equipment</w:t>
-            </w:r>
-          </w:p>
-        </w:tc>
-        <w:tc>
-          <w:tcPr>
-            <w:tcW w:type="dxa" w:w="6768"/>
-            <w:shd w:fill="FFFFFF"/>
-            <w:tcMar>
-              <w:top w:w="70" w:type="dxa"/>
-              <w:bottom w:w="70" w:type="dxa"/>
-              <w:left w:w="100" w:type="dxa"/>
-              <w:right w:w="100" w:type="dxa"/>
-            </w:tcMar>
-          </w:tcPr>
-          <w:p>
-            <w:pPr>
-              <w:spacing w:before="40" w:after="40"/>
-            </w:pPr>
-            <w:r>
-              <w:rPr>
-                <w:rFonts w:ascii="Arial" w:hAnsi="Arial"/>
-                <w:sz w:val="19"/>
-              </w:rPr>
-              <w:t>P-101 Process Pump</w:t>
-            </w:r>
-          </w:p>
-        </w:tc>
-      </w:tr>
-      <w:tr>
-        <w:tc>
-          <w:tcPr>
-            <w:tcW w:type="dxa" w:w="2592"/>
-            <w:shd w:fill="EDF2F7"/>
-            <w:tcMar>
-              <w:top w:w="70" w:type="dxa"/>
-              <w:bottom w:w="70" w:type="dxa"/>
-              <w:left w:w="100" w:type="dxa"/>
-              <w:right w:w="100" w:type="dxa"/>
-            </w:tcMar>
-          </w:tcPr>
-          <w:p>
-            <w:pPr>
-              <w:spacing w:before="40" w:after="40"/>
-            </w:pPr>
-            <w:r>
-              <w:rPr>
-                <w:rFonts w:ascii="Arial" w:hAnsi="Arial"/>
-                <w:b/>
-                <w:color w:val="2D3748"/>
-                <w:sz w:val="19"/>
-              </w:rPr>
-              <w:t>Observed Value</w:t>
-            </w:r>
-          </w:p>
-        </w:tc>
-        <w:tc>
-          <w:tcPr>
-            <w:tcW w:type="dxa" w:w="6768"/>
-            <w:shd w:fill="FFFFFF"/>
-            <w:tcMar>
-              <w:top w:w="70" w:type="dxa"/>
-              <w:bottom w:w="70" w:type="dxa"/>
-              <w:left w:w="100" w:type="dxa"/>
-              <w:right w:w="100" w:type="dxa"/>
-            </w:tcMar>
-          </w:tcPr>
-          <w:p>
-            <w:pPr>
-              <w:spacing w:before="40" w:after="40"/>
-            </w:pPr>
-            <w:r>
-              <w:rPr>
-                <w:rFonts w:ascii="Arial" w:hAnsi="Arial"/>
-                <w:sz w:val="19"/>
-              </w:rPr>
-              <w:t>Low / insufficient grease</w:t>
-            </w:r>
-          </w:p>
-        </w:tc>
-      </w:tr>
-      <w:tr>
-        <w:tc>
-          <w:tcPr>
-            <w:tcW w:type="dxa" w:w="2592"/>
-            <w:shd w:fill="EDF2F7"/>
-            <w:tcMar>
-              <w:top w:w="70" w:type="dxa"/>
-              <w:bottom w:w="70" w:type="dxa"/>
-              <w:left w:w="100" w:type="dxa"/>
-              <w:right w:w="100" w:type="dxa"/>
-            </w:tcMar>
-          </w:tcPr>
-          <w:p>
-            <w:pPr>
-              <w:spacing w:before="40" w:after="40"/>
-            </w:pPr>
-            <w:r>
-              <w:rPr>
-                <w:rFonts w:ascii="Arial" w:hAnsi="Arial"/>
-                <w:b/>
-                <w:color w:val="2D3748"/>
-                <w:sz w:val="19"/>
-              </w:rPr>
-              <w:t>Limit</w:t>
-            </w:r>
-          </w:p>
-        </w:tc>
-        <w:tc>
-          <w:tcPr>
-            <w:tcW w:type="dxa" w:w="6768"/>
-            <w:shd w:fill="FFFFFF"/>
-            <w:tcMar>
-              <w:top w:w="70" w:type="dxa"/>
-              <w:bottom w:w="70" w:type="dxa"/>
-              <w:left w:w="100" w:type="dxa"/>
-              <w:right w:w="100" w:type="dxa"/>
-            </w:tcMar>
-          </w:tcPr>
-          <w:p>
-            <w:pPr>
-              <w:spacing w:before="40" w:after="40"/>
-            </w:pPr>
-            <w:r>
-              <w:rPr>
-                <w:rFonts w:ascii="Arial" w:hAnsi="Arial"/>
-                <w:sz w:val="19"/>
-              </w:rPr>
-              <w:t>Adequate lubrication required</w:t>
-            </w:r>
-          </w:p>
-        </w:tc>
-      </w:tr>
-      <w:tr>
-        <w:tc>
-          <w:tcPr>
-            <w:tcW w:type="dxa" w:w="2592"/>
-            <w:shd w:fill="EDF2F7"/>
-            <w:tcMar>
-              <w:top w:w="70" w:type="dxa"/>
-              <w:bottom w:w="70" w:type="dxa"/>
-              <w:left w:w="100" w:type="dxa"/>
-              <w:right w:w="100" w:type="dxa"/>
-            </w:tcMar>
-          </w:tcPr>
-          <w:p>
-            <w:pPr>
-              <w:spacing w:before="40" w:after="40"/>
-            </w:pPr>
-            <w:r>
-              <w:rPr>
-                <w:rFonts w:ascii="Arial" w:hAnsi="Arial"/>
-                <w:b/>
-                <w:color w:val="2D3748"/>
-                <w:sz w:val="19"/>
-              </w:rPr>
-              <w:t>Severity</w:t>
-            </w:r>
-          </w:p>
-        </w:tc>
-        <w:tc>
-          <w:tcPr>
-            <w:tcW w:type="dxa" w:w="6768"/>
-            <w:shd w:fill="FFFFFF"/>
-            <w:tcMar>
-              <w:top w:w="70" w:type="dxa"/>
-              <w:bottom w:w="70" w:type="dxa"/>
-              <w:left w:w="100" w:type="dxa"/>
-              <w:right w:w="100" w:type="dxa"/>
-            </w:tcMar>
-          </w:tcPr>
-          <w:p>
-            <w:pPr>
-              <w:spacing w:before="40" w:after="40"/>
-            </w:pPr>
-            <w:r>
-              <w:rPr>
-                <w:rFonts w:ascii="Arial" w:hAnsi="Arial"/>
-                <w:sz w:val="19"/>
-              </w:rPr>
-              <w:t>ABNORMAL</w:t>
-            </w:r>
-          </w:p>
-        </w:tc>
-      </w:tr>
-      <w:tr>
-        <w:tc>
-          <w:tcPr>
-            <w:tcW w:type="dxa" w:w="2592"/>
-            <w:shd w:fill="EDF2F7"/>
-            <w:tcMar>
-              <w:top w:w="70" w:type="dxa"/>
-              <w:bottom w:w="70" w:type="dxa"/>
-              <w:left w:w="100" w:type="dxa"/>
-              <w:right w:w="100" w:type="dxa"/>
-            </w:tcMar>
-          </w:tcPr>
-          <w:p>
-            <w:pPr>
-              <w:spacing w:before="40" w:after="40"/>
-            </w:pPr>
-            <w:r>
-              <w:rPr>
-                <w:rFonts w:ascii="Arial" w:hAnsi="Arial"/>
-                <w:b/>
-                <w:color w:val="2D3748"/>
-                <w:sz w:val="19"/>
-              </w:rPr>
-              <w:t>Evidence</w:t>
-            </w:r>
-          </w:p>
-        </w:tc>
-        <w:tc>
-          <w:tcPr>
-            <w:tcW w:type="dxa" w:w="6768"/>
-            <w:shd w:fill="FFFFFF"/>
-            <w:tcMar>
-              <w:top w:w="70" w:type="dxa"/>
-              <w:bottom w:w="70" w:type="dxa"/>
-              <w:left w:w="100" w:type="dxa"/>
-              <w:right w:w="100" w:type="dxa"/>
-            </w:tcMar>
-          </w:tcPr>
-          <w:p>
-            <w:pPr>
-              <w:spacing w:before="40" w:after="40"/>
-            </w:pPr>
-            <w:r>
-              <w:rPr>
-                <w:rFonts w:ascii="Arial" w:hAnsi="Arial"/>
-                <w:sz w:val="19"/>
-              </w:rPr>
-              <w:t>Low / insufficient grease observed Adequate lubrication required</w:t>
-            </w:r>
-          </w:p>
-        </w:tc>
-      </w:tr>
-    </w:tbl>
-    <w:p>
-      <w:pPr>
-        <w:spacing w:before="0" w:after="120"/>
-      </w:pPr>
-    </w:p>
-    <w:p>
-      <w:pPr>
-        <w:keepNext/>
-        <w:spacing w:before="120" w:after="80"/>
-      </w:pPr>
-      <w:r>
-        <w:rPr>
-          <w:rFonts w:ascii="Arial" w:hAnsi="Arial"/>
-          <w:b/>
-          <w:color w:val="2D3748"/>
-          <w:sz w:val="22"/>
-        </w:rPr>
-        <w:t>Finding 4</w:t>
-      </w:r>
-    </w:p>
-    <w:tbl>
-      <w:tblPr>
-        <w:tblW w:type="auto" w:w="0"/>
-        <w:jc w:val="center"/>
-        <w:tblLayout w:type="fixed"/>
-        <w:tblLook w:firstColumn="1" w:firstRow="1" w:lastColumn="0" w:lastRow="0" w:noHBand="0" w:noVBand="1" w:val="04A0"/>
-      </w:tblPr>
-      <w:tblGrid>
-        <w:gridCol w:w="4680"/>
-        <w:gridCol w:w="4680"/>
-      </w:tblGrid>
-      <w:tr>
-        <w:tc>
-          <w:tcPr>
-            <w:tcW w:type="dxa" w:w="2592"/>
-            <w:shd w:fill="EDF2F7"/>
-            <w:tcMar>
-              <w:top w:w="70" w:type="dxa"/>
-              <w:bottom w:w="70" w:type="dxa"/>
-              <w:left w:w="100" w:type="dxa"/>
-              <w:right w:w="100" w:type="dxa"/>
-            </w:tcMar>
-          </w:tcPr>
-          <w:p>
-            <w:pPr>
-              <w:spacing w:before="40" w:after="40"/>
-            </w:pPr>
-            <w:r>
-              <w:rPr>
-                <w:rFonts w:ascii="Arial" w:hAnsi="Arial"/>
-                <w:b/>
-                <w:color w:val="2D3748"/>
-                <w:sz w:val="19"/>
-              </w:rPr>
-              <w:t>Finding</w:t>
-            </w:r>
-          </w:p>
-        </w:tc>
-        <w:tc>
-          <w:tcPr>
-            <w:tcW w:type="dxa" w:w="6768"/>
-            <w:shd w:fill="FFFFFF"/>
-            <w:tcMar>
-              <w:top w:w="70" w:type="dxa"/>
-              <w:bottom w:w="70" w:type="dxa"/>
-              <w:left w:w="100" w:type="dxa"/>
-              <w:right w:w="100" w:type="dxa"/>
-            </w:tcMar>
-          </w:tcPr>
-          <w:p>
-            <w:pPr>
-              <w:spacing w:before="40" w:after="40"/>
-            </w:pPr>
-            <w:r>
-              <w:rPr>
-                <w:rFonts w:ascii="Arial" w:hAnsi="Arial"/>
-                <w:sz w:val="19"/>
-              </w:rPr>
-              <w:t>Oil leakage was not observed.</w:t>
-            </w:r>
-          </w:p>
-        </w:tc>
-      </w:tr>
-      <w:tr>
-        <w:tc>
-          <w:tcPr>
-            <w:tcW w:type="dxa" w:w="2592"/>
-            <w:shd w:fill="EDF2F7"/>
-            <w:tcMar>
-              <w:top w:w="70" w:type="dxa"/>
-              <w:bottom w:w="70" w:type="dxa"/>
-              <w:left w:w="100" w:type="dxa"/>
-              <w:right w:w="100" w:type="dxa"/>
-            </w:tcMar>
-          </w:tcPr>
-          <w:p>
-            <w:pPr>
-              <w:spacing w:before="40" w:after="40"/>
-            </w:pPr>
-            <w:r>
-              <w:rPr>
-                <w:rFonts w:ascii="Arial" w:hAnsi="Arial"/>
-                <w:b/>
-                <w:color w:val="2D3748"/>
-                <w:sz w:val="19"/>
-              </w:rPr>
-              <w:t>Equipment</w:t>
-            </w:r>
-          </w:p>
-        </w:tc>
-        <w:tc>
-          <w:tcPr>
-            <w:tcW w:type="dxa" w:w="6768"/>
-            <w:shd w:fill="FFFFFF"/>
-            <w:tcMar>
-              <w:top w:w="70" w:type="dxa"/>
-              <w:bottom w:w="70" w:type="dxa"/>
-              <w:left w:w="100" w:type="dxa"/>
-              <w:right w:w="100" w:type="dxa"/>
-            </w:tcMar>
-          </w:tcPr>
-          <w:p>
-            <w:pPr>
-              <w:spacing w:before="40" w:after="40"/>
-            </w:pPr>
-            <w:r>
-              <w:rPr>
-                <w:rFonts w:ascii="Arial" w:hAnsi="Arial"/>
-                <w:sz w:val="19"/>
-              </w:rPr>
-              <w:t>P-101 Process Pump</w:t>
-            </w:r>
-          </w:p>
-        </w:tc>
-      </w:tr>
-      <w:tr>
-        <w:tc>
-          <w:tcPr>
-            <w:tcW w:type="dxa" w:w="2592"/>
-            <w:shd w:fill="EDF2F7"/>
-            <w:tcMar>
-              <w:top w:w="70" w:type="dxa"/>
-              <w:bottom w:w="70" w:type="dxa"/>
-              <w:left w:w="100" w:type="dxa"/>
-              <w:right w:w="100" w:type="dxa"/>
-            </w:tcMar>
-          </w:tcPr>
-          <w:p>
-            <w:pPr>
-              <w:spacing w:before="40" w:after="40"/>
-            </w:pPr>
-            <w:r>
-              <w:rPr>
-                <w:rFonts w:ascii="Arial" w:hAnsi="Arial"/>
-                <w:b/>
-                <w:color w:val="2D3748"/>
-                <w:sz w:val="19"/>
-              </w:rPr>
-              <w:t>Observed Value</w:t>
-            </w:r>
-          </w:p>
-        </w:tc>
-        <w:tc>
-          <w:tcPr>
-            <w:tcW w:type="dxa" w:w="6768"/>
-            <w:shd w:fill="FFFFFF"/>
-            <w:tcMar>
-              <w:top w:w="70" w:type="dxa"/>
-              <w:bottom w:w="70" w:type="dxa"/>
-              <w:left w:w="100" w:type="dxa"/>
-              <w:right w:w="100" w:type="dxa"/>
-            </w:tcMar>
-          </w:tcPr>
-          <w:p>
-            <w:pPr>
-              <w:spacing w:before="40" w:after="40"/>
-            </w:pPr>
-            <w:r>
-              <w:rPr>
-                <w:rFonts w:ascii="Arial" w:hAnsi="Arial"/>
-                <w:sz w:val="19"/>
-              </w:rPr>
-              <w:t>No visible leakage</w:t>
-            </w:r>
-          </w:p>
-        </w:tc>
-      </w:tr>
-      <w:tr>
-        <w:tc>
-          <w:tcPr>
-            <w:tcW w:type="dxa" w:w="2592"/>
-            <w:shd w:fill="EDF2F7"/>
-            <w:tcMar>
-              <w:top w:w="70" w:type="dxa"/>
-              <w:bottom w:w="70" w:type="dxa"/>
-              <w:left w:w="100" w:type="dxa"/>
-              <w:right w:w="100" w:type="dxa"/>
-            </w:tcMar>
-          </w:tcPr>
-          <w:p>
-            <w:pPr>
-              <w:spacing w:before="40" w:after="40"/>
-            </w:pPr>
-            <w:r>
-              <w:rPr>
-                <w:rFonts w:ascii="Arial" w:hAnsi="Arial"/>
-                <w:b/>
-                <w:color w:val="2D3748"/>
-                <w:sz w:val="19"/>
-              </w:rPr>
-              <w:t>Limit</w:t>
-            </w:r>
-          </w:p>
-        </w:tc>
-        <w:tc>
-          <w:tcPr>
-            <w:tcW w:type="dxa" w:w="6768"/>
-            <w:shd w:fill="FFFFFF"/>
-            <w:tcMar>
-              <w:top w:w="70" w:type="dxa"/>
-              <w:bottom w:w="70" w:type="dxa"/>
-              <w:left w:w="100" w:type="dxa"/>
-              <w:right w:w="100" w:type="dxa"/>
-            </w:tcMar>
-          </w:tcPr>
-          <w:p>
-            <w:pPr>
-              <w:spacing w:before="40" w:after="40"/>
-            </w:pPr>
-            <w:r>
-              <w:rPr>
-                <w:rFonts w:ascii="Arial" w:hAnsi="Arial"/>
-                <w:sz w:val="19"/>
-              </w:rPr>
-              <w:t>No visible leakage</w:t>
-            </w:r>
-          </w:p>
-        </w:tc>
-      </w:tr>
-      <w:tr>
-        <w:tc>
-          <w:tcPr>
-            <w:tcW w:type="dxa" w:w="2592"/>
-            <w:shd w:fill="EDF2F7"/>
-            <w:tcMar>
-              <w:top w:w="70" w:type="dxa"/>
-              <w:bottom w:w="70" w:type="dxa"/>
-              <w:left w:w="100" w:type="dxa"/>
-              <w:right w:w="100" w:type="dxa"/>
-            </w:tcMar>
-          </w:tcPr>
-          <w:p>
-            <w:pPr>
-              <w:spacing w:before="40" w:after="40"/>
-            </w:pPr>
-            <w:r>
-              <w:rPr>
-                <w:rFonts w:ascii="Arial" w:hAnsi="Arial"/>
-                <w:b/>
-                <w:color w:val="2D3748"/>
-                <w:sz w:val="19"/>
-              </w:rPr>
-              <w:t>Severity</w:t>
-            </w:r>
-          </w:p>
-        </w:tc>
-        <w:tc>
-          <w:tcPr>
-            <w:tcW w:type="dxa" w:w="6768"/>
-            <w:shd w:fill="FFFFFF"/>
-            <w:tcMar>
-              <w:top w:w="70" w:type="dxa"/>
-              <w:bottom w:w="70" w:type="dxa"/>
-              <w:left w:w="100" w:type="dxa"/>
-              <w:right w:w="100" w:type="dxa"/>
-            </w:tcMar>
-          </w:tcPr>
-          <w:p>
-            <w:pPr>
-              <w:spacing w:before="40" w:after="40"/>
-            </w:pPr>
-            <w:r>
-              <w:rPr>
-                <w:rFonts w:ascii="Arial" w:hAnsi="Arial"/>
-                <w:sz w:val="19"/>
-              </w:rPr>
-              <w:t>NORMAL</w:t>
-            </w:r>
-          </w:p>
-        </w:tc>
-      </w:tr>
-      <w:tr>
-        <w:tc>
-          <w:tcPr>
-            <w:tcW w:type="dxa" w:w="2592"/>
-            <w:shd w:fill="EDF2F7"/>
-            <w:tcMar>
-              <w:top w:w="70" w:type="dxa"/>
-              <w:bottom w:w="70" w:type="dxa"/>
-              <w:left w:w="100" w:type="dxa"/>
-              <w:right w:w="100" w:type="dxa"/>
-            </w:tcMar>
-          </w:tcPr>
-          <w:p>
-            <w:pPr>
-              <w:spacing w:before="40" w:after="40"/>
-            </w:pPr>
-            <w:r>
-              <w:rPr>
-                <w:rFonts w:ascii="Arial" w:hAnsi="Arial"/>
-                <w:b/>
-                <w:color w:val="2D3748"/>
-                <w:sz w:val="19"/>
-              </w:rPr>
-              <w:t>Evidence</w:t>
-            </w:r>
-          </w:p>
-        </w:tc>
-        <w:tc>
-          <w:tcPr>
-            <w:tcW w:type="dxa" w:w="6768"/>
-            <w:shd w:fill="FFFFFF"/>
-            <w:tcMar>
-              <w:top w:w="70" w:type="dxa"/>
-              <w:bottom w:w="70" w:type="dxa"/>
-              <w:left w:w="100" w:type="dxa"/>
-              <w:right w:w="100" w:type="dxa"/>
-            </w:tcMar>
-          </w:tcPr>
-          <w:p>
-            <w:pPr>
-              <w:spacing w:before="40" w:after="40"/>
-            </w:pPr>
-            <w:r>
-              <w:rPr>
-                <w:rFonts w:ascii="Arial" w:hAnsi="Arial"/>
-                <w:sz w:val="19"/>
-              </w:rPr>
-              <w:t>No visible leakage No visible leakage</w:t>
-            </w:r>
-          </w:p>
-        </w:tc>
-      </w:tr>
-    </w:tbl>
-    <w:p>
-      <w:pPr>
-        <w:spacing w:before="0" w:after="120"/>
-      </w:pPr>
-    </w:p>
-    <w:p>
-      <w:pPr>
-        <w:keepNext/>
-        <w:spacing w:before="120" w:after="80"/>
-      </w:pPr>
-      <w:r>
-        <w:rPr>
-          <w:rFonts w:ascii="Arial" w:hAnsi="Arial"/>
-          <w:b/>
-          <w:color w:val="2D3748"/>
-          <w:sz w:val="22"/>
-        </w:rPr>
-        <w:t>Finding 5</w:t>
-      </w:r>
-    </w:p>
-    <w:tbl>
-      <w:tblPr>
-        <w:tblW w:type="auto" w:w="0"/>
-        <w:jc w:val="center"/>
-        <w:tblLayout w:type="fixed"/>
-        <w:tblLook w:firstColumn="1" w:firstRow="1" w:lastColumn="0" w:lastRow="0" w:noHBand="0" w:noVBand="1" w:val="04A0"/>
-      </w:tblPr>
-      <w:tblGrid>
-        <w:gridCol w:w="4680"/>
-        <w:gridCol w:w="4680"/>
-      </w:tblGrid>
-      <w:tr>
-        <w:tc>
-          <w:tcPr>
-            <w:tcW w:type="dxa" w:w="2592"/>
-            <w:shd w:fill="EDF2F7"/>
-            <w:tcMar>
-              <w:top w:w="70" w:type="dxa"/>
-              <w:bottom w:w="70" w:type="dxa"/>
-              <w:left w:w="100" w:type="dxa"/>
-              <w:right w:w="100" w:type="dxa"/>
-            </w:tcMar>
-          </w:tcPr>
-          <w:p>
-            <w:pPr>
-              <w:spacing w:before="40" w:after="40"/>
-            </w:pPr>
-            <w:r>
-              <w:rPr>
-                <w:rFonts w:ascii="Arial" w:hAnsi="Arial"/>
-                <w:b/>
-                <w:color w:val="2D3748"/>
-                <w:sz w:val="19"/>
-              </w:rPr>
-              <w:t>Finding</w:t>
-            </w:r>
-          </w:p>
-        </w:tc>
-        <w:tc>
-          <w:tcPr>
-            <w:tcW w:type="dxa" w:w="6768"/>
-            <w:shd w:fill="FFFFFF"/>
-            <w:tcMar>
-              <w:top w:w="70" w:type="dxa"/>
-              <w:bottom w:w="70" w:type="dxa"/>
-              <w:left w:w="100" w:type="dxa"/>
-              <w:right w:w="100" w:type="dxa"/>
-            </w:tcMar>
-          </w:tcPr>
-          <w:p>
-            <w:pPr>
-              <w:spacing w:before="40" w:after="40"/>
-            </w:pPr>
-            <w:r>
-              <w:rPr>
-                <w:rFonts w:ascii="Arial" w:hAnsi="Arial"/>
-                <w:sz w:val="19"/>
-              </w:rPr>
-              <w:t>Equipment was kept out of normal service pending inspection and corrective action.</w:t>
-            </w:r>
-          </w:p>
-        </w:tc>
-      </w:tr>
-      <w:tr>
-        <w:tc>
-          <w:tcPr>
-            <w:tcW w:type="dxa" w:w="2592"/>
-            <w:shd w:fill="EDF2F7"/>
-            <w:tcMar>
-              <w:top w:w="70" w:type="dxa"/>
-              <w:bottom w:w="70" w:type="dxa"/>
-              <w:left w:w="100" w:type="dxa"/>
-              <w:right w:w="100" w:type="dxa"/>
-            </w:tcMar>
-          </w:tcPr>
-          <w:p>
-            <w:pPr>
-              <w:spacing w:before="40" w:after="40"/>
-            </w:pPr>
-            <w:r>
-              <w:rPr>
-                <w:rFonts w:ascii="Arial" w:hAnsi="Arial"/>
-                <w:b/>
-                <w:color w:val="2D3748"/>
-                <w:sz w:val="19"/>
-              </w:rPr>
-              <w:t>Equipment</w:t>
-            </w:r>
-          </w:p>
-        </w:tc>
-        <w:tc>
-          <w:tcPr>
-            <w:tcW w:type="dxa" w:w="6768"/>
-            <w:shd w:fill="FFFFFF"/>
-            <w:tcMar>
-              <w:top w:w="70" w:type="dxa"/>
-              <w:bottom w:w="70" w:type="dxa"/>
-              <w:left w:w="100" w:type="dxa"/>
-              <w:right w:w="100" w:type="dxa"/>
-            </w:tcMar>
-          </w:tcPr>
-          <w:p>
-            <w:pPr>
-              <w:spacing w:before="40" w:after="40"/>
-            </w:pPr>
-            <w:r>
-              <w:rPr>
-                <w:rFonts w:ascii="Arial" w:hAnsi="Arial"/>
-                <w:sz w:val="19"/>
-              </w:rPr>
-              <w:t>P-101 Process Pump</w:t>
-            </w:r>
-          </w:p>
-        </w:tc>
-      </w:tr>
-      <w:tr>
-        <w:tc>
-          <w:tcPr>
-            <w:tcW w:type="dxa" w:w="2592"/>
-            <w:shd w:fill="EDF2F7"/>
-            <w:tcMar>
-              <w:top w:w="70" w:type="dxa"/>
-              <w:bottom w:w="70" w:type="dxa"/>
-              <w:left w:w="100" w:type="dxa"/>
-              <w:right w:w="100" w:type="dxa"/>
-            </w:tcMar>
-          </w:tcPr>
-          <w:p>
-            <w:pPr>
-              <w:spacing w:before="40" w:after="40"/>
-            </w:pPr>
-            <w:r>
-              <w:rPr>
-                <w:rFonts w:ascii="Arial" w:hAnsi="Arial"/>
-                <w:b/>
-                <w:color w:val="2D3748"/>
-                <w:sz w:val="19"/>
-              </w:rPr>
-              <w:t>Observed Value</w:t>
-            </w:r>
-          </w:p>
-        </w:tc>
-        <w:tc>
-          <w:tcPr>
-            <w:tcW w:type="dxa" w:w="6768"/>
-            <w:shd w:fill="FFFFFF"/>
-            <w:tcMar>
-              <w:top w:w="70" w:type="dxa"/>
-              <w:bottom w:w="70" w:type="dxa"/>
-              <w:left w:w="100" w:type="dxa"/>
-              <w:right w:w="100" w:type="dxa"/>
-            </w:tcMar>
-          </w:tcPr>
-          <w:p>
-            <w:pPr>
-              <w:spacing w:before="40" w:after="40"/>
-            </w:pPr>
-            <w:r>
-              <w:rPr>
-                <w:rFonts w:ascii="Arial" w:hAnsi="Arial"/>
-                <w:sz w:val="19"/>
-              </w:rPr>
-              <w:t>N/A</w:t>
-            </w:r>
-          </w:p>
-        </w:tc>
-      </w:tr>
-      <w:tr>
-        <w:tc>
-          <w:tcPr>
-            <w:tcW w:type="dxa" w:w="2592"/>
-            <w:shd w:fill="EDF2F7"/>
-            <w:tcMar>
-              <w:top w:w="70" w:type="dxa"/>
-              <w:bottom w:w="70" w:type="dxa"/>
-              <w:left w:w="100" w:type="dxa"/>
-              <w:right w:w="100" w:type="dxa"/>
-            </w:tcMar>
-          </w:tcPr>
-          <w:p>
-            <w:pPr>
-              <w:spacing w:before="40" w:after="40"/>
-            </w:pPr>
-            <w:r>
-              <w:rPr>
-                <w:rFonts w:ascii="Arial" w:hAnsi="Arial"/>
-                <w:b/>
-                <w:color w:val="2D3748"/>
-                <w:sz w:val="19"/>
-              </w:rPr>
-              <w:t>Limit</w:t>
-            </w:r>
-          </w:p>
-        </w:tc>
-        <w:tc>
-          <w:tcPr>
-            <w:tcW w:type="dxa" w:w="6768"/>
-            <w:shd w:fill="FFFFFF"/>
-            <w:tcMar>
-              <w:top w:w="70" w:type="dxa"/>
-              <w:bottom w:w="70" w:type="dxa"/>
-              <w:left w:w="100" w:type="dxa"/>
-              <w:right w:w="100" w:type="dxa"/>
-            </w:tcMar>
-          </w:tcPr>
-          <w:p>
-            <w:pPr>
-              <w:spacing w:before="40" w:after="40"/>
-            </w:pPr>
-            <w:r>
-              <w:rPr>
-                <w:rFonts w:ascii="Arial" w:hAnsi="Arial"/>
-                <w:sz w:val="19"/>
-              </w:rPr>
-              <w:t>N/A</w:t>
-            </w:r>
-          </w:p>
-        </w:tc>
-      </w:tr>
-      <w:tr>
-        <w:tc>
-          <w:tcPr>
-            <w:tcW w:type="dxa" w:w="2592"/>
-            <w:shd w:fill="EDF2F7"/>
-            <w:tcMar>
-              <w:top w:w="70" w:type="dxa"/>
-              <w:bottom w:w="70" w:type="dxa"/>
-              <w:left w:w="100" w:type="dxa"/>
-              <w:right w:w="100" w:type="dxa"/>
-            </w:tcMar>
-          </w:tcPr>
-          <w:p>
-            <w:pPr>
-              <w:spacing w:before="40" w:after="40"/>
-            </w:pPr>
-            <w:r>
-              <w:rPr>
-                <w:rFonts w:ascii="Arial" w:hAnsi="Arial"/>
-                <w:b/>
-                <w:color w:val="2D3748"/>
-                <w:sz w:val="19"/>
-              </w:rPr>
-              <w:t>Severity</w:t>
-            </w:r>
-          </w:p>
-        </w:tc>
-        <w:tc>
-          <w:tcPr>
-            <w:tcW w:type="dxa" w:w="6768"/>
-            <w:shd w:fill="FFFFFF"/>
-            <w:tcMar>
-              <w:top w:w="70" w:type="dxa"/>
-              <w:bottom w:w="70" w:type="dxa"/>
-              <w:left w:w="100" w:type="dxa"/>
-              <w:right w:w="100" w:type="dxa"/>
-            </w:tcMar>
-          </w:tcPr>
-          <w:p>
-            <w:pPr>
-              <w:spacing w:before="40" w:after="40"/>
-            </w:pPr>
-            <w:r>
-              <w:rPr>
-                <w:rFonts w:ascii="Arial" w:hAnsi="Arial"/>
-                <w:sz w:val="19"/>
-              </w:rPr>
-              <w:t>N/A</w:t>
-            </w:r>
-          </w:p>
-        </w:tc>
-      </w:tr>
-      <w:tr>
-        <w:tc>
-          <w:tcPr>
-            <w:tcW w:type="dxa" w:w="2592"/>
-            <w:shd w:fill="EDF2F7"/>
-            <w:tcMar>
-              <w:top w:w="70" w:type="dxa"/>
-              <w:bottom w:w="70" w:type="dxa"/>
-              <w:left w:w="100" w:type="dxa"/>
-              <w:right w:w="100" w:type="dxa"/>
-            </w:tcMar>
-          </w:tcPr>
-          <w:p>
-            <w:pPr>
-              <w:spacing w:before="40" w:after="40"/>
-            </w:pPr>
-            <w:r>
-              <w:rPr>
-                <w:rFonts w:ascii="Arial" w:hAnsi="Arial"/>
-                <w:b/>
-                <w:color w:val="2D3748"/>
-                <w:sz w:val="19"/>
-              </w:rPr>
-              <w:t>Evidence</w:t>
-            </w:r>
-          </w:p>
-        </w:tc>
-        <w:tc>
-          <w:tcPr>
-            <w:tcW w:type="dxa" w:w="6768"/>
-            <w:shd w:fill="FFFFFF"/>
-            <w:tcMar>
-              <w:top w:w="70" w:type="dxa"/>
-              <w:bottom w:w="70" w:type="dxa"/>
-              <w:left w:w="100" w:type="dxa"/>
-              <w:right w:w="100" w:type="dxa"/>
-            </w:tcMar>
-          </w:tcPr>
-          <w:p>
-            <w:pPr>
-              <w:spacing w:before="40" w:after="40"/>
-            </w:pPr>
-            <w:r>
-              <w:rPr>
-                <w:rFonts w:ascii="Arial" w:hAnsi="Arial"/>
-                <w:sz w:val="19"/>
-              </w:rPr>
-              <w:t>The equipment was kept out of normal service pending inspection and corrective action.</w:t>
+              <w:t>Pump-03 bearing temperature was observed at 92 degrees C.</w:t>
             </w:r>
           </w:p>
         </w:tc>
@@ -1845,7 +454,7 @@
           <w:rFonts w:ascii="Arial" w:hAnsi="Arial"/>
           <w:sz w:val="20"/>
         </w:rPr>
-        <w:t>Evaluation was performed by correlating observed parameters against standard operating procedures (Demo_Maintenance_SOP.pdf). Assessment analysis indicates: Bearing temperature exceeded the normal operating limit, which could lead to premature bearing failure, resulting in equipment downtime and potential safety hazards.</w:t>
+        <w:t>Technical analysis is unavailable based on the supplied SOP evidence.</w:t>
       </w:r>
     </w:p>
     <w:p>
@@ -1900,7 +509,7 @@
         <w:tc>
           <w:tcPr>
             <w:tcW w:type="dxa" w:w="6768"/>
-            <w:shd w:fill="FED7D7"/>
+            <w:shd w:fill="F7FAFC"/>
             <w:tcMar>
               <w:top w:w="80" w:type="dxa"/>
               <w:bottom w:w="80" w:type="dxa"/>
@@ -1913,10 +522,9 @@
               <w:rPr>
                 <w:rFonts w:ascii="Arial" w:hAnsi="Arial"/>
                 <w:b/>
-                <w:color w:val="C53030"/>
                 <w:sz w:val="22"/>
               </w:rPr>
-              <w:t>HIGH</w:t>
+              <w:t>Not Determined</w:t>
             </w:r>
           </w:p>
         </w:tc>
@@ -1961,7 +569,7 @@
                 <w:rFonts w:ascii="Arial" w:hAnsi="Arial"/>
                 <w:sz w:val="19"/>
               </w:rPr>
-              <w:t>Bearing temperature exceeded the normal operating limit, which could lead to premature bearing failure, resulting in equipment downtime and potential safety hazards.</w:t>
+              <w:t>Insufficient evidence to determine risk level.</w:t>
             </w:r>
           </w:p>
         </w:tc>
@@ -2019,7 +627,7 @@
                 <w:color w:val="2B6CB0"/>
                 <w:sz w:val="20"/>
               </w:rPr>
-              <w:t>Immediate inspection and repair of the bearing assembly is required. Check lubrication condition and look for signs of abnormal vibration. Do not return the equipment to service until the inspection is complete. Insufficient SOP evidence is available to provide a validated recommendation. Insufficient SOP evidence is available to provide a validated recommendation. Insufficient SOP evidence is available to provide a validated recommendation. Insufficient SOP evidence is available to provide a validated recommendation.</w:t>
+              <w:t>Insufficient SOP evidence is available to provide a validated recommendation.</w:t>
             </w:r>
           </w:p>
         </w:tc>
@@ -2047,23 +655,14 @@
     </w:p>
     <w:p>
       <w:pPr>
-        <w:spacing w:after="80"/>
-        <w:ind w:left="360"/>
+        <w:spacing w:after="160"/>
       </w:pPr>
       <w:r>
         <w:rPr>
           <w:rFonts w:ascii="Arial" w:hAnsi="Arial"/>
-          <w:b/>
-          <w:sz w:val="19"/>
+          <w:i/>
         </w:rPr>
-        <w:t xml:space="preserve">[1] </w:t>
-      </w:r>
-      <w:r>
-        <w:rPr>
-          <w:rFonts w:ascii="Arial" w:hAnsi="Arial"/>
-          <w:sz w:val="19"/>
-        </w:rPr>
-        <w:t>Filename: Demo_Maintenance_SOP.pdf | Page: 1 | Chunk Index: 0 | Document ID: c2fd4c4f-8d4e-406e-9bb2-7b3c6e94d9b5</w:t>
+        <w:t>No specific SOP references cited.</w:t>
       </w:r>
     </w:p>
     <w:p>

</xml_diff>

<commit_message>
chore: update backend node_modules dependencies
</commit_message>
<xml_diff>
--- a/backend/generated/Approval_Note.docx
+++ b/backend/generated/Approval_Note.docx
@@ -56,7 +56,7 @@
           <w:rFonts w:ascii="Arial" w:hAnsi="Arial"/>
           <w:sz w:val="21"/>
         </w:rPr>
-        <w:t>Inspection Report Analysis and Approval Recommendation — b4cd2dd0-e6fd-4823-8ddd-3199bdafc846</w:t>
+        <w:t>Inspection Report Analysis — Pump-03</w:t>
       </w:r>
     </w:p>
     <w:p>
@@ -159,7 +159,7 @@
                 <w:rFonts w:ascii="Arial" w:hAnsi="Arial"/>
                 <w:sz w:val="19"/>
               </w:rPr>
-              <w:t>High temperature condition requiring evaluation</w:t>
+              <w:t>Bearing temperature exceeded operating limit</w:t>
             </w:r>
           </w:p>
         </w:tc>
@@ -263,7 +263,7 @@
                 <w:rFonts w:ascii="Arial" w:hAnsi="Arial"/>
                 <w:sz w:val="19"/>
               </w:rPr>
-              <w:t>92 degrees C</w:t>
+              <w:t>92°C</w:t>
             </w:r>
           </w:p>
         </w:tc>
@@ -315,7 +315,7 @@
                 <w:rFonts w:ascii="Arial" w:hAnsi="Arial"/>
                 <w:sz w:val="19"/>
               </w:rPr>
-              <w:t>80 degrees C</w:t>
+              <w:t>80°C</w:t>
             </w:r>
           </w:p>
         </w:tc>
@@ -367,7 +367,7 @@
                 <w:rFonts w:ascii="Arial" w:hAnsi="Arial"/>
                 <w:sz w:val="19"/>
               </w:rPr>
-              <w:t>High</w:t>
+              <w:t>HIGH</w:t>
             </w:r>
           </w:p>
         </w:tc>
@@ -454,7 +454,7 @@
           <w:rFonts w:ascii="Arial" w:hAnsi="Arial"/>
           <w:sz w:val="20"/>
         </w:rPr>
-        <w:t>Technical analysis is unavailable based on the supplied SOP evidence.</w:t>
+        <w:t>Evaluation was performed by correlating observed parameters against standard operating procedures (Demo_Maintenance_SOP.pdf). Assessment analysis indicates: Observed bearing temperature exceeded the operating limit of 80°C, which could lead to equipment failure and pose a risk to safety.</w:t>
       </w:r>
     </w:p>
     <w:p>
@@ -509,7 +509,7 @@
         <w:tc>
           <w:tcPr>
             <w:tcW w:type="dxa" w:w="6768"/>
-            <w:shd w:fill="F7FAFC"/>
+            <w:shd w:fill="FED7D7"/>
             <w:tcMar>
               <w:top w:w="80" w:type="dxa"/>
               <w:bottom w:w="80" w:type="dxa"/>
@@ -522,9 +522,10 @@
               <w:rPr>
                 <w:rFonts w:ascii="Arial" w:hAnsi="Arial"/>
                 <w:b/>
+                <w:color w:val="C53030"/>
                 <w:sz w:val="22"/>
               </w:rPr>
-              <w:t>Not Determined</w:t>
+              <w:t>HIGH</w:t>
             </w:r>
           </w:p>
         </w:tc>
@@ -569,7 +570,7 @@
                 <w:rFonts w:ascii="Arial" w:hAnsi="Arial"/>
                 <w:sz w:val="19"/>
               </w:rPr>
-              <w:t>Insufficient evidence to determine risk level.</w:t>
+              <w:t>Observed bearing temperature exceeded the operating limit of 80°C, which could lead to equipment failure and pose a risk to safety.</w:t>
             </w:r>
           </w:p>
         </w:tc>
@@ -627,7 +628,7 @@
                 <w:color w:val="2B6CB0"/>
                 <w:sz w:val="20"/>
               </w:rPr>
-              <w:t>Insufficient SOP evidence is available to provide a validated recommendation.</w:t>
+              <w:t>Schedule immediate inspection and lubrication check for Pump-03, and do not return the equipment to service until the issue is resolved.</w:t>
             </w:r>
           </w:p>
         </w:tc>
@@ -655,14 +656,23 @@
     </w:p>
     <w:p>
       <w:pPr>
-        <w:spacing w:after="160"/>
+        <w:spacing w:after="80"/>
+        <w:ind w:left="360"/>
       </w:pPr>
       <w:r>
         <w:rPr>
           <w:rFonts w:ascii="Arial" w:hAnsi="Arial"/>
-          <w:i/>
+          <w:b/>
+          <w:sz w:val="19"/>
         </w:rPr>
-        <w:t>No specific SOP references cited.</w:t>
+        <w:t xml:space="preserve">[1] </w:t>
+      </w:r>
+      <w:r>
+        <w:rPr>
+          <w:rFonts w:ascii="Arial" w:hAnsi="Arial"/>
+          <w:sz w:val="19"/>
+        </w:rPr>
+        <w:t>Filename: Demo_Maintenance_SOP.pdf | Page: 1 | Chunk Index: 0 | Document ID: 4b1c1b6e-ad6b-4169-9f90-944459337c0e</w:t>
       </w:r>
     </w:p>
     <w:p>

</xml_diff>

<commit_message>
feat: implement comprehensive security and sovereignty hardening, including multi-tenant isolation, JWT verification, and sandbox constraints.
</commit_message>
<xml_diff>
--- a/backend/generated/Approval_Note.docx
+++ b/backend/generated/Approval_Note.docx
@@ -454,7 +454,7 @@
           <w:rFonts w:ascii="Arial" w:hAnsi="Arial"/>
           <w:sz w:val="20"/>
         </w:rPr>
-        <w:t>Evaluation was performed by correlating observed parameters against standard operating procedures (Demo_Maintenance_SOP.pdf). Assessment analysis indicates: Observed bearing temperature exceeded the operating limit, but SOP evidence indicates that exceeding 80°C requires further inspection and does not specify a critical failure condition.</w:t>
+        <w:t>Evaluation was performed by correlating observed parameters against standard operating procedures (Maintenance_SOP.pdf). Assessment analysis indicates: Bearing temperature exceeded operating limit (80°C), indicating potential for bearing failure or damage</w:t>
       </w:r>
     </w:p>
     <w:p>
@@ -509,7 +509,7 @@
         <w:tc>
           <w:tcPr>
             <w:tcW w:type="dxa" w:w="6768"/>
-            <w:shd w:fill="FEEBC8"/>
+            <w:shd w:fill="FED7D7"/>
             <w:tcMar>
               <w:top w:w="80" w:type="dxa"/>
               <w:bottom w:w="80" w:type="dxa"/>
@@ -522,10 +522,10 @@
               <w:rPr>
                 <w:rFonts w:ascii="Arial" w:hAnsi="Arial"/>
                 <w:b/>
-                <w:color w:val="B7791F"/>
+                <w:color w:val="C53030"/>
                 <w:sz w:val="22"/>
               </w:rPr>
-              <w:t>MEDIUM</w:t>
+              <w:t>HIGH</w:t>
             </w:r>
           </w:p>
         </w:tc>
@@ -570,7 +570,7 @@
                 <w:rFonts w:ascii="Arial" w:hAnsi="Arial"/>
                 <w:sz w:val="19"/>
               </w:rPr>
-              <w:t>Observed bearing temperature exceeded the operating limit, but SOP evidence indicates that exceeding 80°C requires further inspection and does not specify a critical failure condition.</w:t>
+              <w:t>Bearing temperature exceeded operating limit (80°C), indicating potential for bearing failure or damage</w:t>
             </w:r>
           </w:p>
         </w:tc>
@@ -628,7 +628,7 @@
                 <w:color w:val="2B6CB0"/>
                 <w:sz w:val="20"/>
               </w:rPr>
-              <w:t>Schedule a bearing inspection and check lubrication condition as soon as possible</w:t>
+              <w:t>Record current bearing temperature (92°C) and inspect bearing immediately, perform bearing inspection and replace if necessary.</w:t>
             </w:r>
           </w:p>
         </w:tc>
@@ -672,7 +672,7 @@
           <w:rFonts w:ascii="Arial" w:hAnsi="Arial"/>
           <w:sz w:val="19"/>
         </w:rPr>
-        <w:t>Filename: Demo_Maintenance_SOP.pdf | Page: 1 | Chunk Index: 0 | Document ID: 4b1c1b6e-ad6b-4169-9f90-944459337c0e</w:t>
+        <w:t>Filename: Maintenance_SOP.pdf | Page: 1 | Chunk Index: 0 | Document ID: doc_a2b1d023</w:t>
       </w:r>
     </w:p>
     <w:p>

</xml_diff>